<commit_message>
update documentation for NotesApp project, including title, author, and project scope + add screenshots
</commit_message>
<xml_diff>
--- a/docs/NotesApp Beadandó dokumentáció.docx
+++ b/docs/NotesApp Beadandó dokumentáció.docx
@@ -8,11 +8,48 @@
       </w:pPr>
       <w:proofErr w:type="spellStart"/>
       <w:r>
-        <w:t>NotesApp</w:t>
-      </w:r>
-      <w:proofErr w:type="spellEnd"/>
-      <w:r>
-        <w:t xml:space="preserve"> Beadandó dokumentáció</w:t>
+        <w:t>Webprogramozás</w:t>
+      </w:r>
+      <w:proofErr w:type="spellEnd"/>
+      <w:r>
+        <w:t xml:space="preserve"> </w:t>
+      </w:r>
+      <w:proofErr w:type="spellStart"/>
+      <w:r>
+        <w:t>A</w:t>
+      </w:r>
+      <w:r>
+        <w:t>lapjai</w:t>
+      </w:r>
+      <w:proofErr w:type="spellEnd"/>
+      <w:r>
+        <w:t xml:space="preserve"> </w:t>
+      </w:r>
+      <w:proofErr w:type="spellStart"/>
+      <w:r>
+        <w:t>Beadandó</w:t>
+      </w:r>
+      <w:proofErr w:type="spellEnd"/>
+      <w:r>
+        <w:t xml:space="preserve"> </w:t>
+      </w:r>
+      <w:proofErr w:type="spellStart"/>
+      <w:r>
+        <w:t>D</w:t>
+      </w:r>
+      <w:r>
+        <w:t>okumentáció</w:t>
+      </w:r>
+      <w:proofErr w:type="spellEnd"/>
+    </w:p>
+    <w:p>
+      <w:r>
+        <w:t>Nagy Martin László</w:t>
+      </w:r>
+    </w:p>
+    <w:p>
+      <w:r>
+        <w:t>D5QD9Q</w:t>
       </w:r>
     </w:p>
     <w:p>
@@ -33,6 +70,7 @@
       <w:pPr>
         <w:pStyle w:val="Cmsor1"/>
       </w:pPr>
+      <w:bookmarkStart w:id="0" w:name="_Toc228094592"/>
       <w:r>
         <w:lastRenderedPageBreak/>
         <w:t>1) Projekt c</w:t>
@@ -53,9 +91,13 @@
       <w:r>
         <w:t>scope</w:t>
       </w:r>
-      <w:proofErr w:type="spellEnd"/>
-    </w:p>
-    <w:p>
+      <w:bookmarkEnd w:id="0"/>
+      <w:proofErr w:type="spellEnd"/>
+    </w:p>
+    <w:p>
+      <w:r>
+        <w:t xml:space="preserve">A projektfeladatomnak a 8-as feladatot választottam. </w:t>
+      </w:r>
       <w:r>
         <w:t xml:space="preserve">Ez a projekt egy </w:t>
       </w:r>
@@ -148,24 +190,12 @@
       <w:r>
         <w:t xml:space="preserve">: </w:t>
       </w:r>
-      <w:hyperlink r:id="rId6" w:history="1">
+      <w:hyperlink r:id="rId8" w:history="1">
         <w:r>
           <w:rPr>
             <w:rStyle w:val="Hiperhivatkozs"/>
           </w:rPr>
-          <w:t>https://github.com/karellen1/webpr</w:t>
-        </w:r>
-        <w:r>
-          <w:rPr>
-            <w:rStyle w:val="Hiperhivatkozs"/>
-          </w:rPr>
-          <w:t>o</w:t>
-        </w:r>
-        <w:r>
-          <w:rPr>
-            <w:rStyle w:val="Hiperhivatkozs"/>
-          </w:rPr>
-          <w:t>g_alapjai_d5qd9q</w:t>
+          <w:t>https://github.com/karellen1/webprog_alapjai_d5qd9q</w:t>
         </w:r>
       </w:hyperlink>
     </w:p>
@@ -173,6 +203,7 @@
       <w:pPr>
         <w:pStyle w:val="Cmsor2"/>
       </w:pPr>
+      <w:bookmarkStart w:id="1" w:name="_Toc228094593"/>
       <w:r>
         <w:t>Főbb</w:t>
       </w:r>
@@ -185,6 +216,7 @@
       <w:r>
         <w:t>:</w:t>
       </w:r>
+      <w:bookmarkEnd w:id="1"/>
     </w:p>
     <w:p>
       <w:pPr>
@@ -423,6 +455,7 @@
       <w:pPr>
         <w:pStyle w:val="Cmsor1"/>
       </w:pPr>
+      <w:bookmarkStart w:id="2" w:name="_Toc228094594"/>
       <w:r>
         <w:t xml:space="preserve">2) </w:t>
       </w:r>
@@ -438,15 +471,18 @@
       <w:r>
         <w:t>stack</w:t>
       </w:r>
+      <w:bookmarkEnd w:id="2"/>
       <w:proofErr w:type="spellEnd"/>
     </w:p>
     <w:p>
       <w:pPr>
         <w:pStyle w:val="Cmsor2"/>
       </w:pPr>
+      <w:bookmarkStart w:id="3" w:name="_Toc228094595"/>
       <w:r>
         <w:t>Fejlesztéshez használt eszközök:</w:t>
       </w:r>
+      <w:bookmarkEnd w:id="3"/>
     </w:p>
     <w:p>
       <w:pPr>
@@ -556,9 +592,11 @@
       <w:pPr>
         <w:pStyle w:val="Cmsor2"/>
       </w:pPr>
+      <w:bookmarkStart w:id="4" w:name="_Toc228094596"/>
       <w:r>
         <w:t>Backend:</w:t>
       </w:r>
+      <w:bookmarkEnd w:id="4"/>
     </w:p>
     <w:p>
       <w:pPr>
@@ -719,6 +757,7 @@
       <w:pPr>
         <w:pStyle w:val="Cmsor2"/>
       </w:pPr>
+      <w:bookmarkStart w:id="5" w:name="_Toc228094597"/>
       <w:proofErr w:type="spellStart"/>
       <w:r>
         <w:t>Database</w:t>
@@ -727,6 +766,7 @@
       <w:r>
         <w:t>:</w:t>
       </w:r>
+      <w:bookmarkEnd w:id="5"/>
     </w:p>
     <w:p>
       <w:pPr>
@@ -765,9 +805,11 @@
       <w:pPr>
         <w:pStyle w:val="Cmsor2"/>
       </w:pPr>
+      <w:bookmarkStart w:id="6" w:name="_Toc228094598"/>
       <w:r>
         <w:t>Frontend:</w:t>
       </w:r>
+      <w:bookmarkEnd w:id="6"/>
     </w:p>
     <w:p>
       <w:pPr>
@@ -863,10 +905,11 @@
       <w:pPr>
         <w:pStyle w:val="Cmsor2"/>
       </w:pPr>
-      <w:r>
-        <w:lastRenderedPageBreak/>
+      <w:bookmarkStart w:id="7" w:name="_Toc228094599"/>
+      <w:r>
         <w:t>Testing:</w:t>
       </w:r>
+      <w:bookmarkEnd w:id="7"/>
     </w:p>
     <w:p>
       <w:pPr>
@@ -930,6 +973,7 @@
       <w:pPr>
         <w:pStyle w:val="Cmsor2"/>
       </w:pPr>
+      <w:bookmarkStart w:id="8" w:name="_Toc228094600"/>
       <w:proofErr w:type="spellStart"/>
       <w:r>
         <w:t>DevOps</w:t>
@@ -938,6 +982,7 @@
       <w:r>
         <w:t>:</w:t>
       </w:r>
+      <w:bookmarkEnd w:id="8"/>
     </w:p>
     <w:p>
       <w:pPr>
@@ -1001,6 +1046,7 @@
       <w:pPr>
         <w:pStyle w:val="Cmsor1"/>
       </w:pPr>
+      <w:bookmarkStart w:id="9" w:name="_Toc228094601"/>
       <w:r>
         <w:t xml:space="preserve">3) </w:t>
       </w:r>
@@ -1016,6 +1062,7 @@
       <w:r>
         <w:t>architecture</w:t>
       </w:r>
+      <w:bookmarkEnd w:id="9"/>
       <w:proofErr w:type="spellEnd"/>
     </w:p>
     <w:p>
@@ -1120,6 +1167,7 @@
     </w:p>
     <w:p>
       <w:r>
+        <w:lastRenderedPageBreak/>
         <w:t xml:space="preserve">A frontend csak API-n </w:t>
       </w:r>
       <w:r>
@@ -1221,20 +1269,24 @@
       <w:pPr>
         <w:pStyle w:val="Cmsor1"/>
       </w:pPr>
+      <w:bookmarkStart w:id="10" w:name="_Toc228094602"/>
       <w:r>
         <w:t xml:space="preserve">4) Backend </w:t>
       </w:r>
       <w:r>
         <w:t>implementáció</w:t>
       </w:r>
+      <w:bookmarkEnd w:id="10"/>
     </w:p>
     <w:p>
       <w:pPr>
         <w:pStyle w:val="Cmsor2"/>
       </w:pPr>
+      <w:bookmarkStart w:id="11" w:name="_Toc228094603"/>
       <w:r>
         <w:t>4.1 Auth</w:t>
       </w:r>
+      <w:bookmarkEnd w:id="11"/>
     </w:p>
     <w:p>
       <w:r>
@@ -1348,6 +1400,7 @@
       <w:pPr>
         <w:pStyle w:val="Cmsor2"/>
       </w:pPr>
+      <w:bookmarkStart w:id="12" w:name="_Toc228094604"/>
       <w:r>
         <w:t xml:space="preserve">4.2 </w:t>
       </w:r>
@@ -1363,6 +1416,7 @@
       <w:r>
         <w:t>domain</w:t>
       </w:r>
+      <w:bookmarkEnd w:id="12"/>
       <w:proofErr w:type="spellEnd"/>
     </w:p>
     <w:p>
@@ -1614,8 +1668,8 @@
       <w:pPr>
         <w:pStyle w:val="Cmsor2"/>
       </w:pPr>
-      <w:r>
-        <w:lastRenderedPageBreak/>
+      <w:bookmarkStart w:id="13" w:name="_Toc228094605"/>
+      <w:r>
         <w:t xml:space="preserve">4.3 ORM </w:t>
       </w:r>
       <w:r>
@@ -1628,6 +1682,7 @@
       <w:r>
         <w:t>migrations</w:t>
       </w:r>
+      <w:bookmarkEnd w:id="13"/>
       <w:proofErr w:type="spellEnd"/>
     </w:p>
     <w:p>
@@ -1780,6 +1835,7 @@
       <w:pPr>
         <w:pStyle w:val="Cmsor2"/>
       </w:pPr>
+      <w:bookmarkStart w:id="14" w:name="_Toc228094606"/>
       <w:r>
         <w:t xml:space="preserve">4.4 </w:t>
       </w:r>
@@ -1793,6 +1849,7 @@
       <w:r>
         <w:t>security</w:t>
       </w:r>
+      <w:bookmarkEnd w:id="14"/>
       <w:proofErr w:type="spellEnd"/>
     </w:p>
     <w:p>
@@ -2002,12 +2059,14 @@
       <w:pPr>
         <w:pStyle w:val="Cmsor1"/>
       </w:pPr>
+      <w:bookmarkStart w:id="15" w:name="_Toc228094607"/>
       <w:r>
         <w:t xml:space="preserve">5) Frontend </w:t>
       </w:r>
       <w:r>
         <w:t>implementáció</w:t>
       </w:r>
+      <w:bookmarkEnd w:id="15"/>
     </w:p>
     <w:p>
       <w:r>
@@ -2340,6 +2399,7 @@
     <w:p>
       <w:proofErr w:type="spellStart"/>
       <w:r>
+        <w:lastRenderedPageBreak/>
         <w:t>Routing</w:t>
       </w:r>
       <w:proofErr w:type="spellEnd"/>
@@ -2444,6 +2504,7 @@
       <w:pPr>
         <w:pStyle w:val="Cmsor1"/>
       </w:pPr>
+      <w:bookmarkStart w:id="16" w:name="_Toc228094608"/>
       <w:r>
         <w:t xml:space="preserve">6) Docker </w:t>
       </w:r>
@@ -2451,6 +2512,7 @@
       <w:r>
         <w:t>setup</w:t>
       </w:r>
+      <w:bookmarkEnd w:id="16"/>
       <w:proofErr w:type="spellEnd"/>
     </w:p>
     <w:p>
@@ -2498,7 +2560,6 @@
       </w:pPr>
       <w:proofErr w:type="spellStart"/>
       <w:r>
-        <w:lastRenderedPageBreak/>
         <w:t>postgres</w:t>
       </w:r>
       <w:proofErr w:type="spellEnd"/>
@@ -2639,9 +2700,11 @@
       <w:pPr>
         <w:pStyle w:val="Cmsor1"/>
       </w:pPr>
+      <w:bookmarkStart w:id="17" w:name="_Toc228094609"/>
       <w:r>
         <w:t>7) Tesztek</w:t>
       </w:r>
+      <w:bookmarkEnd w:id="17"/>
     </w:p>
     <w:p>
       <w:r>
@@ -2701,6 +2764,7 @@
       <w:pPr>
         <w:pStyle w:val="Cmsor1"/>
       </w:pPr>
+      <w:bookmarkStart w:id="18" w:name="_Toc228094610"/>
       <w:r>
         <w:t xml:space="preserve">8) </w:t>
       </w:r>
@@ -2719,6 +2783,7 @@
       <w:r>
         <w:t>teljesítés</w:t>
       </w:r>
+      <w:bookmarkEnd w:id="18"/>
     </w:p>
     <w:p>
       <w:r>
@@ -2861,7 +2926,1646 @@
         <w:t>- ORM</w:t>
       </w:r>
     </w:p>
+    <w:p>
+      <w:pPr>
+        <w:pStyle w:val="Cmsor1"/>
+      </w:pPr>
+      <w:bookmarkStart w:id="19" w:name="_Toc228094611"/>
+      <w:r>
+        <w:lastRenderedPageBreak/>
+        <w:t>9) UI felépítése</w:t>
+      </w:r>
+      <w:bookmarkEnd w:id="19"/>
+    </w:p>
+    <w:p>
+      <w:pPr>
+        <w:keepNext/>
+      </w:pPr>
+      <w:r>
+        <w:drawing>
+          <wp:inline distT="0" distB="0" distL="0" distR="0" wp14:anchorId="2212E4C7" wp14:editId="472AABA9">
+            <wp:extent cx="5760720" cy="3351530"/>
+            <wp:effectExtent l="0" t="0" r="0" b="1270"/>
+            <wp:docPr id="1218249418" name="Kép 1"/>
+            <wp:cNvGraphicFramePr>
+              <a:graphicFrameLocks xmlns:a="http://schemas.openxmlformats.org/drawingml/2006/main" noChangeAspect="1"/>
+            </wp:cNvGraphicFramePr>
+            <a:graphic xmlns:a="http://schemas.openxmlformats.org/drawingml/2006/main">
+              <a:graphicData uri="http://schemas.openxmlformats.org/drawingml/2006/picture">
+                <pic:pic xmlns:pic="http://schemas.openxmlformats.org/drawingml/2006/picture">
+                  <pic:nvPicPr>
+                    <pic:cNvPr id="1218249418" name=""/>
+                    <pic:cNvPicPr/>
+                  </pic:nvPicPr>
+                  <pic:blipFill>
+                    <a:blip r:embed="rId9"/>
+                    <a:stretch>
+                      <a:fillRect/>
+                    </a:stretch>
+                  </pic:blipFill>
+                  <pic:spPr>
+                    <a:xfrm>
+                      <a:off x="0" y="0"/>
+                      <a:ext cx="5760720" cy="3351530"/>
+                    </a:xfrm>
+                    <a:prstGeom prst="rect">
+                      <a:avLst/>
+                    </a:prstGeom>
+                  </pic:spPr>
+                </pic:pic>
+              </a:graphicData>
+            </a:graphic>
+          </wp:inline>
+        </w:drawing>
+      </w:r>
+    </w:p>
+    <w:p>
+      <w:pPr>
+        <w:pStyle w:val="Kpalrs"/>
+        <w:jc w:val="center"/>
+      </w:pPr>
+      <w:r>
+        <w:t xml:space="preserve">ábra </w:t>
+      </w:r>
+      <w:fldSimple w:instr=" SEQ ábra \* ARABIC ">
+        <w:r>
+          <w:rPr>
+            <w:noProof/>
+          </w:rPr>
+          <w:t>1</w:t>
+        </w:r>
+      </w:fldSimple>
+      <w:r>
+        <w:t xml:space="preserve"> </w:t>
+      </w:r>
+      <w:r>
+        <w:t>Login és Regisztrációs felület</w:t>
+      </w:r>
+    </w:p>
+    <w:p>
+      <w:pPr>
+        <w:keepNext/>
+      </w:pPr>
+      <w:r>
+        <w:drawing>
+          <wp:inline distT="0" distB="0" distL="0" distR="0" wp14:anchorId="6F822347" wp14:editId="0EC8AA80">
+            <wp:extent cx="5760720" cy="3577590"/>
+            <wp:effectExtent l="0" t="0" r="0" b="3810"/>
+            <wp:docPr id="1570324309" name="Kép 1"/>
+            <wp:cNvGraphicFramePr>
+              <a:graphicFrameLocks xmlns:a="http://schemas.openxmlformats.org/drawingml/2006/main" noChangeAspect="1"/>
+            </wp:cNvGraphicFramePr>
+            <a:graphic xmlns:a="http://schemas.openxmlformats.org/drawingml/2006/main">
+              <a:graphicData uri="http://schemas.openxmlformats.org/drawingml/2006/picture">
+                <pic:pic xmlns:pic="http://schemas.openxmlformats.org/drawingml/2006/picture">
+                  <pic:nvPicPr>
+                    <pic:cNvPr id="1570324309" name=""/>
+                    <pic:cNvPicPr/>
+                  </pic:nvPicPr>
+                  <pic:blipFill>
+                    <a:blip r:embed="rId10"/>
+                    <a:stretch>
+                      <a:fillRect/>
+                    </a:stretch>
+                  </pic:blipFill>
+                  <pic:spPr>
+                    <a:xfrm>
+                      <a:off x="0" y="0"/>
+                      <a:ext cx="5760720" cy="3577590"/>
+                    </a:xfrm>
+                    <a:prstGeom prst="rect">
+                      <a:avLst/>
+                    </a:prstGeom>
+                  </pic:spPr>
+                </pic:pic>
+              </a:graphicData>
+            </a:graphic>
+          </wp:inline>
+        </w:drawing>
+      </w:r>
+    </w:p>
+    <w:p>
+      <w:pPr>
+        <w:pStyle w:val="Kpalrs"/>
+        <w:jc w:val="center"/>
+      </w:pPr>
+      <w:r>
+        <w:t xml:space="preserve">ábra </w:t>
+      </w:r>
+      <w:fldSimple w:instr=" SEQ ábra \* ARABIC ">
+        <w:r>
+          <w:rPr>
+            <w:noProof/>
+          </w:rPr>
+          <w:t>2</w:t>
+        </w:r>
+      </w:fldSimple>
+      <w:r>
+        <w:t xml:space="preserve"> </w:t>
+      </w:r>
+      <w:r>
+        <w:t>Felhasználó felület</w:t>
+      </w:r>
+    </w:p>
+    <w:p/>
+    <w:p>
+      <w:pPr>
+        <w:keepNext/>
+        <w:jc w:val="center"/>
+      </w:pPr>
+      <w:r>
+        <w:lastRenderedPageBreak/>
+        <w:drawing>
+          <wp:inline distT="0" distB="0" distL="0" distR="0" wp14:anchorId="6C50CAF5" wp14:editId="11AF3028">
+            <wp:extent cx="4152900" cy="8149834"/>
+            <wp:effectExtent l="0" t="0" r="0" b="3810"/>
+            <wp:docPr id="781744361" name="Kép 1"/>
+            <wp:cNvGraphicFramePr>
+              <a:graphicFrameLocks xmlns:a="http://schemas.openxmlformats.org/drawingml/2006/main" noChangeAspect="1"/>
+            </wp:cNvGraphicFramePr>
+            <a:graphic xmlns:a="http://schemas.openxmlformats.org/drawingml/2006/main">
+              <a:graphicData uri="http://schemas.openxmlformats.org/drawingml/2006/picture">
+                <pic:pic xmlns:pic="http://schemas.openxmlformats.org/drawingml/2006/picture">
+                  <pic:nvPicPr>
+                    <pic:cNvPr id="781744361" name=""/>
+                    <pic:cNvPicPr/>
+                  </pic:nvPicPr>
+                  <pic:blipFill>
+                    <a:blip r:embed="rId11"/>
+                    <a:stretch>
+                      <a:fillRect/>
+                    </a:stretch>
+                  </pic:blipFill>
+                  <pic:spPr>
+                    <a:xfrm>
+                      <a:off x="0" y="0"/>
+                      <a:ext cx="4157943" cy="8159730"/>
+                    </a:xfrm>
+                    <a:prstGeom prst="rect">
+                      <a:avLst/>
+                    </a:prstGeom>
+                  </pic:spPr>
+                </pic:pic>
+              </a:graphicData>
+            </a:graphic>
+          </wp:inline>
+        </w:drawing>
+      </w:r>
+    </w:p>
+    <w:p>
+      <w:pPr>
+        <w:pStyle w:val="Kpalrs"/>
+        <w:jc w:val="center"/>
+      </w:pPr>
+      <w:r>
+        <w:t xml:space="preserve">ábra </w:t>
+      </w:r>
+      <w:fldSimple w:instr=" SEQ ábra \* ARABIC ">
+        <w:r>
+          <w:rPr>
+            <w:noProof/>
+          </w:rPr>
+          <w:t>3</w:t>
+        </w:r>
+      </w:fldSimple>
+      <w:r>
+        <w:t xml:space="preserve"> </w:t>
+      </w:r>
+      <w:r>
+        <w:t>Felhasználó felület mobil nézetben</w:t>
+      </w:r>
+    </w:p>
+    <w:p>
+      <w:pPr>
+        <w:rPr>
+          <w:i/>
+          <w:iCs/>
+          <w:color w:val="0E2841" w:themeColor="text2"/>
+          <w:sz w:val="18"/>
+          <w:szCs w:val="18"/>
+        </w:rPr>
+      </w:pPr>
+      <w:r>
+        <w:br w:type="page"/>
+      </w:r>
+    </w:p>
+    <w:sdt>
+      <w:sdtPr>
+        <w:rPr>
+          <w:lang w:val="hu-HU"/>
+        </w:rPr>
+        <w:id w:val="-421101758"/>
+        <w:docPartObj>
+          <w:docPartGallery w:val="Table of Contents"/>
+          <w:docPartUnique/>
+        </w:docPartObj>
+      </w:sdtPr>
+      <w:sdtEndPr>
+        <w:rPr>
+          <w:rFonts w:asciiTheme="minorHAnsi" w:eastAsiaTheme="minorEastAsia" w:hAnsiTheme="minorHAnsi" w:cstheme="minorBidi"/>
+          <w:b/>
+          <w:bCs/>
+          <w:color w:val="auto"/>
+          <w:sz w:val="20"/>
+          <w:szCs w:val="20"/>
+          <w:lang w:val="en-GB"/>
+        </w:rPr>
+      </w:sdtEndPr>
+      <w:sdtContent>
+        <w:p>
+          <w:pPr>
+            <w:pStyle w:val="Tartalomjegyzkcmsora"/>
+          </w:pPr>
+          <w:r>
+            <w:rPr>
+              <w:lang w:val="hu-HU"/>
+            </w:rPr>
+            <w:t>Tartalomjegyzék</w:t>
+          </w:r>
+        </w:p>
+        <w:p>
+          <w:pPr>
+            <w:pStyle w:val="TJ1"/>
+            <w:tabs>
+              <w:tab w:val="right" w:leader="dot" w:pos="9062"/>
+            </w:tabs>
+            <w:rPr>
+              <w:noProof/>
+            </w:rPr>
+          </w:pPr>
+          <w:r>
+            <w:fldChar w:fldCharType="begin"/>
+          </w:r>
+          <w:r>
+            <w:instrText xml:space="preserve"> TOC \o "1-3" \h \z \u </w:instrText>
+          </w:r>
+          <w:r>
+            <w:fldChar w:fldCharType="separate"/>
+          </w:r>
+          <w:hyperlink w:anchor="_Toc228094592" w:history="1">
+            <w:r>
+              <w:rPr>
+                <w:rStyle w:val="Hiperhivatkozs"/>
+                <w:noProof/>
+              </w:rPr>
+              <w:t>1) Projekt cél és scope</w:t>
+            </w:r>
+            <w:r>
+              <w:rPr>
+                <w:noProof/>
+                <w:webHidden/>
+              </w:rPr>
+              <w:tab/>
+            </w:r>
+            <w:r>
+              <w:rPr>
+                <w:noProof/>
+                <w:webHidden/>
+              </w:rPr>
+              <w:fldChar w:fldCharType="begin"/>
+            </w:r>
+            <w:r>
+              <w:rPr>
+                <w:noProof/>
+                <w:webHidden/>
+              </w:rPr>
+              <w:instrText xml:space="preserve"> PAGEREF _Toc228094592 \h </w:instrText>
+            </w:r>
+            <w:r>
+              <w:rPr>
+                <w:noProof/>
+                <w:webHidden/>
+              </w:rPr>
+            </w:r>
+            <w:r>
+              <w:rPr>
+                <w:noProof/>
+                <w:webHidden/>
+              </w:rPr>
+              <w:fldChar w:fldCharType="separate"/>
+            </w:r>
+            <w:r>
+              <w:rPr>
+                <w:noProof/>
+                <w:webHidden/>
+              </w:rPr>
+              <w:t>2</w:t>
+            </w:r>
+            <w:r>
+              <w:rPr>
+                <w:noProof/>
+                <w:webHidden/>
+              </w:rPr>
+              <w:fldChar w:fldCharType="end"/>
+            </w:r>
+          </w:hyperlink>
+        </w:p>
+        <w:p>
+          <w:pPr>
+            <w:pStyle w:val="TJ2"/>
+            <w:tabs>
+              <w:tab w:val="right" w:leader="dot" w:pos="9062"/>
+            </w:tabs>
+            <w:rPr>
+              <w:noProof/>
+            </w:rPr>
+          </w:pPr>
+          <w:hyperlink w:anchor="_Toc228094593" w:history="1">
+            <w:r>
+              <w:rPr>
+                <w:rStyle w:val="Hiperhivatkozs"/>
+                <w:noProof/>
+              </w:rPr>
+              <w:t>Főbb funkcionalitás:</w:t>
+            </w:r>
+            <w:r>
+              <w:rPr>
+                <w:noProof/>
+                <w:webHidden/>
+              </w:rPr>
+              <w:tab/>
+            </w:r>
+            <w:r>
+              <w:rPr>
+                <w:noProof/>
+                <w:webHidden/>
+              </w:rPr>
+              <w:fldChar w:fldCharType="begin"/>
+            </w:r>
+            <w:r>
+              <w:rPr>
+                <w:noProof/>
+                <w:webHidden/>
+              </w:rPr>
+              <w:instrText xml:space="preserve"> PAGEREF _Toc228094593 \h </w:instrText>
+            </w:r>
+            <w:r>
+              <w:rPr>
+                <w:noProof/>
+                <w:webHidden/>
+              </w:rPr>
+            </w:r>
+            <w:r>
+              <w:rPr>
+                <w:noProof/>
+                <w:webHidden/>
+              </w:rPr>
+              <w:fldChar w:fldCharType="separate"/>
+            </w:r>
+            <w:r>
+              <w:rPr>
+                <w:noProof/>
+                <w:webHidden/>
+              </w:rPr>
+              <w:t>2</w:t>
+            </w:r>
+            <w:r>
+              <w:rPr>
+                <w:noProof/>
+                <w:webHidden/>
+              </w:rPr>
+              <w:fldChar w:fldCharType="end"/>
+            </w:r>
+          </w:hyperlink>
+        </w:p>
+        <w:p>
+          <w:pPr>
+            <w:pStyle w:val="TJ1"/>
+            <w:tabs>
+              <w:tab w:val="right" w:leader="dot" w:pos="9062"/>
+            </w:tabs>
+            <w:rPr>
+              <w:noProof/>
+            </w:rPr>
+          </w:pPr>
+          <w:hyperlink w:anchor="_Toc228094594" w:history="1">
+            <w:r>
+              <w:rPr>
+                <w:rStyle w:val="Hiperhivatkozs"/>
+                <w:noProof/>
+              </w:rPr>
+              <w:t>2) Tech stack</w:t>
+            </w:r>
+            <w:r>
+              <w:rPr>
+                <w:noProof/>
+                <w:webHidden/>
+              </w:rPr>
+              <w:tab/>
+            </w:r>
+            <w:r>
+              <w:rPr>
+                <w:noProof/>
+                <w:webHidden/>
+              </w:rPr>
+              <w:fldChar w:fldCharType="begin"/>
+            </w:r>
+            <w:r>
+              <w:rPr>
+                <w:noProof/>
+                <w:webHidden/>
+              </w:rPr>
+              <w:instrText xml:space="preserve"> PAGEREF _Toc228094594 \h </w:instrText>
+            </w:r>
+            <w:r>
+              <w:rPr>
+                <w:noProof/>
+                <w:webHidden/>
+              </w:rPr>
+            </w:r>
+            <w:r>
+              <w:rPr>
+                <w:noProof/>
+                <w:webHidden/>
+              </w:rPr>
+              <w:fldChar w:fldCharType="separate"/>
+            </w:r>
+            <w:r>
+              <w:rPr>
+                <w:noProof/>
+                <w:webHidden/>
+              </w:rPr>
+              <w:t>2</w:t>
+            </w:r>
+            <w:r>
+              <w:rPr>
+                <w:noProof/>
+                <w:webHidden/>
+              </w:rPr>
+              <w:fldChar w:fldCharType="end"/>
+            </w:r>
+          </w:hyperlink>
+        </w:p>
+        <w:p>
+          <w:pPr>
+            <w:pStyle w:val="TJ2"/>
+            <w:tabs>
+              <w:tab w:val="right" w:leader="dot" w:pos="9062"/>
+            </w:tabs>
+            <w:rPr>
+              <w:noProof/>
+            </w:rPr>
+          </w:pPr>
+          <w:hyperlink w:anchor="_Toc228094595" w:history="1">
+            <w:r>
+              <w:rPr>
+                <w:rStyle w:val="Hiperhivatkozs"/>
+                <w:noProof/>
+              </w:rPr>
+              <w:t>Fejlesztéshez használt eszközök:</w:t>
+            </w:r>
+            <w:r>
+              <w:rPr>
+                <w:noProof/>
+                <w:webHidden/>
+              </w:rPr>
+              <w:tab/>
+            </w:r>
+            <w:r>
+              <w:rPr>
+                <w:noProof/>
+                <w:webHidden/>
+              </w:rPr>
+              <w:fldChar w:fldCharType="begin"/>
+            </w:r>
+            <w:r>
+              <w:rPr>
+                <w:noProof/>
+                <w:webHidden/>
+              </w:rPr>
+              <w:instrText xml:space="preserve"> PAGEREF _Toc228094595 \h </w:instrText>
+            </w:r>
+            <w:r>
+              <w:rPr>
+                <w:noProof/>
+                <w:webHidden/>
+              </w:rPr>
+            </w:r>
+            <w:r>
+              <w:rPr>
+                <w:noProof/>
+                <w:webHidden/>
+              </w:rPr>
+              <w:fldChar w:fldCharType="separate"/>
+            </w:r>
+            <w:r>
+              <w:rPr>
+                <w:noProof/>
+                <w:webHidden/>
+              </w:rPr>
+              <w:t>2</w:t>
+            </w:r>
+            <w:r>
+              <w:rPr>
+                <w:noProof/>
+                <w:webHidden/>
+              </w:rPr>
+              <w:fldChar w:fldCharType="end"/>
+            </w:r>
+          </w:hyperlink>
+        </w:p>
+        <w:p>
+          <w:pPr>
+            <w:pStyle w:val="TJ2"/>
+            <w:tabs>
+              <w:tab w:val="right" w:leader="dot" w:pos="9062"/>
+            </w:tabs>
+            <w:rPr>
+              <w:noProof/>
+            </w:rPr>
+          </w:pPr>
+          <w:hyperlink w:anchor="_Toc228094596" w:history="1">
+            <w:r>
+              <w:rPr>
+                <w:rStyle w:val="Hiperhivatkozs"/>
+                <w:noProof/>
+              </w:rPr>
+              <w:t>Backend:</w:t>
+            </w:r>
+            <w:r>
+              <w:rPr>
+                <w:noProof/>
+                <w:webHidden/>
+              </w:rPr>
+              <w:tab/>
+            </w:r>
+            <w:r>
+              <w:rPr>
+                <w:noProof/>
+                <w:webHidden/>
+              </w:rPr>
+              <w:fldChar w:fldCharType="begin"/>
+            </w:r>
+            <w:r>
+              <w:rPr>
+                <w:noProof/>
+                <w:webHidden/>
+              </w:rPr>
+              <w:instrText xml:space="preserve"> PAGEREF _Toc228094596 \h </w:instrText>
+            </w:r>
+            <w:r>
+              <w:rPr>
+                <w:noProof/>
+                <w:webHidden/>
+              </w:rPr>
+            </w:r>
+            <w:r>
+              <w:rPr>
+                <w:noProof/>
+                <w:webHidden/>
+              </w:rPr>
+              <w:fldChar w:fldCharType="separate"/>
+            </w:r>
+            <w:r>
+              <w:rPr>
+                <w:noProof/>
+                <w:webHidden/>
+              </w:rPr>
+              <w:t>2</w:t>
+            </w:r>
+            <w:r>
+              <w:rPr>
+                <w:noProof/>
+                <w:webHidden/>
+              </w:rPr>
+              <w:fldChar w:fldCharType="end"/>
+            </w:r>
+          </w:hyperlink>
+        </w:p>
+        <w:p>
+          <w:pPr>
+            <w:pStyle w:val="TJ2"/>
+            <w:tabs>
+              <w:tab w:val="right" w:leader="dot" w:pos="9062"/>
+            </w:tabs>
+            <w:rPr>
+              <w:noProof/>
+            </w:rPr>
+          </w:pPr>
+          <w:hyperlink w:anchor="_Toc228094597" w:history="1">
+            <w:r>
+              <w:rPr>
+                <w:rStyle w:val="Hiperhivatkozs"/>
+                <w:noProof/>
+              </w:rPr>
+              <w:t>Database:</w:t>
+            </w:r>
+            <w:r>
+              <w:rPr>
+                <w:noProof/>
+                <w:webHidden/>
+              </w:rPr>
+              <w:tab/>
+            </w:r>
+            <w:r>
+              <w:rPr>
+                <w:noProof/>
+                <w:webHidden/>
+              </w:rPr>
+              <w:fldChar w:fldCharType="begin"/>
+            </w:r>
+            <w:r>
+              <w:rPr>
+                <w:noProof/>
+                <w:webHidden/>
+              </w:rPr>
+              <w:instrText xml:space="preserve"> PAGEREF _Toc228094597 \h </w:instrText>
+            </w:r>
+            <w:r>
+              <w:rPr>
+                <w:noProof/>
+                <w:webHidden/>
+              </w:rPr>
+            </w:r>
+            <w:r>
+              <w:rPr>
+                <w:noProof/>
+                <w:webHidden/>
+              </w:rPr>
+              <w:fldChar w:fldCharType="separate"/>
+            </w:r>
+            <w:r>
+              <w:rPr>
+                <w:noProof/>
+                <w:webHidden/>
+              </w:rPr>
+              <w:t>2</w:t>
+            </w:r>
+            <w:r>
+              <w:rPr>
+                <w:noProof/>
+                <w:webHidden/>
+              </w:rPr>
+              <w:fldChar w:fldCharType="end"/>
+            </w:r>
+          </w:hyperlink>
+        </w:p>
+        <w:p>
+          <w:pPr>
+            <w:pStyle w:val="TJ2"/>
+            <w:tabs>
+              <w:tab w:val="right" w:leader="dot" w:pos="9062"/>
+            </w:tabs>
+            <w:rPr>
+              <w:noProof/>
+            </w:rPr>
+          </w:pPr>
+          <w:hyperlink w:anchor="_Toc228094598" w:history="1">
+            <w:r>
+              <w:rPr>
+                <w:rStyle w:val="Hiperhivatkozs"/>
+                <w:noProof/>
+              </w:rPr>
+              <w:t>Frontend:</w:t>
+            </w:r>
+            <w:r>
+              <w:rPr>
+                <w:noProof/>
+                <w:webHidden/>
+              </w:rPr>
+              <w:tab/>
+            </w:r>
+            <w:r>
+              <w:rPr>
+                <w:noProof/>
+                <w:webHidden/>
+              </w:rPr>
+              <w:fldChar w:fldCharType="begin"/>
+            </w:r>
+            <w:r>
+              <w:rPr>
+                <w:noProof/>
+                <w:webHidden/>
+              </w:rPr>
+              <w:instrText xml:space="preserve"> PAGEREF _Toc228094598 \h </w:instrText>
+            </w:r>
+            <w:r>
+              <w:rPr>
+                <w:noProof/>
+                <w:webHidden/>
+              </w:rPr>
+            </w:r>
+            <w:r>
+              <w:rPr>
+                <w:noProof/>
+                <w:webHidden/>
+              </w:rPr>
+              <w:fldChar w:fldCharType="separate"/>
+            </w:r>
+            <w:r>
+              <w:rPr>
+                <w:noProof/>
+                <w:webHidden/>
+              </w:rPr>
+              <w:t>2</w:t>
+            </w:r>
+            <w:r>
+              <w:rPr>
+                <w:noProof/>
+                <w:webHidden/>
+              </w:rPr>
+              <w:fldChar w:fldCharType="end"/>
+            </w:r>
+          </w:hyperlink>
+        </w:p>
+        <w:p>
+          <w:pPr>
+            <w:pStyle w:val="TJ2"/>
+            <w:tabs>
+              <w:tab w:val="right" w:leader="dot" w:pos="9062"/>
+            </w:tabs>
+            <w:rPr>
+              <w:noProof/>
+            </w:rPr>
+          </w:pPr>
+          <w:hyperlink w:anchor="_Toc228094599" w:history="1">
+            <w:r>
+              <w:rPr>
+                <w:rStyle w:val="Hiperhivatkozs"/>
+                <w:noProof/>
+              </w:rPr>
+              <w:t>Testing:</w:t>
+            </w:r>
+            <w:r>
+              <w:rPr>
+                <w:noProof/>
+                <w:webHidden/>
+              </w:rPr>
+              <w:tab/>
+            </w:r>
+            <w:r>
+              <w:rPr>
+                <w:noProof/>
+                <w:webHidden/>
+              </w:rPr>
+              <w:fldChar w:fldCharType="begin"/>
+            </w:r>
+            <w:r>
+              <w:rPr>
+                <w:noProof/>
+                <w:webHidden/>
+              </w:rPr>
+              <w:instrText xml:space="preserve"> PAGEREF _Toc228094599 \h </w:instrText>
+            </w:r>
+            <w:r>
+              <w:rPr>
+                <w:noProof/>
+                <w:webHidden/>
+              </w:rPr>
+            </w:r>
+            <w:r>
+              <w:rPr>
+                <w:noProof/>
+                <w:webHidden/>
+              </w:rPr>
+              <w:fldChar w:fldCharType="separate"/>
+            </w:r>
+            <w:r>
+              <w:rPr>
+                <w:noProof/>
+                <w:webHidden/>
+              </w:rPr>
+              <w:t>3</w:t>
+            </w:r>
+            <w:r>
+              <w:rPr>
+                <w:noProof/>
+                <w:webHidden/>
+              </w:rPr>
+              <w:fldChar w:fldCharType="end"/>
+            </w:r>
+          </w:hyperlink>
+        </w:p>
+        <w:p>
+          <w:pPr>
+            <w:pStyle w:val="TJ2"/>
+            <w:tabs>
+              <w:tab w:val="right" w:leader="dot" w:pos="9062"/>
+            </w:tabs>
+            <w:rPr>
+              <w:noProof/>
+            </w:rPr>
+          </w:pPr>
+          <w:hyperlink w:anchor="_Toc228094600" w:history="1">
+            <w:r>
+              <w:rPr>
+                <w:rStyle w:val="Hiperhivatkozs"/>
+                <w:noProof/>
+              </w:rPr>
+              <w:t>DevOps:</w:t>
+            </w:r>
+            <w:r>
+              <w:rPr>
+                <w:noProof/>
+                <w:webHidden/>
+              </w:rPr>
+              <w:tab/>
+            </w:r>
+            <w:r>
+              <w:rPr>
+                <w:noProof/>
+                <w:webHidden/>
+              </w:rPr>
+              <w:fldChar w:fldCharType="begin"/>
+            </w:r>
+            <w:r>
+              <w:rPr>
+                <w:noProof/>
+                <w:webHidden/>
+              </w:rPr>
+              <w:instrText xml:space="preserve"> PAGEREF _Toc228094600 \h </w:instrText>
+            </w:r>
+            <w:r>
+              <w:rPr>
+                <w:noProof/>
+                <w:webHidden/>
+              </w:rPr>
+            </w:r>
+            <w:r>
+              <w:rPr>
+                <w:noProof/>
+                <w:webHidden/>
+              </w:rPr>
+              <w:fldChar w:fldCharType="separate"/>
+            </w:r>
+            <w:r>
+              <w:rPr>
+                <w:noProof/>
+                <w:webHidden/>
+              </w:rPr>
+              <w:t>3</w:t>
+            </w:r>
+            <w:r>
+              <w:rPr>
+                <w:noProof/>
+                <w:webHidden/>
+              </w:rPr>
+              <w:fldChar w:fldCharType="end"/>
+            </w:r>
+          </w:hyperlink>
+        </w:p>
+        <w:p>
+          <w:pPr>
+            <w:pStyle w:val="TJ1"/>
+            <w:tabs>
+              <w:tab w:val="right" w:leader="dot" w:pos="9062"/>
+            </w:tabs>
+            <w:rPr>
+              <w:noProof/>
+            </w:rPr>
+          </w:pPr>
+          <w:hyperlink w:anchor="_Toc228094601" w:history="1">
+            <w:r>
+              <w:rPr>
+                <w:rStyle w:val="Hiperhivatkozs"/>
+                <w:noProof/>
+              </w:rPr>
+              <w:t>3) High-level architecture</w:t>
+            </w:r>
+            <w:r>
+              <w:rPr>
+                <w:noProof/>
+                <w:webHidden/>
+              </w:rPr>
+              <w:tab/>
+            </w:r>
+            <w:r>
+              <w:rPr>
+                <w:noProof/>
+                <w:webHidden/>
+              </w:rPr>
+              <w:fldChar w:fldCharType="begin"/>
+            </w:r>
+            <w:r>
+              <w:rPr>
+                <w:noProof/>
+                <w:webHidden/>
+              </w:rPr>
+              <w:instrText xml:space="preserve"> PAGEREF _Toc228094601 \h </w:instrText>
+            </w:r>
+            <w:r>
+              <w:rPr>
+                <w:noProof/>
+                <w:webHidden/>
+              </w:rPr>
+            </w:r>
+            <w:r>
+              <w:rPr>
+                <w:noProof/>
+                <w:webHidden/>
+              </w:rPr>
+              <w:fldChar w:fldCharType="separate"/>
+            </w:r>
+            <w:r>
+              <w:rPr>
+                <w:noProof/>
+                <w:webHidden/>
+              </w:rPr>
+              <w:t>3</w:t>
+            </w:r>
+            <w:r>
+              <w:rPr>
+                <w:noProof/>
+                <w:webHidden/>
+              </w:rPr>
+              <w:fldChar w:fldCharType="end"/>
+            </w:r>
+          </w:hyperlink>
+        </w:p>
+        <w:p>
+          <w:pPr>
+            <w:pStyle w:val="TJ1"/>
+            <w:tabs>
+              <w:tab w:val="right" w:leader="dot" w:pos="9062"/>
+            </w:tabs>
+            <w:rPr>
+              <w:noProof/>
+            </w:rPr>
+          </w:pPr>
+          <w:hyperlink w:anchor="_Toc228094602" w:history="1">
+            <w:r>
+              <w:rPr>
+                <w:rStyle w:val="Hiperhivatkozs"/>
+                <w:noProof/>
+              </w:rPr>
+              <w:t>4) Backend implementáció</w:t>
+            </w:r>
+            <w:r>
+              <w:rPr>
+                <w:noProof/>
+                <w:webHidden/>
+              </w:rPr>
+              <w:tab/>
+            </w:r>
+            <w:r>
+              <w:rPr>
+                <w:noProof/>
+                <w:webHidden/>
+              </w:rPr>
+              <w:fldChar w:fldCharType="begin"/>
+            </w:r>
+            <w:r>
+              <w:rPr>
+                <w:noProof/>
+                <w:webHidden/>
+              </w:rPr>
+              <w:instrText xml:space="preserve"> PAGEREF _Toc228094602 \h </w:instrText>
+            </w:r>
+            <w:r>
+              <w:rPr>
+                <w:noProof/>
+                <w:webHidden/>
+              </w:rPr>
+            </w:r>
+            <w:r>
+              <w:rPr>
+                <w:noProof/>
+                <w:webHidden/>
+              </w:rPr>
+              <w:fldChar w:fldCharType="separate"/>
+            </w:r>
+            <w:r>
+              <w:rPr>
+                <w:noProof/>
+                <w:webHidden/>
+              </w:rPr>
+              <w:t>3</w:t>
+            </w:r>
+            <w:r>
+              <w:rPr>
+                <w:noProof/>
+                <w:webHidden/>
+              </w:rPr>
+              <w:fldChar w:fldCharType="end"/>
+            </w:r>
+          </w:hyperlink>
+        </w:p>
+        <w:p>
+          <w:pPr>
+            <w:pStyle w:val="TJ2"/>
+            <w:tabs>
+              <w:tab w:val="right" w:leader="dot" w:pos="9062"/>
+            </w:tabs>
+            <w:rPr>
+              <w:noProof/>
+            </w:rPr>
+          </w:pPr>
+          <w:hyperlink w:anchor="_Toc228094603" w:history="1">
+            <w:r>
+              <w:rPr>
+                <w:rStyle w:val="Hiperhivatkozs"/>
+                <w:noProof/>
+              </w:rPr>
+              <w:t>4.1 Auth</w:t>
+            </w:r>
+            <w:r>
+              <w:rPr>
+                <w:noProof/>
+                <w:webHidden/>
+              </w:rPr>
+              <w:tab/>
+            </w:r>
+            <w:r>
+              <w:rPr>
+                <w:noProof/>
+                <w:webHidden/>
+              </w:rPr>
+              <w:fldChar w:fldCharType="begin"/>
+            </w:r>
+            <w:r>
+              <w:rPr>
+                <w:noProof/>
+                <w:webHidden/>
+              </w:rPr>
+              <w:instrText xml:space="preserve"> PAGEREF _Toc228094603 \h </w:instrText>
+            </w:r>
+            <w:r>
+              <w:rPr>
+                <w:noProof/>
+                <w:webHidden/>
+              </w:rPr>
+            </w:r>
+            <w:r>
+              <w:rPr>
+                <w:noProof/>
+                <w:webHidden/>
+              </w:rPr>
+              <w:fldChar w:fldCharType="separate"/>
+            </w:r>
+            <w:r>
+              <w:rPr>
+                <w:noProof/>
+                <w:webHidden/>
+              </w:rPr>
+              <w:t>3</w:t>
+            </w:r>
+            <w:r>
+              <w:rPr>
+                <w:noProof/>
+                <w:webHidden/>
+              </w:rPr>
+              <w:fldChar w:fldCharType="end"/>
+            </w:r>
+          </w:hyperlink>
+        </w:p>
+        <w:p>
+          <w:pPr>
+            <w:pStyle w:val="TJ2"/>
+            <w:tabs>
+              <w:tab w:val="right" w:leader="dot" w:pos="9062"/>
+            </w:tabs>
+            <w:rPr>
+              <w:noProof/>
+            </w:rPr>
+          </w:pPr>
+          <w:hyperlink w:anchor="_Toc228094604" w:history="1">
+            <w:r>
+              <w:rPr>
+                <w:rStyle w:val="Hiperhivatkozs"/>
+                <w:noProof/>
+              </w:rPr>
+              <w:t>4.2 Notes domain</w:t>
+            </w:r>
+            <w:r>
+              <w:rPr>
+                <w:noProof/>
+                <w:webHidden/>
+              </w:rPr>
+              <w:tab/>
+            </w:r>
+            <w:r>
+              <w:rPr>
+                <w:noProof/>
+                <w:webHidden/>
+              </w:rPr>
+              <w:fldChar w:fldCharType="begin"/>
+            </w:r>
+            <w:r>
+              <w:rPr>
+                <w:noProof/>
+                <w:webHidden/>
+              </w:rPr>
+              <w:instrText xml:space="preserve"> PAGEREF _Toc228094604 \h </w:instrText>
+            </w:r>
+            <w:r>
+              <w:rPr>
+                <w:noProof/>
+                <w:webHidden/>
+              </w:rPr>
+            </w:r>
+            <w:r>
+              <w:rPr>
+                <w:noProof/>
+                <w:webHidden/>
+              </w:rPr>
+              <w:fldChar w:fldCharType="separate"/>
+            </w:r>
+            <w:r>
+              <w:rPr>
+                <w:noProof/>
+                <w:webHidden/>
+              </w:rPr>
+              <w:t>3</w:t>
+            </w:r>
+            <w:r>
+              <w:rPr>
+                <w:noProof/>
+                <w:webHidden/>
+              </w:rPr>
+              <w:fldChar w:fldCharType="end"/>
+            </w:r>
+          </w:hyperlink>
+        </w:p>
+        <w:p>
+          <w:pPr>
+            <w:pStyle w:val="TJ2"/>
+            <w:tabs>
+              <w:tab w:val="right" w:leader="dot" w:pos="9062"/>
+            </w:tabs>
+            <w:rPr>
+              <w:noProof/>
+            </w:rPr>
+          </w:pPr>
+          <w:hyperlink w:anchor="_Toc228094605" w:history="1">
+            <w:r>
+              <w:rPr>
+                <w:rStyle w:val="Hiperhivatkozs"/>
+                <w:noProof/>
+              </w:rPr>
+              <w:t>4.3 ORM és migrations</w:t>
+            </w:r>
+            <w:r>
+              <w:rPr>
+                <w:noProof/>
+                <w:webHidden/>
+              </w:rPr>
+              <w:tab/>
+            </w:r>
+            <w:r>
+              <w:rPr>
+                <w:noProof/>
+                <w:webHidden/>
+              </w:rPr>
+              <w:fldChar w:fldCharType="begin"/>
+            </w:r>
+            <w:r>
+              <w:rPr>
+                <w:noProof/>
+                <w:webHidden/>
+              </w:rPr>
+              <w:instrText xml:space="preserve"> PAGEREF _Toc228094605 \h </w:instrText>
+            </w:r>
+            <w:r>
+              <w:rPr>
+                <w:noProof/>
+                <w:webHidden/>
+              </w:rPr>
+            </w:r>
+            <w:r>
+              <w:rPr>
+                <w:noProof/>
+                <w:webHidden/>
+              </w:rPr>
+              <w:fldChar w:fldCharType="separate"/>
+            </w:r>
+            <w:r>
+              <w:rPr>
+                <w:noProof/>
+                <w:webHidden/>
+              </w:rPr>
+              <w:t>4</w:t>
+            </w:r>
+            <w:r>
+              <w:rPr>
+                <w:noProof/>
+                <w:webHidden/>
+              </w:rPr>
+              <w:fldChar w:fldCharType="end"/>
+            </w:r>
+          </w:hyperlink>
+        </w:p>
+        <w:p>
+          <w:pPr>
+            <w:pStyle w:val="TJ2"/>
+            <w:tabs>
+              <w:tab w:val="right" w:leader="dot" w:pos="9062"/>
+            </w:tabs>
+            <w:rPr>
+              <w:noProof/>
+            </w:rPr>
+          </w:pPr>
+          <w:hyperlink w:anchor="_Toc228094606" w:history="1">
+            <w:r>
+              <w:rPr>
+                <w:rStyle w:val="Hiperhivatkozs"/>
+                <w:noProof/>
+              </w:rPr>
+              <w:t>4.4 Konfiguráció es security</w:t>
+            </w:r>
+            <w:r>
+              <w:rPr>
+                <w:noProof/>
+                <w:webHidden/>
+              </w:rPr>
+              <w:tab/>
+            </w:r>
+            <w:r>
+              <w:rPr>
+                <w:noProof/>
+                <w:webHidden/>
+              </w:rPr>
+              <w:fldChar w:fldCharType="begin"/>
+            </w:r>
+            <w:r>
+              <w:rPr>
+                <w:noProof/>
+                <w:webHidden/>
+              </w:rPr>
+              <w:instrText xml:space="preserve"> PAGEREF _Toc228094606 \h </w:instrText>
+            </w:r>
+            <w:r>
+              <w:rPr>
+                <w:noProof/>
+                <w:webHidden/>
+              </w:rPr>
+            </w:r>
+            <w:r>
+              <w:rPr>
+                <w:noProof/>
+                <w:webHidden/>
+              </w:rPr>
+              <w:fldChar w:fldCharType="separate"/>
+            </w:r>
+            <w:r>
+              <w:rPr>
+                <w:noProof/>
+                <w:webHidden/>
+              </w:rPr>
+              <w:t>4</w:t>
+            </w:r>
+            <w:r>
+              <w:rPr>
+                <w:noProof/>
+                <w:webHidden/>
+              </w:rPr>
+              <w:fldChar w:fldCharType="end"/>
+            </w:r>
+          </w:hyperlink>
+        </w:p>
+        <w:p>
+          <w:pPr>
+            <w:pStyle w:val="TJ1"/>
+            <w:tabs>
+              <w:tab w:val="right" w:leader="dot" w:pos="9062"/>
+            </w:tabs>
+            <w:rPr>
+              <w:noProof/>
+            </w:rPr>
+          </w:pPr>
+          <w:hyperlink w:anchor="_Toc228094607" w:history="1">
+            <w:r>
+              <w:rPr>
+                <w:rStyle w:val="Hiperhivatkozs"/>
+                <w:noProof/>
+              </w:rPr>
+              <w:t>5) Frontend implementáció</w:t>
+            </w:r>
+            <w:r>
+              <w:rPr>
+                <w:noProof/>
+                <w:webHidden/>
+              </w:rPr>
+              <w:tab/>
+            </w:r>
+            <w:r>
+              <w:rPr>
+                <w:noProof/>
+                <w:webHidden/>
+              </w:rPr>
+              <w:fldChar w:fldCharType="begin"/>
+            </w:r>
+            <w:r>
+              <w:rPr>
+                <w:noProof/>
+                <w:webHidden/>
+              </w:rPr>
+              <w:instrText xml:space="preserve"> PAGEREF _Toc228094607 \h </w:instrText>
+            </w:r>
+            <w:r>
+              <w:rPr>
+                <w:noProof/>
+                <w:webHidden/>
+              </w:rPr>
+            </w:r>
+            <w:r>
+              <w:rPr>
+                <w:noProof/>
+                <w:webHidden/>
+              </w:rPr>
+              <w:fldChar w:fldCharType="separate"/>
+            </w:r>
+            <w:r>
+              <w:rPr>
+                <w:noProof/>
+                <w:webHidden/>
+              </w:rPr>
+              <w:t>4</w:t>
+            </w:r>
+            <w:r>
+              <w:rPr>
+                <w:noProof/>
+                <w:webHidden/>
+              </w:rPr>
+              <w:fldChar w:fldCharType="end"/>
+            </w:r>
+          </w:hyperlink>
+        </w:p>
+        <w:p>
+          <w:pPr>
+            <w:pStyle w:val="TJ1"/>
+            <w:tabs>
+              <w:tab w:val="right" w:leader="dot" w:pos="9062"/>
+            </w:tabs>
+            <w:rPr>
+              <w:noProof/>
+            </w:rPr>
+          </w:pPr>
+          <w:hyperlink w:anchor="_Toc228094608" w:history="1">
+            <w:r>
+              <w:rPr>
+                <w:rStyle w:val="Hiperhivatkozs"/>
+                <w:noProof/>
+              </w:rPr>
+              <w:t>6) Docker setup</w:t>
+            </w:r>
+            <w:r>
+              <w:rPr>
+                <w:noProof/>
+                <w:webHidden/>
+              </w:rPr>
+              <w:tab/>
+            </w:r>
+            <w:r>
+              <w:rPr>
+                <w:noProof/>
+                <w:webHidden/>
+              </w:rPr>
+              <w:fldChar w:fldCharType="begin"/>
+            </w:r>
+            <w:r>
+              <w:rPr>
+                <w:noProof/>
+                <w:webHidden/>
+              </w:rPr>
+              <w:instrText xml:space="preserve"> PAGEREF _Toc228094608 \h </w:instrText>
+            </w:r>
+            <w:r>
+              <w:rPr>
+                <w:noProof/>
+                <w:webHidden/>
+              </w:rPr>
+            </w:r>
+            <w:r>
+              <w:rPr>
+                <w:noProof/>
+                <w:webHidden/>
+              </w:rPr>
+              <w:fldChar w:fldCharType="separate"/>
+            </w:r>
+            <w:r>
+              <w:rPr>
+                <w:noProof/>
+                <w:webHidden/>
+              </w:rPr>
+              <w:t>4</w:t>
+            </w:r>
+            <w:r>
+              <w:rPr>
+                <w:noProof/>
+                <w:webHidden/>
+              </w:rPr>
+              <w:fldChar w:fldCharType="end"/>
+            </w:r>
+          </w:hyperlink>
+        </w:p>
+        <w:p>
+          <w:pPr>
+            <w:pStyle w:val="TJ1"/>
+            <w:tabs>
+              <w:tab w:val="right" w:leader="dot" w:pos="9062"/>
+            </w:tabs>
+            <w:rPr>
+              <w:noProof/>
+            </w:rPr>
+          </w:pPr>
+          <w:hyperlink w:anchor="_Toc228094609" w:history="1">
+            <w:r>
+              <w:rPr>
+                <w:rStyle w:val="Hiperhivatkozs"/>
+                <w:noProof/>
+              </w:rPr>
+              <w:t>7) Tesztek</w:t>
+            </w:r>
+            <w:r>
+              <w:rPr>
+                <w:noProof/>
+                <w:webHidden/>
+              </w:rPr>
+              <w:tab/>
+            </w:r>
+            <w:r>
+              <w:rPr>
+                <w:noProof/>
+                <w:webHidden/>
+              </w:rPr>
+              <w:fldChar w:fldCharType="begin"/>
+            </w:r>
+            <w:r>
+              <w:rPr>
+                <w:noProof/>
+                <w:webHidden/>
+              </w:rPr>
+              <w:instrText xml:space="preserve"> PAGEREF _Toc228094609 \h </w:instrText>
+            </w:r>
+            <w:r>
+              <w:rPr>
+                <w:noProof/>
+                <w:webHidden/>
+              </w:rPr>
+            </w:r>
+            <w:r>
+              <w:rPr>
+                <w:noProof/>
+                <w:webHidden/>
+              </w:rPr>
+              <w:fldChar w:fldCharType="separate"/>
+            </w:r>
+            <w:r>
+              <w:rPr>
+                <w:noProof/>
+                <w:webHidden/>
+              </w:rPr>
+              <w:t>5</w:t>
+            </w:r>
+            <w:r>
+              <w:rPr>
+                <w:noProof/>
+                <w:webHidden/>
+              </w:rPr>
+              <w:fldChar w:fldCharType="end"/>
+            </w:r>
+          </w:hyperlink>
+        </w:p>
+        <w:p>
+          <w:pPr>
+            <w:pStyle w:val="TJ1"/>
+            <w:tabs>
+              <w:tab w:val="right" w:leader="dot" w:pos="9062"/>
+            </w:tabs>
+            <w:rPr>
+              <w:noProof/>
+            </w:rPr>
+          </w:pPr>
+          <w:hyperlink w:anchor="_Toc228094610" w:history="1">
+            <w:r>
+              <w:rPr>
+                <w:rStyle w:val="Hiperhivatkozs"/>
+                <w:noProof/>
+              </w:rPr>
+              <w:t>8) Eredmény es követelmény teljesítés</w:t>
+            </w:r>
+            <w:r>
+              <w:rPr>
+                <w:noProof/>
+                <w:webHidden/>
+              </w:rPr>
+              <w:tab/>
+            </w:r>
+            <w:r>
+              <w:rPr>
+                <w:noProof/>
+                <w:webHidden/>
+              </w:rPr>
+              <w:fldChar w:fldCharType="begin"/>
+            </w:r>
+            <w:r>
+              <w:rPr>
+                <w:noProof/>
+                <w:webHidden/>
+              </w:rPr>
+              <w:instrText xml:space="preserve"> PAGEREF _Toc228094610 \h </w:instrText>
+            </w:r>
+            <w:r>
+              <w:rPr>
+                <w:noProof/>
+                <w:webHidden/>
+              </w:rPr>
+            </w:r>
+            <w:r>
+              <w:rPr>
+                <w:noProof/>
+                <w:webHidden/>
+              </w:rPr>
+              <w:fldChar w:fldCharType="separate"/>
+            </w:r>
+            <w:r>
+              <w:rPr>
+                <w:noProof/>
+                <w:webHidden/>
+              </w:rPr>
+              <w:t>5</w:t>
+            </w:r>
+            <w:r>
+              <w:rPr>
+                <w:noProof/>
+                <w:webHidden/>
+              </w:rPr>
+              <w:fldChar w:fldCharType="end"/>
+            </w:r>
+          </w:hyperlink>
+        </w:p>
+        <w:p>
+          <w:pPr>
+            <w:pStyle w:val="TJ1"/>
+            <w:tabs>
+              <w:tab w:val="right" w:leader="dot" w:pos="9062"/>
+            </w:tabs>
+            <w:rPr>
+              <w:noProof/>
+            </w:rPr>
+          </w:pPr>
+          <w:hyperlink w:anchor="_Toc228094611" w:history="1">
+            <w:r>
+              <w:rPr>
+                <w:rStyle w:val="Hiperhivatkozs"/>
+                <w:noProof/>
+              </w:rPr>
+              <w:t>9) UI felépítése</w:t>
+            </w:r>
+            <w:r>
+              <w:rPr>
+                <w:noProof/>
+                <w:webHidden/>
+              </w:rPr>
+              <w:tab/>
+            </w:r>
+            <w:r>
+              <w:rPr>
+                <w:noProof/>
+                <w:webHidden/>
+              </w:rPr>
+              <w:fldChar w:fldCharType="begin"/>
+            </w:r>
+            <w:r>
+              <w:rPr>
+                <w:noProof/>
+                <w:webHidden/>
+              </w:rPr>
+              <w:instrText xml:space="preserve"> PAGEREF _Toc228094611 \h </w:instrText>
+            </w:r>
+            <w:r>
+              <w:rPr>
+                <w:noProof/>
+                <w:webHidden/>
+              </w:rPr>
+            </w:r>
+            <w:r>
+              <w:rPr>
+                <w:noProof/>
+                <w:webHidden/>
+              </w:rPr>
+              <w:fldChar w:fldCharType="separate"/>
+            </w:r>
+            <w:r>
+              <w:rPr>
+                <w:noProof/>
+                <w:webHidden/>
+              </w:rPr>
+              <w:t>6</w:t>
+            </w:r>
+            <w:r>
+              <w:rPr>
+                <w:noProof/>
+                <w:webHidden/>
+              </w:rPr>
+              <w:fldChar w:fldCharType="end"/>
+            </w:r>
+          </w:hyperlink>
+        </w:p>
+        <w:p>
+          <w:r>
+            <w:rPr>
+              <w:b/>
+              <w:bCs/>
+              <w:lang w:val="hu-HU"/>
+            </w:rPr>
+            <w:fldChar w:fldCharType="end"/>
+          </w:r>
+        </w:p>
+      </w:sdtContent>
+    </w:sdt>
     <w:sectPr>
+      <w:footerReference w:type="default" r:id="rId12"/>
       <w:pgSz w:w="11906" w:h="16838"/>
       <w:pgMar w:top="1417" w:right="1417" w:bottom="1417" w:left="1417" w:header="708" w:footer="708" w:gutter="0"/>
       <w:cols w:space="708"/>
@@ -2869,6 +4573,101 @@
     </w:sectPr>
   </w:body>
 </w:document>
+</file>
+
+<file path=word/endnotes.xml><?xml version="1.0" encoding="utf-8"?>
+<w:endnotes xmlns:wpc="http://schemas.microsoft.com/office/word/2010/wordprocessingCanvas" xmlns:cx="http://schemas.microsoft.com/office/drawing/2014/chartex" xmlns:cx1="http://schemas.microsoft.com/office/drawing/2015/9/8/chartex" xmlns:cx2="http://schemas.microsoft.com/office/drawing/2015/10/21/chartex" xmlns:cx3="http://schemas.microsoft.com/office/drawing/2016/5/9/chartex" xmlns:cx4="http://schemas.microsoft.com/office/drawing/2016/5/10/chartex" xmlns:cx5="http://schemas.microsoft.com/office/drawing/2016/5/11/chartex" xmlns:cx6="http://schemas.microsoft.com/office/drawing/2016/5/12/chartex" xmlns:cx7="http://schemas.microsoft.com/office/drawing/2016/5/13/chartex" xmlns:cx8="http://schemas.microsoft.com/office/drawing/2016/5/14/chartex" xmlns:mc="http://schemas.openxmlformats.org/markup-compatibility/2006" xmlns:aink="http://schemas.microsoft.com/office/drawing/2016/ink" xmlns:am3d="http://schemas.microsoft.com/office/drawing/2017/model3d" xmlns:o="urn:schemas-microsoft-com:office:office" xmlns:oel="http://schemas.microsoft.com/office/2019/extlst" xmlns:r="http://schemas.openxmlformats.org/officeDocument/2006/relationships" xmlns:m="http://schemas.openxmlformats.org/officeDocument/2006/math" xmlns:v="urn:schemas-microsoft-com:vml" xmlns:wp14="http://schemas.microsoft.com/office/word/2010/wordprocessingDrawing" xmlns:wp="http://schemas.openxmlformats.org/drawingml/2006/wordprocessingDrawing" xmlns:w10="urn:schemas-microsoft-com:office:word" xmlns:w="http://schemas.openxmlformats.org/wordprocessingml/2006/main" xmlns:w14="http://schemas.microsoft.com/office/word/2010/wordml" xmlns:w15="http://schemas.microsoft.com/office/word/2012/wordml" xmlns:w16cex="http://schemas.microsoft.com/office/word/2018/wordml/cex" xmlns:w16cid="http://schemas.microsoft.com/office/word/2016/wordml/cid" xmlns:w16="http://schemas.microsoft.com/office/word/2018/wordml" xmlns:w16du="http://schemas.microsoft.com/office/word/2023/wordml/word16du" xmlns:w16sdtdh="http://schemas.microsoft.com/office/word/2020/wordml/sdtdatahash" xmlns:w16sdtfl="http://schemas.microsoft.com/office/word/2024/wordml/sdtformatlock" xmlns:w16se="http://schemas.microsoft.com/office/word/2015/wordml/symex" xmlns:wpg="http://schemas.microsoft.com/office/word/2010/wordprocessingGroup" xmlns:wpi="http://schemas.microsoft.com/office/word/2010/wordprocessingInk" xmlns:wne="http://schemas.microsoft.com/office/word/2006/wordml" xmlns:wps="http://schemas.microsoft.com/office/word/2010/wordprocessingShape" mc:Ignorable="w14 w15 w16se w16cid w16 w16cex w16sdtdh w16sdtfl w16du wp14">
+  <w:endnote w:type="separator" w:id="-1">
+    <w:p>
+      <w:pPr>
+        <w:spacing w:after="0" w:line="240" w:lineRule="auto"/>
+      </w:pPr>
+      <w:r>
+        <w:separator/>
+      </w:r>
+    </w:p>
+  </w:endnote>
+  <w:endnote w:type="continuationSeparator" w:id="0">
+    <w:p>
+      <w:pPr>
+        <w:spacing w:after="0" w:line="240" w:lineRule="auto"/>
+      </w:pPr>
+      <w:r>
+        <w:continuationSeparator/>
+      </w:r>
+    </w:p>
+  </w:endnote>
+</w:endnotes>
+</file>
+
+<file path=word/footer1.xml><?xml version="1.0" encoding="utf-8"?>
+<w:ftr xmlns:wpc="http://schemas.microsoft.com/office/word/2010/wordprocessingCanvas" xmlns:cx="http://schemas.microsoft.com/office/drawing/2014/chartex" xmlns:cx1="http://schemas.microsoft.com/office/drawing/2015/9/8/chartex" xmlns:cx2="http://schemas.microsoft.com/office/drawing/2015/10/21/chartex" xmlns:cx3="http://schemas.microsoft.com/office/drawing/2016/5/9/chartex" xmlns:cx4="http://schemas.microsoft.com/office/drawing/2016/5/10/chartex" xmlns:cx5="http://schemas.microsoft.com/office/drawing/2016/5/11/chartex" xmlns:cx6="http://schemas.microsoft.com/office/drawing/2016/5/12/chartex" xmlns:cx7="http://schemas.microsoft.com/office/drawing/2016/5/13/chartex" xmlns:cx8="http://schemas.microsoft.com/office/drawing/2016/5/14/chartex" xmlns:mc="http://schemas.openxmlformats.org/markup-compatibility/2006" xmlns:aink="http://schemas.microsoft.com/office/drawing/2016/ink" xmlns:am3d="http://schemas.microsoft.com/office/drawing/2017/model3d" xmlns:o="urn:schemas-microsoft-com:office:office" xmlns:oel="http://schemas.microsoft.com/office/2019/extlst" xmlns:r="http://schemas.openxmlformats.org/officeDocument/2006/relationships" xmlns:m="http://schemas.openxmlformats.org/officeDocument/2006/math" xmlns:v="urn:schemas-microsoft-com:vml" xmlns:wp14="http://schemas.microsoft.com/office/word/2010/wordprocessingDrawing" xmlns:wp="http://schemas.openxmlformats.org/drawingml/2006/wordprocessingDrawing" xmlns:w10="urn:schemas-microsoft-com:office:word" xmlns:w="http://schemas.openxmlformats.org/wordprocessingml/2006/main" xmlns:w14="http://schemas.microsoft.com/office/word/2010/wordml" xmlns:w15="http://schemas.microsoft.com/office/word/2012/wordml" xmlns:w16cex="http://schemas.microsoft.com/office/word/2018/wordml/cex" xmlns:w16cid="http://schemas.microsoft.com/office/word/2016/wordml/cid" xmlns:w16="http://schemas.microsoft.com/office/word/2018/wordml" xmlns:w16du="http://schemas.microsoft.com/office/word/2023/wordml/word16du" xmlns:w16sdtdh="http://schemas.microsoft.com/office/word/2020/wordml/sdtdatahash" xmlns:w16sdtfl="http://schemas.microsoft.com/office/word/2024/wordml/sdtformatlock" xmlns:w16se="http://schemas.microsoft.com/office/word/2015/wordml/symex" xmlns:wpg="http://schemas.microsoft.com/office/word/2010/wordprocessingGroup" xmlns:wpi="http://schemas.microsoft.com/office/word/2010/wordprocessingInk" xmlns:wne="http://schemas.microsoft.com/office/word/2006/wordml" xmlns:wps="http://schemas.microsoft.com/office/word/2010/wordprocessingShape" mc:Ignorable="w14 w15 w16se w16cid w16 w16cex w16sdtdh w16sdtfl w16du wp14">
+  <w:sdt>
+    <w:sdtPr>
+      <w:id w:val="-1732772764"/>
+      <w:docPartObj>
+        <w:docPartGallery w:val="Page Numbers (Bottom of Page)"/>
+        <w:docPartUnique/>
+      </w:docPartObj>
+    </w:sdtPr>
+    <w:sdtContent>
+      <w:p>
+        <w:pPr>
+          <w:pStyle w:val="llb"/>
+          <w:jc w:val="right"/>
+        </w:pPr>
+        <w:r>
+          <w:fldChar w:fldCharType="begin"/>
+        </w:r>
+        <w:r>
+          <w:instrText>PAGE   \* MERGEFORMAT</w:instrText>
+        </w:r>
+        <w:r>
+          <w:fldChar w:fldCharType="separate"/>
+        </w:r>
+        <w:r>
+          <w:rPr>
+            <w:lang w:val="hu-HU"/>
+          </w:rPr>
+          <w:t>2</w:t>
+        </w:r>
+        <w:r>
+          <w:fldChar w:fldCharType="end"/>
+        </w:r>
+      </w:p>
+    </w:sdtContent>
+  </w:sdt>
+  <w:p>
+    <w:pPr>
+      <w:pStyle w:val="llb"/>
+    </w:pPr>
+  </w:p>
+</w:ftr>
+</file>
+
+<file path=word/footnotes.xml><?xml version="1.0" encoding="utf-8"?>
+<w:footnotes xmlns:wpc="http://schemas.microsoft.com/office/word/2010/wordprocessingCanvas" xmlns:cx="http://schemas.microsoft.com/office/drawing/2014/chartex" xmlns:cx1="http://schemas.microsoft.com/office/drawing/2015/9/8/chartex" xmlns:cx2="http://schemas.microsoft.com/office/drawing/2015/10/21/chartex" xmlns:cx3="http://schemas.microsoft.com/office/drawing/2016/5/9/chartex" xmlns:cx4="http://schemas.microsoft.com/office/drawing/2016/5/10/chartex" xmlns:cx5="http://schemas.microsoft.com/office/drawing/2016/5/11/chartex" xmlns:cx6="http://schemas.microsoft.com/office/drawing/2016/5/12/chartex" xmlns:cx7="http://schemas.microsoft.com/office/drawing/2016/5/13/chartex" xmlns:cx8="http://schemas.microsoft.com/office/drawing/2016/5/14/chartex" xmlns:mc="http://schemas.openxmlformats.org/markup-compatibility/2006" xmlns:aink="http://schemas.microsoft.com/office/drawing/2016/ink" xmlns:am3d="http://schemas.microsoft.com/office/drawing/2017/model3d" xmlns:o="urn:schemas-microsoft-com:office:office" xmlns:oel="http://schemas.microsoft.com/office/2019/extlst" xmlns:r="http://schemas.openxmlformats.org/officeDocument/2006/relationships" xmlns:m="http://schemas.openxmlformats.org/officeDocument/2006/math" xmlns:v="urn:schemas-microsoft-com:vml" xmlns:wp14="http://schemas.microsoft.com/office/word/2010/wordprocessingDrawing" xmlns:wp="http://schemas.openxmlformats.org/drawingml/2006/wordprocessingDrawing" xmlns:w10="urn:schemas-microsoft-com:office:word" xmlns:w="http://schemas.openxmlformats.org/wordprocessingml/2006/main" xmlns:w14="http://schemas.microsoft.com/office/word/2010/wordml" xmlns:w15="http://schemas.microsoft.com/office/word/2012/wordml" xmlns:w16cex="http://schemas.microsoft.com/office/word/2018/wordml/cex" xmlns:w16cid="http://schemas.microsoft.com/office/word/2016/wordml/cid" xmlns:w16="http://schemas.microsoft.com/office/word/2018/wordml" xmlns:w16du="http://schemas.microsoft.com/office/word/2023/wordml/word16du" xmlns:w16sdtdh="http://schemas.microsoft.com/office/word/2020/wordml/sdtdatahash" xmlns:w16sdtfl="http://schemas.microsoft.com/office/word/2024/wordml/sdtformatlock" xmlns:w16se="http://schemas.microsoft.com/office/word/2015/wordml/symex" xmlns:wpg="http://schemas.microsoft.com/office/word/2010/wordprocessingGroup" xmlns:wpi="http://schemas.microsoft.com/office/word/2010/wordprocessingInk" xmlns:wne="http://schemas.microsoft.com/office/word/2006/wordml" xmlns:wps="http://schemas.microsoft.com/office/word/2010/wordprocessingShape" mc:Ignorable="w14 w15 w16se w16cid w16 w16cex w16sdtdh w16sdtfl w16du wp14">
+  <w:footnote w:type="separator" w:id="-1">
+    <w:p>
+      <w:pPr>
+        <w:spacing w:after="0" w:line="240" w:lineRule="auto"/>
+      </w:pPr>
+      <w:r>
+        <w:separator/>
+      </w:r>
+    </w:p>
+  </w:footnote>
+  <w:footnote w:type="continuationSeparator" w:id="0">
+    <w:p>
+      <w:pPr>
+        <w:spacing w:after="0" w:line="240" w:lineRule="auto"/>
+      </w:pPr>
+      <w:r>
+        <w:continuationSeparator/>
+      </w:r>
+    </w:p>
+  </w:footnote>
+</w:footnotes>
 </file>
 
 <file path=word/numbering.xml><?xml version="1.0" encoding="utf-8"?>
@@ -6996,17 +8795,13 @@
   <w:docDefaults>
     <w:rPrDefault>
       <w:rPr>
-        <w:rFonts w:asciiTheme="minorHAnsi" w:eastAsiaTheme="minorHAnsi" w:hAnsiTheme="minorHAnsi" w:cstheme="minorBidi"/>
-        <w:kern w:val="2"/>
-        <w:sz w:val="24"/>
-        <w:szCs w:val="24"/>
+        <w:rFonts w:asciiTheme="minorHAnsi" w:eastAsiaTheme="minorEastAsia" w:hAnsiTheme="minorHAnsi" w:cstheme="minorBidi"/>
         <w:lang w:val="en-GB" w:eastAsia="en-US" w:bidi="ar-SA"/>
-        <w14:ligatures w14:val="standardContextual"/>
       </w:rPr>
     </w:rPrDefault>
     <w:pPrDefault>
       <w:pPr>
-        <w:spacing w:after="160" w:line="278" w:lineRule="auto"/>
+        <w:spacing w:after="120" w:line="264" w:lineRule="auto"/>
       </w:pPr>
     </w:pPrDefault>
   </w:docDefaults>
@@ -7391,9 +9186,7 @@
   <w:style w:type="paragraph" w:default="1" w:styleId="Norml">
     <w:name w:val="Normal"/>
     <w:qFormat/>
-    <w:rPr>
-      <w:lang w:val="hu-HU"/>
-    </w:rPr>
+    <w:rsid w:val="00354AEA"/>
   </w:style>
   <w:style w:type="paragraph" w:styleId="Cmsor1">
     <w:name w:val="heading 1"/>
@@ -7402,18 +9195,18 @@
     <w:link w:val="Cmsor1Char"/>
     <w:uiPriority w:val="9"/>
     <w:qFormat/>
-    <w:rsid w:val="0066742C"/>
+    <w:rsid w:val="00354AEA"/>
     <w:pPr>
       <w:keepNext/>
       <w:keepLines/>
-      <w:spacing w:before="360" w:after="80"/>
+      <w:spacing w:before="320" w:after="0" w:line="240" w:lineRule="auto"/>
       <w:outlineLvl w:val="0"/>
     </w:pPr>
     <w:rPr>
       <w:rFonts w:asciiTheme="majorHAnsi" w:eastAsiaTheme="majorEastAsia" w:hAnsiTheme="majorHAnsi" w:cstheme="majorBidi"/>
       <w:color w:val="0F4761" w:themeColor="accent1" w:themeShade="BF"/>
-      <w:sz w:val="40"/>
-      <w:szCs w:val="40"/>
+      <w:sz w:val="32"/>
+      <w:szCs w:val="32"/>
     </w:rPr>
   </w:style>
   <w:style w:type="paragraph" w:styleId="Cmsor2">
@@ -7424,18 +9217,18 @@
     <w:uiPriority w:val="9"/>
     <w:unhideWhenUsed/>
     <w:qFormat/>
-    <w:rsid w:val="0066742C"/>
+    <w:rsid w:val="00354AEA"/>
     <w:pPr>
       <w:keepNext/>
       <w:keepLines/>
-      <w:spacing w:before="160" w:after="80"/>
+      <w:spacing w:before="80" w:after="0" w:line="240" w:lineRule="auto"/>
       <w:outlineLvl w:val="1"/>
     </w:pPr>
     <w:rPr>
       <w:rFonts w:asciiTheme="majorHAnsi" w:eastAsiaTheme="majorEastAsia" w:hAnsiTheme="majorHAnsi" w:cstheme="majorBidi"/>
-      <w:color w:val="0F4761" w:themeColor="accent1" w:themeShade="BF"/>
-      <w:sz w:val="32"/>
-      <w:szCs w:val="32"/>
+      <w:color w:val="404040" w:themeColor="text1" w:themeTint="BF"/>
+      <w:sz w:val="28"/>
+      <w:szCs w:val="28"/>
     </w:rPr>
   </w:style>
   <w:style w:type="paragraph" w:styleId="Cmsor3">
@@ -7447,18 +9240,18 @@
     <w:semiHidden/>
     <w:unhideWhenUsed/>
     <w:qFormat/>
-    <w:rsid w:val="0066742C"/>
+    <w:rsid w:val="00354AEA"/>
     <w:pPr>
       <w:keepNext/>
       <w:keepLines/>
-      <w:spacing w:before="160" w:after="80"/>
+      <w:spacing w:before="40" w:after="0" w:line="240" w:lineRule="auto"/>
       <w:outlineLvl w:val="2"/>
     </w:pPr>
     <w:rPr>
-      <w:rFonts w:eastAsiaTheme="majorEastAsia" w:cstheme="majorBidi"/>
-      <w:color w:val="0F4761" w:themeColor="accent1" w:themeShade="BF"/>
-      <w:sz w:val="28"/>
-      <w:szCs w:val="28"/>
+      <w:rFonts w:asciiTheme="majorHAnsi" w:eastAsiaTheme="majorEastAsia" w:hAnsiTheme="majorHAnsi" w:cstheme="majorBidi"/>
+      <w:color w:val="0E2841" w:themeColor="text2"/>
+      <w:sz w:val="24"/>
+      <w:szCs w:val="24"/>
     </w:rPr>
   </w:style>
   <w:style w:type="paragraph" w:styleId="Cmsor4">
@@ -7470,18 +9263,17 @@
     <w:semiHidden/>
     <w:unhideWhenUsed/>
     <w:qFormat/>
-    <w:rsid w:val="0066742C"/>
+    <w:rsid w:val="00354AEA"/>
     <w:pPr>
       <w:keepNext/>
       <w:keepLines/>
-      <w:spacing w:before="80" w:after="40"/>
+      <w:spacing w:before="40" w:after="0"/>
       <w:outlineLvl w:val="3"/>
     </w:pPr>
     <w:rPr>
-      <w:rFonts w:eastAsiaTheme="majorEastAsia" w:cstheme="majorBidi"/>
-      <w:i/>
-      <w:iCs/>
-      <w:color w:val="0F4761" w:themeColor="accent1" w:themeShade="BF"/>
+      <w:rFonts w:asciiTheme="majorHAnsi" w:eastAsiaTheme="majorEastAsia" w:hAnsiTheme="majorHAnsi" w:cstheme="majorBidi"/>
+      <w:sz w:val="22"/>
+      <w:szCs w:val="22"/>
     </w:rPr>
   </w:style>
   <w:style w:type="paragraph" w:styleId="Cmsor5">
@@ -7493,16 +9285,18 @@
     <w:semiHidden/>
     <w:unhideWhenUsed/>
     <w:qFormat/>
-    <w:rsid w:val="0066742C"/>
+    <w:rsid w:val="00354AEA"/>
     <w:pPr>
       <w:keepNext/>
       <w:keepLines/>
-      <w:spacing w:before="80" w:after="40"/>
+      <w:spacing w:before="40" w:after="0"/>
       <w:outlineLvl w:val="4"/>
     </w:pPr>
     <w:rPr>
-      <w:rFonts w:eastAsiaTheme="majorEastAsia" w:cstheme="majorBidi"/>
-      <w:color w:val="0F4761" w:themeColor="accent1" w:themeShade="BF"/>
+      <w:rFonts w:asciiTheme="majorHAnsi" w:eastAsiaTheme="majorEastAsia" w:hAnsiTheme="majorHAnsi" w:cstheme="majorBidi"/>
+      <w:color w:val="0E2841" w:themeColor="text2"/>
+      <w:sz w:val="22"/>
+      <w:szCs w:val="22"/>
     </w:rPr>
   </w:style>
   <w:style w:type="paragraph" w:styleId="Cmsor6">
@@ -7514,7 +9308,7 @@
     <w:semiHidden/>
     <w:unhideWhenUsed/>
     <w:qFormat/>
-    <w:rsid w:val="0066742C"/>
+    <w:rsid w:val="00354AEA"/>
     <w:pPr>
       <w:keepNext/>
       <w:keepLines/>
@@ -7522,10 +9316,12 @@
       <w:outlineLvl w:val="5"/>
     </w:pPr>
     <w:rPr>
-      <w:rFonts w:eastAsiaTheme="majorEastAsia" w:cstheme="majorBidi"/>
+      <w:rFonts w:asciiTheme="majorHAnsi" w:eastAsiaTheme="majorEastAsia" w:hAnsiTheme="majorHAnsi" w:cstheme="majorBidi"/>
       <w:i/>
       <w:iCs/>
-      <w:color w:val="595959" w:themeColor="text1" w:themeTint="A6"/>
+      <w:color w:val="0E2841" w:themeColor="text2"/>
+      <w:sz w:val="21"/>
+      <w:szCs w:val="21"/>
     </w:rPr>
   </w:style>
   <w:style w:type="paragraph" w:styleId="Cmsor7">
@@ -7537,7 +9333,7 @@
     <w:semiHidden/>
     <w:unhideWhenUsed/>
     <w:qFormat/>
-    <w:rsid w:val="0066742C"/>
+    <w:rsid w:val="00354AEA"/>
     <w:pPr>
       <w:keepNext/>
       <w:keepLines/>
@@ -7545,8 +9341,12 @@
       <w:outlineLvl w:val="6"/>
     </w:pPr>
     <w:rPr>
-      <w:rFonts w:eastAsiaTheme="majorEastAsia" w:cstheme="majorBidi"/>
-      <w:color w:val="595959" w:themeColor="text1" w:themeTint="A6"/>
+      <w:rFonts w:asciiTheme="majorHAnsi" w:eastAsiaTheme="majorEastAsia" w:hAnsiTheme="majorHAnsi" w:cstheme="majorBidi"/>
+      <w:i/>
+      <w:iCs/>
+      <w:color w:val="0A2F41" w:themeColor="accent1" w:themeShade="80"/>
+      <w:sz w:val="21"/>
+      <w:szCs w:val="21"/>
     </w:rPr>
   </w:style>
   <w:style w:type="paragraph" w:styleId="Cmsor8">
@@ -7558,18 +9358,18 @@
     <w:semiHidden/>
     <w:unhideWhenUsed/>
     <w:qFormat/>
-    <w:rsid w:val="0066742C"/>
+    <w:rsid w:val="00354AEA"/>
     <w:pPr>
       <w:keepNext/>
       <w:keepLines/>
-      <w:spacing w:after="0"/>
+      <w:spacing w:before="40" w:after="0"/>
       <w:outlineLvl w:val="7"/>
     </w:pPr>
     <w:rPr>
-      <w:rFonts w:eastAsiaTheme="majorEastAsia" w:cstheme="majorBidi"/>
-      <w:i/>
-      <w:iCs/>
-      <w:color w:val="272727" w:themeColor="text1" w:themeTint="D8"/>
+      <w:rFonts w:asciiTheme="majorHAnsi" w:eastAsiaTheme="majorEastAsia" w:hAnsiTheme="majorHAnsi" w:cstheme="majorBidi"/>
+      <w:b/>
+      <w:bCs/>
+      <w:color w:val="0E2841" w:themeColor="text2"/>
     </w:rPr>
   </w:style>
   <w:style w:type="paragraph" w:styleId="Cmsor9">
@@ -7581,16 +9381,20 @@
     <w:semiHidden/>
     <w:unhideWhenUsed/>
     <w:qFormat/>
-    <w:rsid w:val="0066742C"/>
+    <w:rsid w:val="00354AEA"/>
     <w:pPr>
       <w:keepNext/>
       <w:keepLines/>
-      <w:spacing w:after="0"/>
+      <w:spacing w:before="40" w:after="0"/>
       <w:outlineLvl w:val="8"/>
     </w:pPr>
     <w:rPr>
-      <w:rFonts w:eastAsiaTheme="majorEastAsia" w:cstheme="majorBidi"/>
-      <w:color w:val="272727" w:themeColor="text1" w:themeTint="D8"/>
+      <w:rFonts w:asciiTheme="majorHAnsi" w:eastAsiaTheme="majorEastAsia" w:hAnsiTheme="majorHAnsi" w:cstheme="majorBidi"/>
+      <w:b/>
+      <w:bCs/>
+      <w:i/>
+      <w:iCs/>
+      <w:color w:val="0E2841" w:themeColor="text2"/>
     </w:rPr>
   </w:style>
   <w:style w:type="character" w:default="1" w:styleId="Bekezdsalapbettpusa">
@@ -7625,12 +9429,12 @@
     <w:basedOn w:val="Bekezdsalapbettpusa"/>
     <w:link w:val="Cmsor1"/>
     <w:uiPriority w:val="9"/>
-    <w:rsid w:val="0066742C"/>
+    <w:rsid w:val="00354AEA"/>
     <w:rPr>
       <w:rFonts w:asciiTheme="majorHAnsi" w:eastAsiaTheme="majorEastAsia" w:hAnsiTheme="majorHAnsi" w:cstheme="majorBidi"/>
       <w:color w:val="0F4761" w:themeColor="accent1" w:themeShade="BF"/>
-      <w:sz w:val="40"/>
-      <w:szCs w:val="40"/>
+      <w:sz w:val="32"/>
+      <w:szCs w:val="32"/>
     </w:rPr>
   </w:style>
   <w:style w:type="character" w:customStyle="1" w:styleId="Cmsor2Char">
@@ -7638,12 +9442,12 @@
     <w:basedOn w:val="Bekezdsalapbettpusa"/>
     <w:link w:val="Cmsor2"/>
     <w:uiPriority w:val="9"/>
-    <w:rsid w:val="0066742C"/>
+    <w:rsid w:val="00354AEA"/>
     <w:rPr>
       <w:rFonts w:asciiTheme="majorHAnsi" w:eastAsiaTheme="majorEastAsia" w:hAnsiTheme="majorHAnsi" w:cstheme="majorBidi"/>
-      <w:color w:val="0F4761" w:themeColor="accent1" w:themeShade="BF"/>
-      <w:sz w:val="32"/>
-      <w:szCs w:val="32"/>
+      <w:color w:val="404040" w:themeColor="text1" w:themeTint="BF"/>
+      <w:sz w:val="28"/>
+      <w:szCs w:val="28"/>
     </w:rPr>
   </w:style>
   <w:style w:type="character" w:customStyle="1" w:styleId="Cmsor3Char">
@@ -7652,12 +9456,12 @@
     <w:link w:val="Cmsor3"/>
     <w:uiPriority w:val="9"/>
     <w:semiHidden/>
-    <w:rsid w:val="0066742C"/>
+    <w:rsid w:val="00354AEA"/>
     <w:rPr>
-      <w:rFonts w:eastAsiaTheme="majorEastAsia" w:cstheme="majorBidi"/>
-      <w:color w:val="0F4761" w:themeColor="accent1" w:themeShade="BF"/>
-      <w:sz w:val="28"/>
-      <w:szCs w:val="28"/>
+      <w:rFonts w:asciiTheme="majorHAnsi" w:eastAsiaTheme="majorEastAsia" w:hAnsiTheme="majorHAnsi" w:cstheme="majorBidi"/>
+      <w:color w:val="0E2841" w:themeColor="text2"/>
+      <w:sz w:val="24"/>
+      <w:szCs w:val="24"/>
     </w:rPr>
   </w:style>
   <w:style w:type="character" w:customStyle="1" w:styleId="Cmsor4Char">
@@ -7666,12 +9470,11 @@
     <w:link w:val="Cmsor4"/>
     <w:uiPriority w:val="9"/>
     <w:semiHidden/>
-    <w:rsid w:val="0066742C"/>
+    <w:rsid w:val="00354AEA"/>
     <w:rPr>
-      <w:rFonts w:eastAsiaTheme="majorEastAsia" w:cstheme="majorBidi"/>
-      <w:i/>
-      <w:iCs/>
-      <w:color w:val="0F4761" w:themeColor="accent1" w:themeShade="BF"/>
+      <w:rFonts w:asciiTheme="majorHAnsi" w:eastAsiaTheme="majorEastAsia" w:hAnsiTheme="majorHAnsi" w:cstheme="majorBidi"/>
+      <w:sz w:val="22"/>
+      <w:szCs w:val="22"/>
     </w:rPr>
   </w:style>
   <w:style w:type="character" w:customStyle="1" w:styleId="Cmsor5Char">
@@ -7680,10 +9483,12 @@
     <w:link w:val="Cmsor5"/>
     <w:uiPriority w:val="9"/>
     <w:semiHidden/>
-    <w:rsid w:val="0066742C"/>
+    <w:rsid w:val="00354AEA"/>
     <w:rPr>
-      <w:rFonts w:eastAsiaTheme="majorEastAsia" w:cstheme="majorBidi"/>
-      <w:color w:val="0F4761" w:themeColor="accent1" w:themeShade="BF"/>
+      <w:rFonts w:asciiTheme="majorHAnsi" w:eastAsiaTheme="majorEastAsia" w:hAnsiTheme="majorHAnsi" w:cstheme="majorBidi"/>
+      <w:color w:val="0E2841" w:themeColor="text2"/>
+      <w:sz w:val="22"/>
+      <w:szCs w:val="22"/>
     </w:rPr>
   </w:style>
   <w:style w:type="character" w:customStyle="1" w:styleId="Cmsor6Char">
@@ -7692,12 +9497,14 @@
     <w:link w:val="Cmsor6"/>
     <w:uiPriority w:val="9"/>
     <w:semiHidden/>
-    <w:rsid w:val="0066742C"/>
+    <w:rsid w:val="00354AEA"/>
     <w:rPr>
-      <w:rFonts w:eastAsiaTheme="majorEastAsia" w:cstheme="majorBidi"/>
+      <w:rFonts w:asciiTheme="majorHAnsi" w:eastAsiaTheme="majorEastAsia" w:hAnsiTheme="majorHAnsi" w:cstheme="majorBidi"/>
       <w:i/>
       <w:iCs/>
-      <w:color w:val="595959" w:themeColor="text1" w:themeTint="A6"/>
+      <w:color w:val="0E2841" w:themeColor="text2"/>
+      <w:sz w:val="21"/>
+      <w:szCs w:val="21"/>
     </w:rPr>
   </w:style>
   <w:style w:type="character" w:customStyle="1" w:styleId="Cmsor7Char">
@@ -7706,10 +9513,14 @@
     <w:link w:val="Cmsor7"/>
     <w:uiPriority w:val="9"/>
     <w:semiHidden/>
-    <w:rsid w:val="0066742C"/>
+    <w:rsid w:val="00354AEA"/>
     <w:rPr>
-      <w:rFonts w:eastAsiaTheme="majorEastAsia" w:cstheme="majorBidi"/>
-      <w:color w:val="595959" w:themeColor="text1" w:themeTint="A6"/>
+      <w:rFonts w:asciiTheme="majorHAnsi" w:eastAsiaTheme="majorEastAsia" w:hAnsiTheme="majorHAnsi" w:cstheme="majorBidi"/>
+      <w:i/>
+      <w:iCs/>
+      <w:color w:val="0A2F41" w:themeColor="accent1" w:themeShade="80"/>
+      <w:sz w:val="21"/>
+      <w:szCs w:val="21"/>
     </w:rPr>
   </w:style>
   <w:style w:type="character" w:customStyle="1" w:styleId="Cmsor8Char">
@@ -7718,12 +9529,12 @@
     <w:link w:val="Cmsor8"/>
     <w:uiPriority w:val="9"/>
     <w:semiHidden/>
-    <w:rsid w:val="0066742C"/>
+    <w:rsid w:val="00354AEA"/>
     <w:rPr>
-      <w:rFonts w:eastAsiaTheme="majorEastAsia" w:cstheme="majorBidi"/>
-      <w:i/>
-      <w:iCs/>
-      <w:color w:val="272727" w:themeColor="text1" w:themeTint="D8"/>
+      <w:rFonts w:asciiTheme="majorHAnsi" w:eastAsiaTheme="majorEastAsia" w:hAnsiTheme="majorHAnsi" w:cstheme="majorBidi"/>
+      <w:b/>
+      <w:bCs/>
+      <w:color w:val="0E2841" w:themeColor="text2"/>
     </w:rPr>
   </w:style>
   <w:style w:type="character" w:customStyle="1" w:styleId="Cmsor9Char">
@@ -7732,10 +9543,14 @@
     <w:link w:val="Cmsor9"/>
     <w:uiPriority w:val="9"/>
     <w:semiHidden/>
-    <w:rsid w:val="0066742C"/>
+    <w:rsid w:val="00354AEA"/>
     <w:rPr>
-      <w:rFonts w:eastAsiaTheme="majorEastAsia" w:cstheme="majorBidi"/>
-      <w:color w:val="272727" w:themeColor="text1" w:themeTint="D8"/>
+      <w:rFonts w:asciiTheme="majorHAnsi" w:eastAsiaTheme="majorEastAsia" w:hAnsiTheme="majorHAnsi" w:cstheme="majorBidi"/>
+      <w:b/>
+      <w:bCs/>
+      <w:i/>
+      <w:iCs/>
+      <w:color w:val="0E2841" w:themeColor="text2"/>
     </w:rPr>
   </w:style>
   <w:style w:type="paragraph" w:styleId="Cm">
@@ -7745,15 +9560,15 @@
     <w:link w:val="CmChar"/>
     <w:uiPriority w:val="10"/>
     <w:qFormat/>
-    <w:rsid w:val="0066742C"/>
+    <w:rsid w:val="00354AEA"/>
     <w:pPr>
-      <w:spacing w:after="80" w:line="240" w:lineRule="auto"/>
+      <w:spacing w:after="0" w:line="240" w:lineRule="auto"/>
       <w:contextualSpacing/>
     </w:pPr>
     <w:rPr>
       <w:rFonts w:asciiTheme="majorHAnsi" w:eastAsiaTheme="majorEastAsia" w:hAnsiTheme="majorHAnsi" w:cstheme="majorBidi"/>
+      <w:color w:val="156082" w:themeColor="accent1"/>
       <w:spacing w:val="-10"/>
-      <w:kern w:val="28"/>
       <w:sz w:val="56"/>
       <w:szCs w:val="56"/>
     </w:rPr>
@@ -7763,11 +9578,11 @@
     <w:basedOn w:val="Bekezdsalapbettpusa"/>
     <w:link w:val="Cm"/>
     <w:uiPriority w:val="10"/>
-    <w:rsid w:val="0066742C"/>
+    <w:rsid w:val="00354AEA"/>
     <w:rPr>
       <w:rFonts w:asciiTheme="majorHAnsi" w:eastAsiaTheme="majorEastAsia" w:hAnsiTheme="majorHAnsi" w:cstheme="majorBidi"/>
+      <w:color w:val="156082" w:themeColor="accent1"/>
       <w:spacing w:val="-10"/>
-      <w:kern w:val="28"/>
       <w:sz w:val="56"/>
       <w:szCs w:val="56"/>
     </w:rPr>
@@ -7779,18 +9594,17 @@
     <w:link w:val="AlcmChar"/>
     <w:uiPriority w:val="11"/>
     <w:qFormat/>
-    <w:rsid w:val="0066742C"/>
+    <w:rsid w:val="00354AEA"/>
     <w:pPr>
       <w:numPr>
         <w:ilvl w:val="1"/>
       </w:numPr>
+      <w:spacing w:line="240" w:lineRule="auto"/>
     </w:pPr>
     <w:rPr>
-      <w:rFonts w:eastAsiaTheme="majorEastAsia" w:cstheme="majorBidi"/>
-      <w:color w:val="595959" w:themeColor="text1" w:themeTint="A6"/>
-      <w:spacing w:val="15"/>
-      <w:sz w:val="28"/>
-      <w:szCs w:val="28"/>
+      <w:rFonts w:asciiTheme="majorHAnsi" w:eastAsiaTheme="majorEastAsia" w:hAnsiTheme="majorHAnsi" w:cstheme="majorBidi"/>
+      <w:sz w:val="24"/>
+      <w:szCs w:val="24"/>
     </w:rPr>
   </w:style>
   <w:style w:type="character" w:customStyle="1" w:styleId="AlcmChar">
@@ -7798,13 +9612,11 @@
     <w:basedOn w:val="Bekezdsalapbettpusa"/>
     <w:link w:val="Alcm"/>
     <w:uiPriority w:val="11"/>
-    <w:rsid w:val="0066742C"/>
+    <w:rsid w:val="00354AEA"/>
     <w:rPr>
-      <w:rFonts w:eastAsiaTheme="majorEastAsia" w:cstheme="majorBidi"/>
-      <w:color w:val="595959" w:themeColor="text1" w:themeTint="A6"/>
-      <w:spacing w:val="15"/>
-      <w:sz w:val="28"/>
-      <w:szCs w:val="28"/>
+      <w:rFonts w:asciiTheme="majorHAnsi" w:eastAsiaTheme="majorEastAsia" w:hAnsiTheme="majorHAnsi" w:cstheme="majorBidi"/>
+      <w:sz w:val="24"/>
+      <w:szCs w:val="24"/>
     </w:rPr>
   </w:style>
   <w:style w:type="paragraph" w:styleId="Idzet">
@@ -7814,10 +9626,10 @@
     <w:link w:val="IdzetChar"/>
     <w:uiPriority w:val="29"/>
     <w:qFormat/>
-    <w:rsid w:val="0066742C"/>
+    <w:rsid w:val="00354AEA"/>
     <w:pPr>
       <w:spacing w:before="160"/>
-      <w:jc w:val="center"/>
+      <w:ind w:left="720" w:right="720"/>
     </w:pPr>
     <w:rPr>
       <w:i/>
@@ -7830,7 +9642,7 @@
     <w:basedOn w:val="Bekezdsalapbettpusa"/>
     <w:link w:val="Idzet"/>
     <w:uiPriority w:val="29"/>
-    <w:rsid w:val="0066742C"/>
+    <w:rsid w:val="00354AEA"/>
     <w:rPr>
       <w:i/>
       <w:iCs/>
@@ -7853,11 +9665,12 @@
     <w:basedOn w:val="Bekezdsalapbettpusa"/>
     <w:uiPriority w:val="21"/>
     <w:qFormat/>
-    <w:rsid w:val="0066742C"/>
+    <w:rsid w:val="00354AEA"/>
     <w:rPr>
+      <w:b/>
+      <w:bCs/>
       <w:i/>
       <w:iCs/>
-      <w:color w:val="0F4761" w:themeColor="accent1" w:themeShade="BF"/>
     </w:rPr>
   </w:style>
   <w:style w:type="paragraph" w:styleId="Kiemeltidzet">
@@ -7867,20 +9680,19 @@
     <w:link w:val="KiemeltidzetChar"/>
     <w:uiPriority w:val="30"/>
     <w:qFormat/>
-    <w:rsid w:val="0066742C"/>
+    <w:rsid w:val="00354AEA"/>
     <w:pPr>
       <w:pBdr>
-        <w:top w:val="single" w:sz="4" w:space="10" w:color="0F4761" w:themeColor="accent1" w:themeShade="BF"/>
-        <w:bottom w:val="single" w:sz="4" w:space="10" w:color="0F4761" w:themeColor="accent1" w:themeShade="BF"/>
+        <w:left w:val="single" w:sz="18" w:space="12" w:color="156082" w:themeColor="accent1"/>
       </w:pBdr>
-      <w:spacing w:before="360" w:after="360"/>
-      <w:ind w:left="864" w:right="864"/>
-      <w:jc w:val="center"/>
+      <w:spacing w:before="100" w:beforeAutospacing="1" w:line="300" w:lineRule="auto"/>
+      <w:ind w:left="1224" w:right="1224"/>
     </w:pPr>
     <w:rPr>
-      <w:i/>
-      <w:iCs/>
-      <w:color w:val="0F4761" w:themeColor="accent1" w:themeShade="BF"/>
+      <w:rFonts w:asciiTheme="majorHAnsi" w:eastAsiaTheme="majorEastAsia" w:hAnsiTheme="majorHAnsi" w:cstheme="majorBidi"/>
+      <w:color w:val="156082" w:themeColor="accent1"/>
+      <w:sz w:val="28"/>
+      <w:szCs w:val="28"/>
     </w:rPr>
   </w:style>
   <w:style w:type="character" w:customStyle="1" w:styleId="KiemeltidzetChar">
@@ -7888,11 +9700,12 @@
     <w:basedOn w:val="Bekezdsalapbettpusa"/>
     <w:link w:val="Kiemeltidzet"/>
     <w:uiPriority w:val="30"/>
-    <w:rsid w:val="0066742C"/>
+    <w:rsid w:val="00354AEA"/>
     <w:rPr>
-      <w:i/>
-      <w:iCs/>
-      <w:color w:val="0F4761" w:themeColor="accent1" w:themeShade="BF"/>
+      <w:rFonts w:asciiTheme="majorHAnsi" w:eastAsiaTheme="majorEastAsia" w:hAnsiTheme="majorHAnsi" w:cstheme="majorBidi"/>
+      <w:color w:val="156082" w:themeColor="accent1"/>
+      <w:sz w:val="28"/>
+      <w:szCs w:val="28"/>
     </w:rPr>
   </w:style>
   <w:style w:type="character" w:styleId="Ershivatkozs">
@@ -7900,13 +9713,13 @@
     <w:basedOn w:val="Bekezdsalapbettpusa"/>
     <w:uiPriority w:val="32"/>
     <w:qFormat/>
-    <w:rsid w:val="0066742C"/>
+    <w:rsid w:val="00354AEA"/>
     <w:rPr>
       <w:b/>
       <w:bCs/>
       <w:smallCaps/>
-      <w:color w:val="0F4761" w:themeColor="accent1" w:themeShade="BF"/>
       <w:spacing w:val="5"/>
+      <w:u w:val="single"/>
     </w:rPr>
   </w:style>
   <w:style w:type="character" w:styleId="Hiperhivatkozs">
@@ -7942,6 +9755,179 @@
     <w:rPr>
       <w:color w:val="96607D" w:themeColor="followedHyperlink"/>
       <w:u w:val="single"/>
+    </w:rPr>
+  </w:style>
+  <w:style w:type="paragraph" w:styleId="Kpalrs">
+    <w:name w:val="caption"/>
+    <w:basedOn w:val="Norml"/>
+    <w:next w:val="Norml"/>
+    <w:uiPriority w:val="35"/>
+    <w:unhideWhenUsed/>
+    <w:qFormat/>
+    <w:rsid w:val="00354AEA"/>
+    <w:pPr>
+      <w:spacing w:line="240" w:lineRule="auto"/>
+    </w:pPr>
+    <w:rPr>
+      <w:b/>
+      <w:bCs/>
+      <w:smallCaps/>
+      <w:color w:val="595959" w:themeColor="text1" w:themeTint="A6"/>
+      <w:spacing w:val="6"/>
+    </w:rPr>
+  </w:style>
+  <w:style w:type="paragraph" w:styleId="lfej">
+    <w:name w:val="header"/>
+    <w:basedOn w:val="Norml"/>
+    <w:link w:val="lfejChar"/>
+    <w:uiPriority w:val="99"/>
+    <w:unhideWhenUsed/>
+    <w:rsid w:val="00EA6221"/>
+    <w:pPr>
+      <w:tabs>
+        <w:tab w:val="center" w:pos="4536"/>
+        <w:tab w:val="right" w:pos="9072"/>
+      </w:tabs>
+      <w:spacing w:after="0" w:line="240" w:lineRule="auto"/>
+    </w:pPr>
+  </w:style>
+  <w:style w:type="character" w:customStyle="1" w:styleId="lfejChar">
+    <w:name w:val="Élőfej Char"/>
+    <w:basedOn w:val="Bekezdsalapbettpusa"/>
+    <w:link w:val="lfej"/>
+    <w:uiPriority w:val="99"/>
+    <w:rsid w:val="00EA6221"/>
+    <w:rPr>
+      <w:lang w:val="hu-HU"/>
+    </w:rPr>
+  </w:style>
+  <w:style w:type="paragraph" w:styleId="llb">
+    <w:name w:val="footer"/>
+    <w:basedOn w:val="Norml"/>
+    <w:link w:val="llbChar"/>
+    <w:uiPriority w:val="99"/>
+    <w:unhideWhenUsed/>
+    <w:rsid w:val="00EA6221"/>
+    <w:pPr>
+      <w:tabs>
+        <w:tab w:val="center" w:pos="4536"/>
+        <w:tab w:val="right" w:pos="9072"/>
+      </w:tabs>
+      <w:spacing w:after="0" w:line="240" w:lineRule="auto"/>
+    </w:pPr>
+  </w:style>
+  <w:style w:type="character" w:customStyle="1" w:styleId="llbChar">
+    <w:name w:val="Élőláb Char"/>
+    <w:basedOn w:val="Bekezdsalapbettpusa"/>
+    <w:link w:val="llb"/>
+    <w:uiPriority w:val="99"/>
+    <w:rsid w:val="00EA6221"/>
+    <w:rPr>
+      <w:lang w:val="hu-HU"/>
+    </w:rPr>
+  </w:style>
+  <w:style w:type="paragraph" w:styleId="Tartalomjegyzkcmsora">
+    <w:name w:val="TOC Heading"/>
+    <w:basedOn w:val="Cmsor1"/>
+    <w:next w:val="Norml"/>
+    <w:uiPriority w:val="39"/>
+    <w:unhideWhenUsed/>
+    <w:qFormat/>
+    <w:rsid w:val="00354AEA"/>
+    <w:pPr>
+      <w:outlineLvl w:val="9"/>
+    </w:pPr>
+  </w:style>
+  <w:style w:type="paragraph" w:styleId="TJ1">
+    <w:name w:val="toc 1"/>
+    <w:basedOn w:val="Norml"/>
+    <w:next w:val="Norml"/>
+    <w:autoRedefine/>
+    <w:uiPriority w:val="39"/>
+    <w:unhideWhenUsed/>
+    <w:rsid w:val="00EA6221"/>
+    <w:pPr>
+      <w:spacing w:after="100"/>
+    </w:pPr>
+  </w:style>
+  <w:style w:type="paragraph" w:styleId="TJ2">
+    <w:name w:val="toc 2"/>
+    <w:basedOn w:val="Norml"/>
+    <w:next w:val="Norml"/>
+    <w:autoRedefine/>
+    <w:uiPriority w:val="39"/>
+    <w:unhideWhenUsed/>
+    <w:rsid w:val="00EA6221"/>
+    <w:pPr>
+      <w:spacing w:after="100"/>
+      <w:ind w:left="240"/>
+    </w:pPr>
+  </w:style>
+  <w:style w:type="character" w:styleId="Kiemels2">
+    <w:name w:val="Strong"/>
+    <w:basedOn w:val="Bekezdsalapbettpusa"/>
+    <w:uiPriority w:val="22"/>
+    <w:qFormat/>
+    <w:rsid w:val="00354AEA"/>
+    <w:rPr>
+      <w:b/>
+      <w:bCs/>
+    </w:rPr>
+  </w:style>
+  <w:style w:type="character" w:styleId="Kiemels">
+    <w:name w:val="Emphasis"/>
+    <w:basedOn w:val="Bekezdsalapbettpusa"/>
+    <w:uiPriority w:val="20"/>
+    <w:qFormat/>
+    <w:rsid w:val="00354AEA"/>
+    <w:rPr>
+      <w:i/>
+      <w:iCs/>
+    </w:rPr>
+  </w:style>
+  <w:style w:type="paragraph" w:styleId="Nincstrkz">
+    <w:name w:val="No Spacing"/>
+    <w:uiPriority w:val="1"/>
+    <w:qFormat/>
+    <w:rsid w:val="00354AEA"/>
+    <w:pPr>
+      <w:spacing w:after="0" w:line="240" w:lineRule="auto"/>
+    </w:pPr>
+  </w:style>
+  <w:style w:type="character" w:styleId="Finomkiemels">
+    <w:name w:val="Subtle Emphasis"/>
+    <w:basedOn w:val="Bekezdsalapbettpusa"/>
+    <w:uiPriority w:val="19"/>
+    <w:qFormat/>
+    <w:rsid w:val="00354AEA"/>
+    <w:rPr>
+      <w:i/>
+      <w:iCs/>
+      <w:color w:val="404040" w:themeColor="text1" w:themeTint="BF"/>
+    </w:rPr>
+  </w:style>
+  <w:style w:type="character" w:styleId="Finomhivatkozs">
+    <w:name w:val="Subtle Reference"/>
+    <w:basedOn w:val="Bekezdsalapbettpusa"/>
+    <w:uiPriority w:val="31"/>
+    <w:qFormat/>
+    <w:rsid w:val="00354AEA"/>
+    <w:rPr>
+      <w:smallCaps/>
+      <w:color w:val="404040" w:themeColor="text1" w:themeTint="BF"/>
+      <w:u w:val="single" w:color="7F7F7F" w:themeColor="text1" w:themeTint="80"/>
+    </w:rPr>
+  </w:style>
+  <w:style w:type="character" w:styleId="Knyvcme">
+    <w:name w:val="Book Title"/>
+    <w:basedOn w:val="Bekezdsalapbettpusa"/>
+    <w:uiPriority w:val="33"/>
+    <w:qFormat/>
+    <w:rsid w:val="00354AEA"/>
+    <w:rPr>
+      <w:b/>
+      <w:bCs/>
+      <w:smallCaps/>
     </w:rPr>
   </w:style>
 </w:styles>

</xml_diff>

<commit_message>
add pitch video link to project documentation
</commit_message>
<xml_diff>
--- a/docs/NotesApp Beadandó dokumentáció.docx
+++ b/docs/NotesApp Beadandó dokumentáció.docx
@@ -73,37 +73,53 @@
       <w:bookmarkStart w:id="0" w:name="_Toc228094592"/>
       <w:r>
         <w:lastRenderedPageBreak/>
-        <w:t>1) Projekt c</w:t>
+        <w:t xml:space="preserve">1) Projekt </w:t>
+      </w:r>
+      <w:proofErr w:type="spellStart"/>
+      <w:r>
+        <w:t>c</w:t>
       </w:r>
       <w:r>
         <w:t>é</w:t>
       </w:r>
       <w:r>
-        <w:t xml:space="preserve">l </w:t>
-      </w:r>
+        <w:t>l</w:t>
+      </w:r>
+      <w:proofErr w:type="spellEnd"/>
+      <w:r>
+        <w:t xml:space="preserve"> </w:t>
+      </w:r>
+      <w:proofErr w:type="spellStart"/>
       <w:r>
         <w:t>é</w:t>
       </w:r>
       <w:r>
-        <w:t xml:space="preserve">s </w:t>
-      </w:r>
-      <w:proofErr w:type="spellStart"/>
-      <w:r>
-        <w:t>scope</w:t>
+        <w:t>s</w:t>
+      </w:r>
+      <w:proofErr w:type="spellEnd"/>
+      <w:r>
+        <w:t xml:space="preserve"> scope</w:t>
       </w:r>
       <w:bookmarkEnd w:id="0"/>
-      <w:proofErr w:type="spellEnd"/>
-    </w:p>
-    <w:p>
-      <w:r>
-        <w:t xml:space="preserve">A projektfeladatomnak a 8-as feladatot választottam. </w:t>
-      </w:r>
-      <w:r>
-        <w:t xml:space="preserve">Ez a projekt egy </w:t>
-      </w:r>
-      <w:proofErr w:type="spellStart"/>
-      <w:r>
-        <w:t>private</w:t>
+    </w:p>
+    <w:p>
+      <w:r>
+        <w:t xml:space="preserve">A projektfeladatomnak </w:t>
+      </w:r>
+      <w:proofErr w:type="gramStart"/>
+      <w:r>
+        <w:t>a</w:t>
+      </w:r>
+      <w:proofErr w:type="gramEnd"/>
+      <w:r>
+        <w:t xml:space="preserve"> 8-as feladatot választottam. </w:t>
+      </w:r>
+      <w:r>
+        <w:t xml:space="preserve">Ez a </w:t>
+      </w:r>
+      <w:proofErr w:type="spellStart"/>
+      <w:r>
+        <w:t>projekt</w:t>
       </w:r>
       <w:proofErr w:type="spellEnd"/>
       <w:r>
@@ -111,15 +127,23 @@
       </w:r>
       <w:proofErr w:type="spellStart"/>
       <w:r>
-        <w:t>notes</w:t>
-      </w:r>
-      <w:proofErr w:type="spellEnd"/>
-      <w:r>
-        <w:t xml:space="preserve"> webapp, ahol </w:t>
-      </w:r>
-      <w:proofErr w:type="spellStart"/>
-      <w:r>
-        <w:t>user</w:t>
+        <w:t>egy</w:t>
+      </w:r>
+      <w:proofErr w:type="spellEnd"/>
+      <w:r>
+        <w:t xml:space="preserve"> private notes webapp, </w:t>
+      </w:r>
+      <w:proofErr w:type="spellStart"/>
+      <w:r>
+        <w:t>ahol</w:t>
+      </w:r>
+      <w:proofErr w:type="spellEnd"/>
+      <w:r>
+        <w:t xml:space="preserve"> user authentication </w:t>
+      </w:r>
+      <w:proofErr w:type="spellStart"/>
+      <w:r>
+        <w:t>után</w:t>
       </w:r>
       <w:proofErr w:type="spellEnd"/>
       <w:r>
@@ -127,60 +151,72 @@
       </w:r>
       <w:proofErr w:type="spellStart"/>
       <w:r>
-        <w:t>authentication</w:t>
+        <w:t>saját</w:t>
+      </w:r>
+      <w:proofErr w:type="spellEnd"/>
+      <w:r>
+        <w:t xml:space="preserve"> jegyzeteket lehet </w:t>
+      </w:r>
+      <w:r>
+        <w:t>létrehozni</w:t>
+      </w:r>
+      <w:r>
+        <w:t xml:space="preserve">, </w:t>
+      </w:r>
+      <w:r>
+        <w:t>listázni</w:t>
+      </w:r>
+      <w:r>
+        <w:t xml:space="preserve">, </w:t>
+      </w:r>
+      <w:r>
+        <w:t>módosítani</w:t>
+      </w:r>
+      <w:r>
+        <w:t xml:space="preserve"> es t</w:t>
+      </w:r>
+      <w:r>
+        <w:t>örölni</w:t>
+      </w:r>
+      <w:r>
+        <w:t>.</w:t>
+      </w:r>
+    </w:p>
+    <w:p>
+      <w:r>
+        <w:t xml:space="preserve">A project </w:t>
+      </w:r>
+      <w:proofErr w:type="spellStart"/>
+      <w:r>
+        <w:t>github</w:t>
+      </w:r>
+      <w:proofErr w:type="spellEnd"/>
+      <w:r>
+        <w:t xml:space="preserve">-on </w:t>
+      </w:r>
+      <w:proofErr w:type="spellStart"/>
+      <w:r>
+        <w:t>megtalálható</w:t>
+      </w:r>
+      <w:proofErr w:type="spellEnd"/>
+      <w:r>
+        <w:t xml:space="preserve"> a </w:t>
+      </w:r>
+      <w:proofErr w:type="spellStart"/>
+      <w:r>
+        <w:t>következő</w:t>
       </w:r>
       <w:proofErr w:type="spellEnd"/>
       <w:r>
         <w:t xml:space="preserve"> </w:t>
       </w:r>
-      <w:r>
-        <w:t>után</w:t>
-      </w:r>
+      <w:proofErr w:type="spellStart"/>
+      <w:r>
+        <w:t>publikus</w:t>
+      </w:r>
+      <w:proofErr w:type="spellEnd"/>
       <w:r>
         <w:t xml:space="preserve"> </w:t>
-      </w:r>
-      <w:r>
-        <w:t>saját</w:t>
-      </w:r>
-      <w:r>
-        <w:t xml:space="preserve"> jegyzeteket lehet </w:t>
-      </w:r>
-      <w:r>
-        <w:t>létrehozni</w:t>
-      </w:r>
-      <w:r>
-        <w:t xml:space="preserve">, </w:t>
-      </w:r>
-      <w:r>
-        <w:t>listázni</w:t>
-      </w:r>
-      <w:r>
-        <w:t xml:space="preserve">, </w:t>
-      </w:r>
-      <w:r>
-        <w:t>módosítani</w:t>
-      </w:r>
-      <w:r>
-        <w:t xml:space="preserve"> es t</w:t>
-      </w:r>
-      <w:r>
-        <w:t>örölni</w:t>
-      </w:r>
-      <w:r>
-        <w:t>.</w:t>
-      </w:r>
-    </w:p>
-    <w:p>
-      <w:r>
-        <w:t xml:space="preserve">A project </w:t>
-      </w:r>
-      <w:proofErr w:type="spellStart"/>
-      <w:r>
-        <w:t>github-on</w:t>
-      </w:r>
-      <w:proofErr w:type="spellEnd"/>
-      <w:r>
-        <w:t xml:space="preserve"> megtalálható a következő publikus </w:t>
       </w:r>
       <w:proofErr w:type="spellStart"/>
       <w:r>
@@ -200,6 +236,59 @@
       </w:hyperlink>
     </w:p>
     <w:p>
+      <w:r>
+        <w:t xml:space="preserve">A pitch video </w:t>
+      </w:r>
+      <w:proofErr w:type="spellStart"/>
+      <w:r>
+        <w:t>elérhető</w:t>
+      </w:r>
+      <w:proofErr w:type="spellEnd"/>
+      <w:r>
+        <w:t xml:space="preserve"> </w:t>
+      </w:r>
+      <w:proofErr w:type="spellStart"/>
+      <w:r>
+        <w:t>az</w:t>
+      </w:r>
+      <w:proofErr w:type="spellEnd"/>
+      <w:r>
+        <w:t xml:space="preserve"> </w:t>
+      </w:r>
+      <w:proofErr w:type="spellStart"/>
+      <w:r>
+        <w:t>alábbi</w:t>
+      </w:r>
+      <w:proofErr w:type="spellEnd"/>
+      <w:r>
+        <w:t xml:space="preserve"> </w:t>
+      </w:r>
+      <w:proofErr w:type="spellStart"/>
+      <w:r>
+        <w:t>linken</w:t>
+      </w:r>
+      <w:proofErr w:type="spellEnd"/>
+      <w:r>
+        <w:t>:</w:t>
+      </w:r>
+    </w:p>
+    <w:p>
+      <w:pPr>
+        <w:rPr>
+          <w:b/>
+          <w:bCs/>
+        </w:rPr>
+      </w:pPr>
+      <w:hyperlink r:id="rId9" w:history="1">
+        <w:r>
+          <w:rPr>
+            <w:rStyle w:val="Hiperhivatkozs"/>
+          </w:rPr>
+          <w:t>https://www.youtube.com/watch?v=4scTR9ucW-o</w:t>
+        </w:r>
+      </w:hyperlink>
+    </w:p>
+    <w:p>
       <w:pPr>
         <w:pStyle w:val="Cmsor2"/>
       </w:pPr>
@@ -226,36 +315,25 @@
           <w:numId w:val="13"/>
         </w:numPr>
       </w:pPr>
-      <w:proofErr w:type="spellStart"/>
-      <w:r>
-        <w:t>user</w:t>
-      </w:r>
-      <w:proofErr w:type="spellEnd"/>
-      <w:r>
-        <w:t xml:space="preserve"> </w:t>
-      </w:r>
-      <w:proofErr w:type="spellStart"/>
-      <w:r>
-        <w:t>registration</w:t>
-      </w:r>
-      <w:proofErr w:type="spellEnd"/>
-      <w:r>
-        <w:t xml:space="preserve"> </w:t>
-      </w:r>
+      <w:r>
+        <w:t xml:space="preserve">user registration </w:t>
+      </w:r>
+      <w:proofErr w:type="spellStart"/>
       <w:r>
         <w:t>é</w:t>
       </w:r>
       <w:r>
-        <w:t xml:space="preserve">s login JWT </w:t>
-      </w:r>
-      <w:proofErr w:type="spellStart"/>
-      <w:r>
-        <w:t>token</w:t>
-      </w:r>
-      <w:proofErr w:type="spellEnd"/>
-      <w:r>
-        <w:t xml:space="preserve"> alapon</w:t>
-      </w:r>
+        <w:t>s</w:t>
+      </w:r>
+      <w:proofErr w:type="spellEnd"/>
+      <w:r>
+        <w:t xml:space="preserve"> login JWT token </w:t>
+      </w:r>
+      <w:proofErr w:type="spellStart"/>
+      <w:r>
+        <w:t>alapon</w:t>
+      </w:r>
+      <w:proofErr w:type="spellEnd"/>
     </w:p>
     <w:p>
       <w:pPr>
@@ -265,21 +343,8 @@
           <w:numId w:val="13"/>
         </w:numPr>
       </w:pPr>
-      <w:proofErr w:type="spellStart"/>
-      <w:r>
-        <w:t>protected</w:t>
-      </w:r>
-      <w:proofErr w:type="spellEnd"/>
-      <w:r>
-        <w:t xml:space="preserve"> </w:t>
-      </w:r>
-      <w:proofErr w:type="spellStart"/>
-      <w:r>
-        <w:t>Notes</w:t>
-      </w:r>
-      <w:proofErr w:type="spellEnd"/>
-      <w:r>
-        <w:t xml:space="preserve"> CRUD </w:t>
+      <w:r>
+        <w:t xml:space="preserve">protected Notes CRUD </w:t>
       </w:r>
       <w:proofErr w:type="spellStart"/>
       <w:r>
@@ -295,9 +360,36 @@
           <w:numId w:val="13"/>
         </w:numPr>
       </w:pPr>
-      <w:proofErr w:type="spellStart"/>
-      <w:r>
-        <w:t>ownership</w:t>
+      <w:r>
+        <w:t>ownership isolation (</w:t>
+      </w:r>
+      <w:proofErr w:type="spellStart"/>
+      <w:r>
+        <w:t>egy</w:t>
+      </w:r>
+      <w:proofErr w:type="spellEnd"/>
+      <w:r>
+        <w:t xml:space="preserve"> user </w:t>
+      </w:r>
+      <w:proofErr w:type="spellStart"/>
+      <w:r>
+        <w:t>csak</w:t>
+      </w:r>
+      <w:proofErr w:type="spellEnd"/>
+      <w:r>
+        <w:t xml:space="preserve"> a </w:t>
+      </w:r>
+      <w:proofErr w:type="spellStart"/>
+      <w:r>
+        <w:t>saját</w:t>
+      </w:r>
+      <w:proofErr w:type="spellEnd"/>
+      <w:r>
+        <w:t xml:space="preserve"> note-</w:t>
+      </w:r>
+      <w:proofErr w:type="spellStart"/>
+      <w:r>
+        <w:t>jait</w:t>
       </w:r>
       <w:proofErr w:type="spellEnd"/>
       <w:r>
@@ -305,39 +397,25 @@
       </w:r>
       <w:proofErr w:type="spellStart"/>
       <w:r>
-        <w:t>isolation</w:t>
-      </w:r>
-      <w:proofErr w:type="spellEnd"/>
-      <w:r>
-        <w:t xml:space="preserve"> (egy </w:t>
-      </w:r>
-      <w:proofErr w:type="spellStart"/>
-      <w:r>
-        <w:t>user</w:t>
-      </w:r>
-      <w:proofErr w:type="spellEnd"/>
-      <w:r>
-        <w:t xml:space="preserve"> csak a </w:t>
-      </w:r>
-      <w:r>
-        <w:t>saját</w:t>
-      </w:r>
-      <w:r>
-        <w:t xml:space="preserve"> </w:t>
-      </w:r>
-      <w:proofErr w:type="spellStart"/>
-      <w:r>
-        <w:t>note-jait</w:t>
-      </w:r>
-      <w:proofErr w:type="spellEnd"/>
-      <w:r>
-        <w:t xml:space="preserve"> l</w:t>
+        <w:t>l</w:t>
       </w:r>
       <w:r>
         <w:t>á</w:t>
       </w:r>
       <w:r>
-        <w:t>tja/mutathatja)</w:t>
+        <w:t>tja</w:t>
+      </w:r>
+      <w:proofErr w:type="spellEnd"/>
+      <w:r>
+        <w:t>/</w:t>
+      </w:r>
+      <w:proofErr w:type="spellStart"/>
+      <w:r>
+        <w:t>mutathatja</w:t>
+      </w:r>
+      <w:proofErr w:type="spellEnd"/>
+      <w:r>
+        <w:t>)</w:t>
       </w:r>
     </w:p>
     <w:p>
@@ -348,55 +426,32 @@
           <w:numId w:val="13"/>
         </w:numPr>
       </w:pPr>
-      <w:proofErr w:type="spellStart"/>
-      <w:r>
-        <w:t>React</w:t>
-      </w:r>
-      <w:proofErr w:type="spellEnd"/>
-      <w:r>
-        <w:t xml:space="preserve"> frontend </w:t>
-      </w:r>
+      <w:r>
+        <w:t xml:space="preserve">React frontend </w:t>
+      </w:r>
+      <w:proofErr w:type="spellStart"/>
       <w:r>
         <w:t>külön</w:t>
       </w:r>
-      <w:r>
-        <w:t xml:space="preserve"> Login </w:t>
-      </w:r>
-      <w:proofErr w:type="spellStart"/>
-      <w:r>
-        <w:t>page</w:t>
-      </w:r>
-      <w:proofErr w:type="spellEnd"/>
-      <w:r>
-        <w:t xml:space="preserve"> es </w:t>
-      </w:r>
+      <w:proofErr w:type="spellEnd"/>
+      <w:r>
+        <w:t xml:space="preserve"> Login page es </w:t>
+      </w:r>
+      <w:proofErr w:type="spellStart"/>
       <w:r>
         <w:t>külön</w:t>
       </w:r>
-      <w:r>
-        <w:t xml:space="preserve"> </w:t>
-      </w:r>
-      <w:proofErr w:type="spellStart"/>
-      <w:r>
-        <w:t>Notes</w:t>
-      </w:r>
-      <w:proofErr w:type="spellEnd"/>
-      <w:r>
-        <w:t xml:space="preserve"> </w:t>
-      </w:r>
-      <w:proofErr w:type="spellStart"/>
-      <w:r>
-        <w:t>page</w:t>
-      </w:r>
-      <w:proofErr w:type="spellEnd"/>
-      <w:r>
-        <w:t xml:space="preserve"> </w:t>
-      </w:r>
-      <w:proofErr w:type="spellStart"/>
-      <w:r>
-        <w:t>route-tal</w:t>
-      </w:r>
-      <w:proofErr w:type="spellEnd"/>
+      <w:proofErr w:type="spellEnd"/>
+      <w:r>
+        <w:t xml:space="preserve"> Notes page route-</w:t>
+      </w:r>
+      <w:proofErr w:type="spellStart"/>
+      <w:proofErr w:type="gramStart"/>
+      <w:r>
+        <w:t>tal</w:t>
+      </w:r>
+      <w:proofErr w:type="spellEnd"/>
+      <w:proofErr w:type="gramEnd"/>
     </w:p>
     <w:p>
       <w:pPr>
@@ -412,23 +467,7 @@
       </w:r>
       <w:proofErr w:type="spellEnd"/>
       <w:r>
-        <w:t xml:space="preserve"> local </w:t>
-      </w:r>
-      <w:proofErr w:type="spellStart"/>
-      <w:r>
-        <w:t>stack</w:t>
-      </w:r>
-      <w:proofErr w:type="spellEnd"/>
-      <w:r>
-        <w:t xml:space="preserve"> (</w:t>
-      </w:r>
-      <w:proofErr w:type="spellStart"/>
-      <w:r>
-        <w:t>PostgreSQL</w:t>
-      </w:r>
-      <w:proofErr w:type="spellEnd"/>
-      <w:r>
-        <w:t xml:space="preserve"> + API + Frontend)</w:t>
+        <w:t xml:space="preserve"> local stack (PostgreSQL + API + Frontend)</w:t>
       </w:r>
     </w:p>
     <w:p>
@@ -440,15 +479,15 @@
         </w:numPr>
       </w:pPr>
       <w:r>
-        <w:t xml:space="preserve">backend test </w:t>
-      </w:r>
-      <w:proofErr w:type="spellStart"/>
-      <w:r>
-        <w:t>coverage</w:t>
-      </w:r>
-      <w:proofErr w:type="spellEnd"/>
-      <w:r>
-        <w:t xml:space="preserve"> (minimum 2 test)</w:t>
+        <w:t xml:space="preserve">backend test coverage (minimum </w:t>
+      </w:r>
+      <w:proofErr w:type="gramStart"/>
+      <w:r>
+        <w:t>2</w:t>
+      </w:r>
+      <w:proofErr w:type="gramEnd"/>
+      <w:r>
+        <w:t xml:space="preserve"> test)</w:t>
       </w:r>
     </w:p>
     <w:p>
@@ -457,22 +496,9 @@
       </w:pPr>
       <w:bookmarkStart w:id="2" w:name="_Toc228094594"/>
       <w:r>
-        <w:t xml:space="preserve">2) </w:t>
-      </w:r>
-      <w:proofErr w:type="spellStart"/>
-      <w:r>
-        <w:t>Tech</w:t>
-      </w:r>
-      <w:proofErr w:type="spellEnd"/>
-      <w:r>
-        <w:t xml:space="preserve"> </w:t>
-      </w:r>
-      <w:proofErr w:type="spellStart"/>
-      <w:r>
-        <w:t>stack</w:t>
+        <w:t>2) Tech stack</w:t>
       </w:r>
       <w:bookmarkEnd w:id="2"/>
-      <w:proofErr w:type="spellEnd"/>
     </w:p>
     <w:p>
       <w:pPr>
@@ -493,13 +519,8 @@
         </w:numPr>
       </w:pPr>
       <w:r>
-        <w:t xml:space="preserve">Visual </w:t>
-      </w:r>
-      <w:proofErr w:type="spellStart"/>
-      <w:r>
-        <w:t>Studio</w:t>
-      </w:r>
-      <w:proofErr w:type="spellEnd"/>
+        <w:t>Visual Studio</w:t>
+      </w:r>
     </w:p>
     <w:p>
       <w:pPr>
@@ -510,21 +531,8 @@
         </w:numPr>
       </w:pPr>
       <w:r>
-        <w:t xml:space="preserve">Visual </w:t>
-      </w:r>
-      <w:proofErr w:type="spellStart"/>
-      <w:r>
-        <w:t>Studio</w:t>
-      </w:r>
-      <w:proofErr w:type="spellEnd"/>
-      <w:r>
-        <w:t xml:space="preserve"> </w:t>
-      </w:r>
-      <w:proofErr w:type="spellStart"/>
-      <w:r>
-        <w:t>Code</w:t>
-      </w:r>
-      <w:proofErr w:type="spellEnd"/>
+        <w:t>Visual Studio Code</w:t>
+      </w:r>
     </w:p>
     <w:p>
       <w:pPr>
@@ -535,13 +543,8 @@
         </w:numPr>
       </w:pPr>
       <w:r>
-        <w:t xml:space="preserve">Docker </w:t>
-      </w:r>
-      <w:proofErr w:type="spellStart"/>
-      <w:r>
-        <w:t>Desktop</w:t>
-      </w:r>
-      <w:proofErr w:type="spellEnd"/>
+        <w:t>Docker Desktop</w:t>
+      </w:r>
     </w:p>
     <w:p>
       <w:pPr>
@@ -551,17 +554,14 @@
           <w:numId w:val="1"/>
         </w:numPr>
       </w:pPr>
-      <w:proofErr w:type="spellStart"/>
-      <w:r>
-        <w:t>Git</w:t>
-      </w:r>
-      <w:proofErr w:type="spellEnd"/>
-      <w:r>
-        <w:t xml:space="preserve"> </w:t>
-      </w:r>
+      <w:r>
+        <w:t xml:space="preserve">Git </w:t>
+      </w:r>
+      <w:proofErr w:type="spellStart"/>
       <w:r>
         <w:t>és</w:t>
       </w:r>
+      <w:proofErr w:type="spellEnd"/>
       <w:r>
         <w:t xml:space="preserve"> GitHub</w:t>
       </w:r>
@@ -580,13 +580,8 @@
       </w:r>
       <w:proofErr w:type="spellEnd"/>
       <w:r>
-        <w:t xml:space="preserve"> </w:t>
-      </w:r>
-      <w:proofErr w:type="spellStart"/>
-      <w:r>
-        <w:t>Copilot</w:t>
-      </w:r>
-      <w:proofErr w:type="spellEnd"/>
+        <w:t xml:space="preserve"> Copilot</w:t>
+      </w:r>
     </w:p>
     <w:p>
       <w:pPr>
@@ -607,15 +602,7 @@
         </w:numPr>
       </w:pPr>
       <w:r>
-        <w:t xml:space="preserve">ASP.NET </w:t>
-      </w:r>
-      <w:proofErr w:type="spellStart"/>
-      <w:r>
-        <w:t>Core</w:t>
-      </w:r>
-      <w:proofErr w:type="spellEnd"/>
-      <w:r>
-        <w:t xml:space="preserve"> Web API (.NET 10)</w:t>
+        <w:t>ASP.NET Core Web API (.NET 10)</w:t>
       </w:r>
     </w:p>
     <w:p>
@@ -629,21 +616,8 @@
       <w:r>
         <w:t xml:space="preserve">ORM: </w:t>
       </w:r>
-      <w:proofErr w:type="spellStart"/>
-      <w:r>
-        <w:t>Entity</w:t>
-      </w:r>
-      <w:proofErr w:type="spellEnd"/>
-      <w:r>
-        <w:t xml:space="preserve"> Framework </w:t>
-      </w:r>
-      <w:proofErr w:type="spellStart"/>
-      <w:r>
-        <w:t>Core</w:t>
-      </w:r>
-      <w:proofErr w:type="spellEnd"/>
-      <w:r>
-        <w:t xml:space="preserve"> + </w:t>
+      <w:r>
+        <w:t xml:space="preserve">Entity Framework Core + </w:t>
       </w:r>
       <w:proofErr w:type="spellStart"/>
       <w:r>
@@ -651,13 +625,8 @@
       </w:r>
       <w:proofErr w:type="spellEnd"/>
       <w:r>
-        <w:t xml:space="preserve"> </w:t>
-      </w:r>
-      <w:proofErr w:type="spellStart"/>
-      <w:r>
-        <w:t>provider</w:t>
-      </w:r>
-      <w:proofErr w:type="spellEnd"/>
+        <w:t xml:space="preserve"> provider</w:t>
+      </w:r>
     </w:p>
     <w:p>
       <w:pPr>
@@ -668,21 +637,8 @@
         </w:numPr>
       </w:pPr>
       <w:r>
-        <w:t xml:space="preserve">ASP.NET </w:t>
-      </w:r>
-      <w:proofErr w:type="spellStart"/>
-      <w:r>
-        <w:t>Core</w:t>
-      </w:r>
-      <w:proofErr w:type="spellEnd"/>
-      <w:r>
-        <w:t xml:space="preserve"> </w:t>
-      </w:r>
-      <w:proofErr w:type="spellStart"/>
-      <w:r>
-        <w:t>Identity</w:t>
-      </w:r>
-      <w:proofErr w:type="spellEnd"/>
+        <w:t>ASP.NET Core Identity</w:t>
+      </w:r>
     </w:p>
     <w:p>
       <w:pPr>
@@ -693,21 +649,8 @@
         </w:numPr>
       </w:pPr>
       <w:r>
-        <w:t xml:space="preserve">JWT </w:t>
-      </w:r>
-      <w:proofErr w:type="spellStart"/>
-      <w:r>
-        <w:t>Bearer</w:t>
-      </w:r>
-      <w:proofErr w:type="spellEnd"/>
-      <w:r>
-        <w:t xml:space="preserve"> </w:t>
-      </w:r>
-      <w:proofErr w:type="spellStart"/>
-      <w:r>
-        <w:t>authentication</w:t>
-      </w:r>
-      <w:proofErr w:type="spellEnd"/>
+        <w:t>JWT Bearer authentication</w:t>
+      </w:r>
     </w:p>
     <w:p>
       <w:pPr>
@@ -718,15 +661,7 @@
         </w:numPr>
       </w:pPr>
       <w:r>
-        <w:t xml:space="preserve">Health </w:t>
-      </w:r>
-      <w:proofErr w:type="spellStart"/>
-      <w:r>
-        <w:t>Checks</w:t>
-      </w:r>
-      <w:proofErr w:type="spellEnd"/>
-      <w:r>
-        <w:t xml:space="preserve"> + </w:t>
+        <w:t xml:space="preserve">Health Checks + </w:t>
       </w:r>
       <w:proofErr w:type="spellStart"/>
       <w:r>
@@ -734,23 +669,7 @@
       </w:r>
       <w:proofErr w:type="spellEnd"/>
       <w:r>
-        <w:t xml:space="preserve"> + </w:t>
-      </w:r>
-      <w:proofErr w:type="spellStart"/>
-      <w:r>
-        <w:t>Scalar</w:t>
-      </w:r>
-      <w:proofErr w:type="spellEnd"/>
-      <w:r>
-        <w:t xml:space="preserve"> UI (</w:t>
-      </w:r>
-      <w:proofErr w:type="spellStart"/>
-      <w:r>
-        <w:t>dev</w:t>
-      </w:r>
-      <w:proofErr w:type="spellEnd"/>
-      <w:r>
-        <w:t>)</w:t>
+        <w:t xml:space="preserve"> + Scalar UI (dev)</w:t>
       </w:r>
     </w:p>
     <w:p>
@@ -758,13 +677,8 @@
         <w:pStyle w:val="Cmsor2"/>
       </w:pPr>
       <w:bookmarkStart w:id="5" w:name="_Toc228094597"/>
-      <w:proofErr w:type="spellStart"/>
-      <w:r>
-        <w:t>Database</w:t>
-      </w:r>
-      <w:proofErr w:type="spellEnd"/>
-      <w:r>
-        <w:t>:</w:t>
+      <w:r>
+        <w:t>Database:</w:t>
       </w:r>
       <w:bookmarkEnd w:id="5"/>
     </w:p>
@@ -776,29 +690,8 @@
           <w:numId w:val="6"/>
         </w:numPr>
       </w:pPr>
-      <w:proofErr w:type="spellStart"/>
-      <w:r>
-        <w:t>PostgreSQL</w:t>
-      </w:r>
-      <w:proofErr w:type="spellEnd"/>
-      <w:r>
-        <w:t xml:space="preserve"> 16 (</w:t>
-      </w:r>
-      <w:proofErr w:type="spellStart"/>
-      <w:r>
-        <w:t>docker</w:t>
-      </w:r>
-      <w:proofErr w:type="spellEnd"/>
-      <w:r>
-        <w:t xml:space="preserve"> </w:t>
-      </w:r>
-      <w:proofErr w:type="spellStart"/>
-      <w:r>
-        <w:t>compose</w:t>
-      </w:r>
-      <w:proofErr w:type="spellEnd"/>
-      <w:r>
-        <w:t>)</w:t>
+      <w:r>
+        <w:t>PostgreSQL 16 (docker compose)</w:t>
       </w:r>
     </w:p>
     <w:p>
@@ -819,27 +712,14 @@
           <w:numId w:val="7"/>
         </w:numPr>
       </w:pPr>
-      <w:proofErr w:type="spellStart"/>
-      <w:r>
-        <w:t>React</w:t>
-      </w:r>
-      <w:proofErr w:type="spellEnd"/>
-      <w:r>
-        <w:t xml:space="preserve"> + </w:t>
-      </w:r>
-      <w:proofErr w:type="spellStart"/>
-      <w:r>
-        <w:t>TypeScript</w:t>
-      </w:r>
-      <w:proofErr w:type="spellEnd"/>
-      <w:r>
-        <w:t xml:space="preserve"> + </w:t>
-      </w:r>
-      <w:proofErr w:type="spellStart"/>
+      <w:r>
+        <w:t xml:space="preserve">React + TypeScript + </w:t>
+      </w:r>
+      <w:proofErr w:type="gramStart"/>
       <w:r>
         <w:t>Vite</w:t>
       </w:r>
-      <w:proofErr w:type="spellEnd"/>
+      <w:proofErr w:type="gramEnd"/>
     </w:p>
     <w:p>
       <w:pPr>
@@ -855,13 +735,8 @@
       </w:r>
       <w:proofErr w:type="spellEnd"/>
       <w:r>
-        <w:t xml:space="preserve"> HTTP </w:t>
-      </w:r>
-      <w:proofErr w:type="spellStart"/>
-      <w:r>
-        <w:t>client</w:t>
-      </w:r>
-      <w:proofErr w:type="spellEnd"/>
+        <w:t xml:space="preserve"> HTTP client</w:t>
+      </w:r>
     </w:p>
     <w:p>
       <w:pPr>
@@ -871,13 +746,8 @@
           <w:numId w:val="7"/>
         </w:numPr>
       </w:pPr>
-      <w:proofErr w:type="spellStart"/>
-      <w:r>
-        <w:t>react</w:t>
-      </w:r>
-      <w:proofErr w:type="spellEnd"/>
-      <w:r>
-        <w:t>-router-</w:t>
+      <w:r>
+        <w:t>react-router-</w:t>
       </w:r>
       <w:proofErr w:type="spellStart"/>
       <w:r>
@@ -885,21 +755,13 @@
       </w:r>
       <w:proofErr w:type="spellEnd"/>
       <w:r>
-        <w:t xml:space="preserve"> </w:t>
-      </w:r>
-      <w:proofErr w:type="spellStart"/>
-      <w:r>
-        <w:t>route</w:t>
-      </w:r>
-      <w:proofErr w:type="spellEnd"/>
-      <w:r>
-        <w:t xml:space="preserve"> </w:t>
-      </w:r>
-      <w:proofErr w:type="spellStart"/>
+        <w:t xml:space="preserve"> route </w:t>
+      </w:r>
+      <w:proofErr w:type="gramStart"/>
       <w:r>
         <w:t>handling</w:t>
       </w:r>
-      <w:proofErr w:type="spellEnd"/>
+      <w:proofErr w:type="gramEnd"/>
     </w:p>
     <w:p>
       <w:pPr>
@@ -934,15 +796,7 @@
         </w:numPr>
       </w:pPr>
       <w:r>
-        <w:t xml:space="preserve">EF </w:t>
-      </w:r>
-      <w:proofErr w:type="spellStart"/>
-      <w:r>
-        <w:t>Core</w:t>
-      </w:r>
-      <w:proofErr w:type="spellEnd"/>
-      <w:r>
-        <w:t xml:space="preserve"> </w:t>
+        <w:t xml:space="preserve">EF Core </w:t>
       </w:r>
       <w:proofErr w:type="spellStart"/>
       <w:r>
@@ -950,23 +804,7 @@
       </w:r>
       <w:proofErr w:type="spellEnd"/>
       <w:r>
-        <w:t xml:space="preserve"> (</w:t>
-      </w:r>
-      <w:proofErr w:type="spellStart"/>
-      <w:r>
-        <w:t>controller-level</w:t>
-      </w:r>
-      <w:proofErr w:type="spellEnd"/>
-      <w:r>
-        <w:t xml:space="preserve"> test </w:t>
-      </w:r>
-      <w:proofErr w:type="spellStart"/>
-      <w:r>
-        <w:t>scenarios</w:t>
-      </w:r>
-      <w:proofErr w:type="spellEnd"/>
-      <w:r>
-        <w:t>)</w:t>
+        <w:t xml:space="preserve"> (controller-level test scenarios)</w:t>
       </w:r>
     </w:p>
     <w:p>
@@ -974,13 +812,8 @@
         <w:pStyle w:val="Cmsor2"/>
       </w:pPr>
       <w:bookmarkStart w:id="8" w:name="_Toc228094600"/>
-      <w:proofErr w:type="spellStart"/>
-      <w:r>
-        <w:t>DevOps</w:t>
-      </w:r>
-      <w:proofErr w:type="spellEnd"/>
-      <w:r>
-        <w:t>:</w:t>
+      <w:r>
+        <w:t>DevOps:</w:t>
       </w:r>
       <w:bookmarkEnd w:id="8"/>
     </w:p>
@@ -993,21 +826,13 @@
         </w:numPr>
       </w:pPr>
       <w:r>
-        <w:t xml:space="preserve">Docker + </w:t>
-      </w:r>
-      <w:proofErr w:type="spellStart"/>
-      <w:r>
-        <w:t>docker</w:t>
-      </w:r>
-      <w:proofErr w:type="spellEnd"/>
-      <w:r>
-        <w:t xml:space="preserve"> </w:t>
-      </w:r>
-      <w:proofErr w:type="spellStart"/>
+        <w:t xml:space="preserve">Docker + docker </w:t>
+      </w:r>
+      <w:proofErr w:type="gramStart"/>
       <w:r>
         <w:t>compose</w:t>
       </w:r>
-      <w:proofErr w:type="spellEnd"/>
+      <w:proofErr w:type="gramEnd"/>
     </w:p>
     <w:p>
       <w:pPr>
@@ -1017,29 +842,8 @@
           <w:numId w:val="10"/>
         </w:numPr>
       </w:pPr>
-      <w:proofErr w:type="spellStart"/>
-      <w:r>
-        <w:t>env-based</w:t>
-      </w:r>
-      <w:proofErr w:type="spellEnd"/>
-      <w:r>
-        <w:t xml:space="preserve"> </w:t>
-      </w:r>
-      <w:proofErr w:type="spellStart"/>
-      <w:r>
-        <w:t>config</w:t>
-      </w:r>
-      <w:proofErr w:type="spellEnd"/>
-      <w:r>
-        <w:t xml:space="preserve"> (.</w:t>
-      </w:r>
-      <w:proofErr w:type="spellStart"/>
-      <w:r>
-        <w:t>env</w:t>
-      </w:r>
-      <w:proofErr w:type="spellEnd"/>
-      <w:r>
-        <w:t>)</w:t>
+      <w:r>
+        <w:t>env-based config (.env)</w:t>
       </w:r>
     </w:p>
     <w:p>
@@ -1048,22 +852,9 @@
       </w:pPr>
       <w:bookmarkStart w:id="9" w:name="_Toc228094601"/>
       <w:r>
-        <w:t xml:space="preserve">3) </w:t>
-      </w:r>
-      <w:proofErr w:type="spellStart"/>
-      <w:r>
-        <w:t>High-level</w:t>
-      </w:r>
-      <w:proofErr w:type="spellEnd"/>
-      <w:r>
-        <w:t xml:space="preserve"> </w:t>
-      </w:r>
-      <w:proofErr w:type="spellStart"/>
-      <w:r>
-        <w:t>architecture</w:t>
+        <w:t>3) High-level architecture</w:t>
       </w:r>
       <w:bookmarkEnd w:id="9"/>
-      <w:proofErr w:type="spellEnd"/>
     </w:p>
     <w:p>
       <w:r>
@@ -1097,45 +888,9 @@
         </w:numPr>
       </w:pPr>
       <w:r>
-        <w:t xml:space="preserve">Backend API: </w:t>
-      </w:r>
-      <w:proofErr w:type="spellStart"/>
-      <w:r>
-        <w:t>auth</w:t>
-      </w:r>
-      <w:proofErr w:type="spellEnd"/>
-      <w:r>
-        <w:t xml:space="preserve"> + </w:t>
-      </w:r>
-      <w:proofErr w:type="spellStart"/>
-      <w:r>
-        <w:t>notes</w:t>
-      </w:r>
-      <w:proofErr w:type="spellEnd"/>
-      <w:r>
-        <w:t xml:space="preserve"> business </w:t>
-      </w:r>
-      <w:proofErr w:type="spellStart"/>
-      <w:r>
-        <w:t>logic</w:t>
-      </w:r>
-      <w:proofErr w:type="spellEnd"/>
-      <w:r>
-        <w:t xml:space="preserve"> + </w:t>
-      </w:r>
-      <w:proofErr w:type="spellStart"/>
-      <w:r>
-        <w:t>data</w:t>
-      </w:r>
-      <w:proofErr w:type="spellEnd"/>
-      <w:r>
-        <w:t xml:space="preserve"> </w:t>
-      </w:r>
-      <w:proofErr w:type="spellStart"/>
-      <w:r>
-        <w:t>access</w:t>
-      </w:r>
-      <w:proofErr w:type="spellEnd"/>
+        <w:lastRenderedPageBreak/>
+        <w:t>Backend API: auth + notes business logic + data access</w:t>
+      </w:r>
     </w:p>
     <w:p>
       <w:pPr>
@@ -1146,28 +901,11 @@
         </w:numPr>
       </w:pPr>
       <w:r>
-        <w:t xml:space="preserve">Frontend SPA: </w:t>
-      </w:r>
-      <w:proofErr w:type="spellStart"/>
-      <w:r>
-        <w:t>auth</w:t>
-      </w:r>
-      <w:proofErr w:type="spellEnd"/>
-      <w:r>
-        <w:t xml:space="preserve"> flow + </w:t>
-      </w:r>
-      <w:proofErr w:type="spellStart"/>
-      <w:r>
-        <w:t>notes</w:t>
-      </w:r>
-      <w:proofErr w:type="spellEnd"/>
-      <w:r>
-        <w:t xml:space="preserve"> UI</w:t>
-      </w:r>
-    </w:p>
-    <w:p>
-      <w:r>
-        <w:lastRenderedPageBreak/>
+        <w:t>Frontend SPA: auth flow + notes UI</w:t>
+      </w:r>
+    </w:p>
+    <w:p>
+      <w:r>
         <w:t xml:space="preserve">A frontend csak API-n </w:t>
       </w:r>
       <w:r>
@@ -1176,35 +914,71 @@
       <w:r>
         <w:t xml:space="preserve"> </w:t>
       </w:r>
+      <w:proofErr w:type="spellStart"/>
       <w:r>
         <w:t>kommunikál</w:t>
       </w:r>
+      <w:proofErr w:type="spellEnd"/>
       <w:r>
         <w:t xml:space="preserve">, </w:t>
       </w:r>
+      <w:proofErr w:type="spellStart"/>
       <w:r>
         <w:t>közvetlen</w:t>
       </w:r>
-      <w:r>
-        <w:t xml:space="preserve"> DB </w:t>
-      </w:r>
-      <w:proofErr w:type="spellStart"/>
-      <w:r>
-        <w:t>access</w:t>
-      </w:r>
-      <w:proofErr w:type="spellEnd"/>
-      <w:r>
-        <w:t xml:space="preserve"> nincs. Auth </w:t>
-      </w:r>
+      <w:proofErr w:type="spellEnd"/>
+      <w:r>
+        <w:t xml:space="preserve"> DB access </w:t>
+      </w:r>
+      <w:proofErr w:type="spellStart"/>
+      <w:r>
+        <w:t>nincs</w:t>
+      </w:r>
+      <w:proofErr w:type="spellEnd"/>
+      <w:r>
+        <w:t xml:space="preserve">. Auth </w:t>
+      </w:r>
+      <w:proofErr w:type="spellStart"/>
       <w:r>
         <w:t>után</w:t>
       </w:r>
-      <w:r>
-        <w:t xml:space="preserve"> a JWT </w:t>
-      </w:r>
-      <w:proofErr w:type="spellStart"/>
-      <w:r>
-        <w:t>token</w:t>
+      <w:proofErr w:type="spellEnd"/>
+      <w:r>
+        <w:t xml:space="preserve"> a JWT token </w:t>
+      </w:r>
+      <w:proofErr w:type="spellStart"/>
+      <w:r>
+        <w:t>localStorage</w:t>
+      </w:r>
+      <w:proofErr w:type="spellEnd"/>
+      <w:r>
+        <w:t xml:space="preserve">-ben van </w:t>
+      </w:r>
+      <w:proofErr w:type="spellStart"/>
+      <w:r>
+        <w:t>t</w:t>
+      </w:r>
+      <w:r>
+        <w:t>á</w:t>
+      </w:r>
+      <w:r>
+        <w:t>rolva</w:t>
+      </w:r>
+      <w:proofErr w:type="spellEnd"/>
+      <w:r>
+        <w:t xml:space="preserve">, es </w:t>
+      </w:r>
+      <w:proofErr w:type="spellStart"/>
+      <w:r>
+        <w:t>minden</w:t>
+      </w:r>
+      <w:proofErr w:type="spellEnd"/>
+      <w:r>
+        <w:t xml:space="preserve"> protected request Authorization: Bearer </w:t>
+      </w:r>
+      <w:proofErr w:type="spellStart"/>
+      <w:r>
+        <w:t>headerrel</w:t>
       </w:r>
       <w:proofErr w:type="spellEnd"/>
       <w:r>
@@ -1212,57 +986,11 @@
       </w:r>
       <w:proofErr w:type="spellStart"/>
       <w:r>
-        <w:t>localStorage</w:t>
-      </w:r>
-      <w:proofErr w:type="spellEnd"/>
-      <w:r>
-        <w:t>-ben van t</w:t>
-      </w:r>
-      <w:r>
-        <w:t>á</w:t>
-      </w:r>
-      <w:r>
-        <w:t xml:space="preserve">rolva, es minden </w:t>
-      </w:r>
-      <w:proofErr w:type="spellStart"/>
-      <w:r>
-        <w:t>protected</w:t>
-      </w:r>
-      <w:proofErr w:type="spellEnd"/>
-      <w:r>
-        <w:t xml:space="preserve"> </w:t>
-      </w:r>
-      <w:proofErr w:type="spellStart"/>
-      <w:r>
-        <w:t>request</w:t>
-      </w:r>
-      <w:proofErr w:type="spellEnd"/>
-      <w:r>
-        <w:t xml:space="preserve"> </w:t>
-      </w:r>
-      <w:proofErr w:type="spellStart"/>
-      <w:r>
-        <w:t>Authorization</w:t>
-      </w:r>
-      <w:proofErr w:type="spellEnd"/>
-      <w:r>
-        <w:t xml:space="preserve">: </w:t>
-      </w:r>
-      <w:proofErr w:type="spellStart"/>
-      <w:r>
-        <w:t>Bearer</w:t>
-      </w:r>
-      <w:proofErr w:type="spellEnd"/>
-      <w:r>
-        <w:t xml:space="preserve"> </w:t>
-      </w:r>
-      <w:proofErr w:type="spellStart"/>
-      <w:r>
-        <w:t>headerrel</w:t>
-      </w:r>
-      <w:proofErr w:type="spellEnd"/>
-      <w:r>
-        <w:t xml:space="preserve"> megy.</w:t>
+        <w:t>megy</w:t>
+      </w:r>
+      <w:proofErr w:type="spellEnd"/>
+      <w:r>
+        <w:t>.</w:t>
       </w:r>
     </w:p>
     <w:p>
@@ -1318,21 +1046,13 @@
       </w:r>
       <w:proofErr w:type="spellEnd"/>
       <w:r>
-        <w:t>/</w:t>
-      </w:r>
-      <w:proofErr w:type="spellStart"/>
-      <w:r>
-        <w:t>auth</w:t>
-      </w:r>
-      <w:proofErr w:type="spellEnd"/>
-      <w:r>
-        <w:t>/</w:t>
-      </w:r>
-      <w:proofErr w:type="spellStart"/>
+        <w:t>/auth/</w:t>
+      </w:r>
+      <w:proofErr w:type="gramStart"/>
       <w:r>
         <w:t>register</w:t>
       </w:r>
-      <w:proofErr w:type="spellEnd"/>
+      <w:proofErr w:type="gramEnd"/>
     </w:p>
     <w:p>
       <w:pPr>
@@ -1351,49 +1071,57 @@
       </w:r>
       <w:proofErr w:type="spellEnd"/>
       <w:r>
-        <w:t>/</w:t>
-      </w:r>
-      <w:proofErr w:type="spellStart"/>
-      <w:r>
-        <w:t>auth</w:t>
-      </w:r>
-      <w:proofErr w:type="spellEnd"/>
-      <w:r>
-        <w:t>/login</w:t>
-      </w:r>
-    </w:p>
-    <w:p>
-      <w:proofErr w:type="spellStart"/>
-      <w:r>
-        <w:t>Identity</w:t>
-      </w:r>
-      <w:proofErr w:type="spellEnd"/>
-      <w:r>
-        <w:t xml:space="preserve"> kezeli a </w:t>
-      </w:r>
-      <w:proofErr w:type="spellStart"/>
-      <w:r>
-        <w:t>user</w:t>
-      </w:r>
-      <w:proofErr w:type="spellEnd"/>
-      <w:r>
-        <w:t xml:space="preserve"> accountot, a login/</w:t>
-      </w:r>
-      <w:proofErr w:type="spellStart"/>
-      <w:r>
-        <w:t>register</w:t>
-      </w:r>
-      <w:proofErr w:type="spellEnd"/>
-      <w:r>
-        <w:t xml:space="preserve"> sikeres esetben JWT </w:t>
-      </w:r>
-      <w:proofErr w:type="spellStart"/>
-      <w:r>
-        <w:t>token</w:t>
-      </w:r>
-      <w:proofErr w:type="spellEnd"/>
-      <w:r>
-        <w:t>-t ad vissza.</w:t>
+        <w:t>/auth/</w:t>
+      </w:r>
+      <w:proofErr w:type="gramStart"/>
+      <w:r>
+        <w:t>login</w:t>
+      </w:r>
+      <w:proofErr w:type="gramEnd"/>
+    </w:p>
+    <w:p>
+      <w:r>
+        <w:t xml:space="preserve">Identity </w:t>
+      </w:r>
+      <w:proofErr w:type="spellStart"/>
+      <w:r>
+        <w:t>kezeli</w:t>
+      </w:r>
+      <w:proofErr w:type="spellEnd"/>
+      <w:r>
+        <w:t xml:space="preserve"> a user </w:t>
+      </w:r>
+      <w:proofErr w:type="spellStart"/>
+      <w:r>
+        <w:t>accountot</w:t>
+      </w:r>
+      <w:proofErr w:type="spellEnd"/>
+      <w:r>
+        <w:t xml:space="preserve">, a login/register </w:t>
+      </w:r>
+      <w:proofErr w:type="spellStart"/>
+      <w:r>
+        <w:t>sikeres</w:t>
+      </w:r>
+      <w:proofErr w:type="spellEnd"/>
+      <w:r>
+        <w:t xml:space="preserve"> </w:t>
+      </w:r>
+      <w:proofErr w:type="spellStart"/>
+      <w:r>
+        <w:t>esetben</w:t>
+      </w:r>
+      <w:proofErr w:type="spellEnd"/>
+      <w:r>
+        <w:t xml:space="preserve"> JWT token-t ad </w:t>
+      </w:r>
+      <w:proofErr w:type="spellStart"/>
+      <w:r>
+        <w:t>vissza</w:t>
+      </w:r>
+      <w:proofErr w:type="spellEnd"/>
+      <w:r>
+        <w:t>.</w:t>
       </w:r>
     </w:p>
     <w:p>
@@ -1402,31 +1130,13 @@
       </w:pPr>
       <w:bookmarkStart w:id="12" w:name="_Toc228094604"/>
       <w:r>
-        <w:t xml:space="preserve">4.2 </w:t>
-      </w:r>
-      <w:proofErr w:type="spellStart"/>
-      <w:r>
-        <w:t>Notes</w:t>
-      </w:r>
-      <w:proofErr w:type="spellEnd"/>
-      <w:r>
-        <w:t xml:space="preserve"> </w:t>
-      </w:r>
-      <w:proofErr w:type="spellStart"/>
-      <w:r>
-        <w:t>domain</w:t>
+        <w:t>4.2 Notes domain</w:t>
       </w:r>
       <w:bookmarkEnd w:id="12"/>
-      <w:proofErr w:type="spellEnd"/>
-    </w:p>
-    <w:p>
-      <w:proofErr w:type="spellStart"/>
-      <w:r>
-        <w:t>Notes</w:t>
-      </w:r>
-      <w:proofErr w:type="spellEnd"/>
-      <w:r>
-        <w:t xml:space="preserve"> </w:t>
+    </w:p>
+    <w:p>
+      <w:r>
+        <w:t xml:space="preserve">Notes </w:t>
       </w:r>
       <w:proofErr w:type="spellStart"/>
       <w:r>
@@ -1434,15 +1144,7 @@
       </w:r>
       <w:proofErr w:type="spellEnd"/>
       <w:r>
-        <w:t xml:space="preserve"> (mind </w:t>
-      </w:r>
-      <w:proofErr w:type="spellStart"/>
-      <w:r>
-        <w:t>auth-protected</w:t>
-      </w:r>
-      <w:proofErr w:type="spellEnd"/>
-      <w:r>
-        <w:t>):</w:t>
+        <w:t xml:space="preserve"> (mind auth-protected):</w:t>
       </w:r>
     </w:p>
     <w:p>
@@ -1464,11 +1166,11 @@
       <w:r>
         <w:t>/</w:t>
       </w:r>
-      <w:proofErr w:type="spellStart"/>
+      <w:proofErr w:type="gramStart"/>
       <w:r>
         <w:t>notes</w:t>
       </w:r>
-      <w:proofErr w:type="spellEnd"/>
+      <w:proofErr w:type="gramEnd"/>
     </w:p>
     <w:p>
       <w:pPr>
@@ -1487,23 +1189,7 @@
       </w:r>
       <w:proofErr w:type="spellEnd"/>
       <w:r>
-        <w:t>/</w:t>
-      </w:r>
-      <w:proofErr w:type="spellStart"/>
-      <w:r>
-        <w:t>notes</w:t>
-      </w:r>
-      <w:proofErr w:type="spellEnd"/>
-      <w:r>
-        <w:t>/{</w:t>
-      </w:r>
-      <w:proofErr w:type="spellStart"/>
-      <w:r>
-        <w:t>id</w:t>
-      </w:r>
-      <w:proofErr w:type="spellEnd"/>
-      <w:r>
-        <w:t>}</w:t>
+        <w:t>/notes/{id}</w:t>
       </w:r>
     </w:p>
     <w:p>
@@ -1525,11 +1211,11 @@
       <w:r>
         <w:t>/</w:t>
       </w:r>
-      <w:proofErr w:type="spellStart"/>
+      <w:proofErr w:type="gramStart"/>
       <w:r>
         <w:t>notes</w:t>
       </w:r>
-      <w:proofErr w:type="spellEnd"/>
+      <w:proofErr w:type="gramEnd"/>
     </w:p>
     <w:p>
       <w:pPr>
@@ -1548,23 +1234,7 @@
       </w:r>
       <w:proofErr w:type="spellEnd"/>
       <w:r>
-        <w:t>/</w:t>
-      </w:r>
-      <w:proofErr w:type="spellStart"/>
-      <w:r>
-        <w:t>notes</w:t>
-      </w:r>
-      <w:proofErr w:type="spellEnd"/>
-      <w:r>
-        <w:t>/{</w:t>
-      </w:r>
-      <w:proofErr w:type="spellStart"/>
-      <w:r>
-        <w:t>id</w:t>
-      </w:r>
-      <w:proofErr w:type="spellEnd"/>
-      <w:r>
-        <w:t>}</w:t>
+        <w:t>/notes/{id}</w:t>
       </w:r>
     </w:p>
     <w:p>
@@ -1584,32 +1254,24 @@
       </w:r>
       <w:proofErr w:type="spellEnd"/>
       <w:r>
-        <w:t>/</w:t>
-      </w:r>
-      <w:proofErr w:type="spellStart"/>
-      <w:r>
-        <w:t>notes</w:t>
-      </w:r>
-      <w:proofErr w:type="spellEnd"/>
-      <w:r>
-        <w:t>/{</w:t>
-      </w:r>
-      <w:proofErr w:type="spellStart"/>
-      <w:r>
-        <w:t>id</w:t>
-      </w:r>
-      <w:proofErr w:type="spellEnd"/>
-      <w:r>
-        <w:t>}</w:t>
-      </w:r>
-    </w:p>
-    <w:p>
-      <w:r>
-        <w:t xml:space="preserve">Minden </w:t>
-      </w:r>
-      <w:proofErr w:type="spellStart"/>
-      <w:r>
-        <w:t>query</w:t>
+        <w:t>/notes/{id}</w:t>
+      </w:r>
+    </w:p>
+    <w:p>
+      <w:r>
+        <w:t xml:space="preserve">Minden query user scope-ban </w:t>
+      </w:r>
+      <w:proofErr w:type="spellStart"/>
+      <w:r>
+        <w:t>fut</w:t>
+      </w:r>
+      <w:proofErr w:type="spellEnd"/>
+      <w:r>
+        <w:t xml:space="preserve"> (</w:t>
+      </w:r>
+      <w:proofErr w:type="spellStart"/>
+      <w:r>
+        <w:t>ClaimTypes.NameIdentifier</w:t>
       </w:r>
       <w:proofErr w:type="spellEnd"/>
       <w:r>
@@ -1617,7 +1279,15 @@
       </w:r>
       <w:proofErr w:type="spellStart"/>
       <w:r>
-        <w:t>user</w:t>
+        <w:t>alapjan</w:t>
+      </w:r>
+      <w:proofErr w:type="spellEnd"/>
+      <w:r>
+        <w:t xml:space="preserve">), </w:t>
+      </w:r>
+      <w:proofErr w:type="spellStart"/>
+      <w:r>
+        <w:t>ez</w:t>
       </w:r>
       <w:proofErr w:type="spellEnd"/>
       <w:r>
@@ -1625,43 +1295,11 @@
       </w:r>
       <w:proofErr w:type="spellStart"/>
       <w:r>
-        <w:t>scope</w:t>
-      </w:r>
-      <w:proofErr w:type="spellEnd"/>
-      <w:r>
-        <w:t>-ban fut (</w:t>
-      </w:r>
-      <w:proofErr w:type="spellStart"/>
-      <w:r>
-        <w:t>ClaimTypes.NameIdentifier</w:t>
-      </w:r>
-      <w:proofErr w:type="spellEnd"/>
-      <w:r>
-        <w:t xml:space="preserve"> </w:t>
-      </w:r>
-      <w:proofErr w:type="spellStart"/>
-      <w:r>
-        <w:t>alapjan</w:t>
-      </w:r>
-      <w:proofErr w:type="spellEnd"/>
-      <w:r>
-        <w:t xml:space="preserve">), ez biztosítja a </w:t>
-      </w:r>
-      <w:proofErr w:type="spellStart"/>
-      <w:r>
-        <w:t>tenant</w:t>
-      </w:r>
-      <w:proofErr w:type="spellEnd"/>
-      <w:r>
-        <w:t xml:space="preserve">-like </w:t>
-      </w:r>
-      <w:proofErr w:type="spellStart"/>
-      <w:r>
-        <w:t>isolation</w:t>
-      </w:r>
-      <w:proofErr w:type="spellEnd"/>
-      <w:r>
-        <w:t>-t.</w:t>
+        <w:t>biztosítja</w:t>
+      </w:r>
+      <w:proofErr w:type="spellEnd"/>
+      <w:r>
+        <w:t xml:space="preserve"> a tenant-like isolation-t.</w:t>
       </w:r>
     </w:p>
     <w:p>
@@ -1672,46 +1310,22 @@
       <w:r>
         <w:t xml:space="preserve">4.3 ORM </w:t>
       </w:r>
+      <w:proofErr w:type="spellStart"/>
       <w:r>
         <w:t>é</w:t>
       </w:r>
       <w:r>
-        <w:t xml:space="preserve">s </w:t>
-      </w:r>
-      <w:proofErr w:type="spellStart"/>
-      <w:r>
-        <w:t>migrations</w:t>
+        <w:t>s</w:t>
+      </w:r>
+      <w:proofErr w:type="spellEnd"/>
+      <w:r>
+        <w:t xml:space="preserve"> migrations</w:t>
       </w:r>
       <w:bookmarkEnd w:id="13"/>
-      <w:proofErr w:type="spellEnd"/>
-    </w:p>
-    <w:p>
-      <w:r>
-        <w:t xml:space="preserve">EF </w:t>
-      </w:r>
-      <w:proofErr w:type="spellStart"/>
-      <w:r>
-        <w:t>Core</w:t>
-      </w:r>
-      <w:proofErr w:type="spellEnd"/>
-      <w:r>
-        <w:t xml:space="preserve"> </w:t>
-      </w:r>
-      <w:proofErr w:type="spellStart"/>
-      <w:r>
-        <w:t>code-first</w:t>
-      </w:r>
-      <w:proofErr w:type="spellEnd"/>
-      <w:r>
-        <w:t xml:space="preserve"> </w:t>
-      </w:r>
-      <w:proofErr w:type="spellStart"/>
-      <w:r>
-        <w:t>approach</w:t>
-      </w:r>
-      <w:proofErr w:type="spellEnd"/>
-      <w:r>
-        <w:t>:</w:t>
+    </w:p>
+    <w:p>
+      <w:r>
+        <w:t>EF Core code-first approach:</w:t>
       </w:r>
     </w:p>
     <w:p>
@@ -1728,31 +1342,7 @@
       </w:r>
       <w:proofErr w:type="spellEnd"/>
       <w:r>
-        <w:t xml:space="preserve"> (</w:t>
-      </w:r>
-      <w:proofErr w:type="spellStart"/>
-      <w:r>
-        <w:t>Identity</w:t>
-      </w:r>
-      <w:proofErr w:type="spellEnd"/>
-      <w:r>
-        <w:t xml:space="preserve"> </w:t>
-      </w:r>
-      <w:proofErr w:type="spellStart"/>
-      <w:r>
-        <w:t>user</w:t>
-      </w:r>
-      <w:proofErr w:type="spellEnd"/>
-      <w:r>
-        <w:t xml:space="preserve"> </w:t>
-      </w:r>
-      <w:proofErr w:type="spellStart"/>
-      <w:r>
-        <w:t>extension</w:t>
-      </w:r>
-      <w:proofErr w:type="spellEnd"/>
-      <w:r>
-        <w:t>)</w:t>
+        <w:t xml:space="preserve"> (Identity user extension)</w:t>
       </w:r>
     </w:p>
     <w:p>
@@ -1763,9 +1353,57 @@
           <w:numId w:val="9"/>
         </w:numPr>
       </w:pPr>
-      <w:proofErr w:type="spellStart"/>
-      <w:r>
-        <w:t>Note</w:t>
+      <w:r>
+        <w:t xml:space="preserve">Note entity (FK: </w:t>
+      </w:r>
+      <w:proofErr w:type="spellStart"/>
+      <w:r>
+        <w:t>UserId</w:t>
+      </w:r>
+      <w:proofErr w:type="spellEnd"/>
+      <w:r>
+        <w:t>)</w:t>
+      </w:r>
+    </w:p>
+    <w:p>
+      <w:r>
+        <w:t xml:space="preserve">A </w:t>
+      </w:r>
+      <w:proofErr w:type="gramStart"/>
+      <w:r>
+        <w:t>schema migrations</w:t>
+      </w:r>
+      <w:proofErr w:type="gramEnd"/>
+      <w:r>
+        <w:t>-</w:t>
+      </w:r>
+      <w:proofErr w:type="spellStart"/>
+      <w:r>
+        <w:t>el</w:t>
+      </w:r>
+      <w:proofErr w:type="spellEnd"/>
+      <w:r>
+        <w:t xml:space="preserve"> van </w:t>
+      </w:r>
+      <w:proofErr w:type="spellStart"/>
+      <w:r>
+        <w:t>kezelve</w:t>
+      </w:r>
+      <w:proofErr w:type="spellEnd"/>
+      <w:r>
+        <w:t xml:space="preserve">, az API startup </w:t>
+      </w:r>
+      <w:proofErr w:type="spellStart"/>
+      <w:r>
+        <w:t>során</w:t>
+      </w:r>
+      <w:proofErr w:type="spellEnd"/>
+      <w:r>
+        <w:t xml:space="preserve"> pending migration </w:t>
+      </w:r>
+      <w:proofErr w:type="spellStart"/>
+      <w:r>
+        <w:t>automatikusan</w:t>
       </w:r>
       <w:proofErr w:type="spellEnd"/>
       <w:r>
@@ -1773,28 +1411,41 @@
       </w:r>
       <w:proofErr w:type="spellStart"/>
       <w:r>
-        <w:t>entity</w:t>
-      </w:r>
-      <w:proofErr w:type="spellEnd"/>
-      <w:r>
-        <w:t xml:space="preserve"> (FK: </w:t>
-      </w:r>
-      <w:proofErr w:type="spellStart"/>
-      <w:r>
-        <w:t>UserId</w:t>
-      </w:r>
-      <w:proofErr w:type="spellEnd"/>
-      <w:r>
-        <w:t>)</w:t>
-      </w:r>
-    </w:p>
-    <w:p>
-      <w:r>
-        <w:t xml:space="preserve">A </w:t>
-      </w:r>
-      <w:proofErr w:type="spellStart"/>
-      <w:r>
-        <w:t>schema</w:t>
+        <w:t>lefut</w:t>
+      </w:r>
+      <w:proofErr w:type="spellEnd"/>
+      <w:r>
+        <w:t>.</w:t>
+      </w:r>
+    </w:p>
+    <w:p>
+      <w:pPr>
+        <w:pStyle w:val="Cmsor2"/>
+      </w:pPr>
+      <w:bookmarkStart w:id="14" w:name="_Toc228094606"/>
+      <w:r>
+        <w:t xml:space="preserve">4.4 </w:t>
+      </w:r>
+      <w:proofErr w:type="spellStart"/>
+      <w:r>
+        <w:t>Konfiguráció</w:t>
+      </w:r>
+      <w:proofErr w:type="spellEnd"/>
+      <w:r>
+        <w:t xml:space="preserve"> es security</w:t>
+      </w:r>
+      <w:bookmarkEnd w:id="14"/>
+    </w:p>
+    <w:p>
+      <w:r>
+        <w:t xml:space="preserve">A sensitive </w:t>
+      </w:r>
+      <w:proofErr w:type="spellStart"/>
+      <w:r>
+        <w:t>value</w:t>
+      </w:r>
+      <w:r>
+        <w:t>k</w:t>
       </w:r>
       <w:proofErr w:type="spellEnd"/>
       <w:r>
@@ -1802,100 +1453,27 @@
       </w:r>
       <w:proofErr w:type="spellStart"/>
       <w:r>
-        <w:t>migrations</w:t>
-      </w:r>
-      <w:proofErr w:type="spellEnd"/>
-      <w:r>
-        <w:t xml:space="preserve">-el van kezelve, az API startup </w:t>
-      </w:r>
-      <w:r>
-        <w:t>során</w:t>
-      </w:r>
+        <w:t>nem</w:t>
+      </w:r>
+      <w:proofErr w:type="spellEnd"/>
+      <w:r>
+        <w:t xml:space="preserve"> hardcoded </w:t>
+      </w:r>
+      <w:proofErr w:type="spellStart"/>
+      <w:r>
+        <w:t>formában</w:t>
+      </w:r>
+      <w:proofErr w:type="spellEnd"/>
       <w:r>
         <w:t xml:space="preserve"> </w:t>
       </w:r>
       <w:proofErr w:type="spellStart"/>
       <w:r>
-        <w:t>pending</w:t>
-      </w:r>
-      <w:proofErr w:type="spellEnd"/>
-      <w:r>
-        <w:t xml:space="preserve"> </w:t>
-      </w:r>
-      <w:proofErr w:type="spellStart"/>
-      <w:r>
-        <w:t>migration</w:t>
-      </w:r>
-      <w:proofErr w:type="spellEnd"/>
-      <w:r>
-        <w:t xml:space="preserve"> automatikusan lefut.</w:t>
-      </w:r>
-    </w:p>
-    <w:p>
-      <w:pPr>
-        <w:pStyle w:val="Cmsor2"/>
-      </w:pPr>
-      <w:bookmarkStart w:id="14" w:name="_Toc228094606"/>
-      <w:r>
-        <w:t xml:space="preserve">4.4 </w:t>
-      </w:r>
-      <w:r>
-        <w:t>Konfiguráció</w:t>
-      </w:r>
-      <w:r>
-        <w:t xml:space="preserve"> es </w:t>
-      </w:r>
-      <w:proofErr w:type="spellStart"/>
-      <w:r>
-        <w:t>security</w:t>
-      </w:r>
-      <w:bookmarkEnd w:id="14"/>
-      <w:proofErr w:type="spellEnd"/>
-    </w:p>
-    <w:p>
-      <w:r>
-        <w:t xml:space="preserve">A </w:t>
-      </w:r>
-      <w:proofErr w:type="spellStart"/>
-      <w:r>
-        <w:t>sensitive</w:t>
-      </w:r>
-      <w:proofErr w:type="spellEnd"/>
-      <w:r>
-        <w:t xml:space="preserve"> </w:t>
-      </w:r>
-      <w:proofErr w:type="spellStart"/>
-      <w:r>
-        <w:t>value</w:t>
-      </w:r>
-      <w:r>
-        <w:t>k</w:t>
-      </w:r>
-      <w:proofErr w:type="spellEnd"/>
-      <w:r>
-        <w:t xml:space="preserve"> nem </w:t>
-      </w:r>
-      <w:proofErr w:type="spellStart"/>
-      <w:r>
-        <w:t>hardcoded</w:t>
-      </w:r>
-      <w:proofErr w:type="spellEnd"/>
-      <w:r>
-        <w:t xml:space="preserve"> </w:t>
-      </w:r>
-      <w:r>
-        <w:t>formában</w:t>
-      </w:r>
-      <w:r>
-        <w:t xml:space="preserve"> vannak a </w:t>
-      </w:r>
-      <w:proofErr w:type="spellStart"/>
-      <w:r>
-        <w:t>source</w:t>
-      </w:r>
-      <w:proofErr w:type="spellEnd"/>
-      <w:r>
-        <w:t>-ban.</w:t>
+        <w:t>vannak</w:t>
+      </w:r>
+      <w:proofErr w:type="spellEnd"/>
+      <w:r>
+        <w:t xml:space="preserve"> a source-ban.</w:t>
       </w:r>
     </w:p>
     <w:p>
@@ -1922,13 +1500,8 @@
       </w:pPr>
       <w:proofErr w:type="gramStart"/>
       <w:r>
-        <w:t>.</w:t>
-      </w:r>
-      <w:proofErr w:type="spellStart"/>
-      <w:r>
-        <w:t>env</w:t>
-      </w:r>
-      <w:proofErr w:type="spellEnd"/>
+        <w:t>.env</w:t>
+      </w:r>
       <w:proofErr w:type="gramEnd"/>
     </w:p>
     <w:p>
@@ -1940,13 +1513,8 @@
         </w:numPr>
       </w:pPr>
       <w:r>
-        <w:t xml:space="preserve">Docker </w:t>
-      </w:r>
-      <w:proofErr w:type="spellStart"/>
-      <w:r>
-        <w:t>env</w:t>
-      </w:r>
-      <w:proofErr w:type="spellEnd"/>
+        <w:t>Docker env</w:t>
+      </w:r>
     </w:p>
     <w:p>
       <w:pPr>
@@ -1957,15 +1525,7 @@
         </w:numPr>
       </w:pPr>
       <w:r>
-        <w:t xml:space="preserve">(local </w:t>
-      </w:r>
-      <w:proofErr w:type="spellStart"/>
-      <w:r>
-        <w:t>dev</w:t>
-      </w:r>
-      <w:proofErr w:type="spellEnd"/>
-      <w:r>
-        <w:t xml:space="preserve"> </w:t>
+        <w:t xml:space="preserve">(local dev </w:t>
       </w:r>
       <w:proofErr w:type="spellStart"/>
       <w:r>
@@ -1973,33 +1533,20 @@
       </w:r>
       <w:proofErr w:type="spellEnd"/>
       <w:r>
-        <w:t xml:space="preserve">) </w:t>
-      </w:r>
-      <w:proofErr w:type="spellStart"/>
-      <w:r>
-        <w:t>dotnet</w:t>
-      </w:r>
-      <w:proofErr w:type="spellEnd"/>
-      <w:r>
-        <w:t xml:space="preserve"> </w:t>
-      </w:r>
-      <w:proofErr w:type="spellStart"/>
-      <w:r>
-        <w:t>user-secrets</w:t>
-      </w:r>
-      <w:proofErr w:type="spellEnd"/>
-    </w:p>
-    <w:p>
-      <w:r>
-        <w:t xml:space="preserve">Minimum elvart </w:t>
-      </w:r>
-      <w:proofErr w:type="spellStart"/>
-      <w:r>
-        <w:t>security</w:t>
-      </w:r>
-      <w:proofErr w:type="spellEnd"/>
-      <w:r>
-        <w:t xml:space="preserve"> </w:t>
+        <w:t>) dotnet user-secrets</w:t>
+      </w:r>
+    </w:p>
+    <w:p>
+      <w:r>
+        <w:t xml:space="preserve">Minimum </w:t>
+      </w:r>
+      <w:proofErr w:type="spellStart"/>
+      <w:r>
+        <w:t>elvart</w:t>
+      </w:r>
+      <w:proofErr w:type="spellEnd"/>
+      <w:r>
+        <w:t xml:space="preserve"> security </w:t>
       </w:r>
       <w:proofErr w:type="spellStart"/>
       <w:r>
@@ -2019,16 +1566,13 @@
         </w:numPr>
       </w:pPr>
       <w:r>
-        <w:t xml:space="preserve">JWT </w:t>
-      </w:r>
-      <w:proofErr w:type="spellStart"/>
-      <w:r>
-        <w:t>key</w:t>
-      </w:r>
-      <w:proofErr w:type="spellEnd"/>
-      <w:r>
-        <w:t xml:space="preserve"> min 32 karakter</w:t>
-      </w:r>
+        <w:t xml:space="preserve">JWT key min 32 </w:t>
+      </w:r>
+      <w:proofErr w:type="spellStart"/>
+      <w:r>
+        <w:t>karakter</w:t>
+      </w:r>
+      <w:proofErr w:type="spellEnd"/>
     </w:p>
     <w:p>
       <w:pPr>
@@ -2038,22 +1582,14 @@
           <w:numId w:val="22"/>
         </w:numPr>
       </w:pPr>
-      <w:proofErr w:type="spellStart"/>
-      <w:r>
-        <w:t>Password</w:t>
-      </w:r>
-      <w:proofErr w:type="spellEnd"/>
-      <w:r>
-        <w:t xml:space="preserve"> policy </w:t>
-      </w:r>
-      <w:proofErr w:type="spellStart"/>
-      <w:r>
-        <w:t>Identity</w:t>
-      </w:r>
-      <w:proofErr w:type="spellEnd"/>
-      <w:r>
-        <w:t xml:space="preserve"> oldalon</w:t>
-      </w:r>
+      <w:r>
+        <w:t xml:space="preserve">Password policy Identity </w:t>
+      </w:r>
+      <w:proofErr w:type="spellStart"/>
+      <w:r>
+        <w:t>oldalon</w:t>
+      </w:r>
+      <w:proofErr w:type="spellEnd"/>
     </w:p>
     <w:p>
       <w:pPr>
@@ -2070,36 +1606,35 @@
     </w:p>
     <w:p>
       <w:r>
-        <w:t xml:space="preserve">A frontend </w:t>
-      </w:r>
-      <w:proofErr w:type="spellStart"/>
-      <w:r>
-        <w:t>feature</w:t>
-      </w:r>
-      <w:proofErr w:type="spellEnd"/>
-      <w:r>
-        <w:t>-alap</w:t>
+        <w:t>A frontend feature-</w:t>
+      </w:r>
+      <w:proofErr w:type="spellStart"/>
+      <w:r>
+        <w:t>alap</w:t>
       </w:r>
       <w:r>
         <w:t>ú</w:t>
       </w:r>
+      <w:proofErr w:type="spellEnd"/>
+      <w:r>
+        <w:t xml:space="preserve"> folder </w:t>
+      </w:r>
+      <w:proofErr w:type="spellStart"/>
+      <w:r>
+        <w:t>struktúrá</w:t>
+      </w:r>
+      <w:r>
+        <w:t>t</w:t>
+      </w:r>
+      <w:proofErr w:type="spellEnd"/>
       <w:r>
         <w:t xml:space="preserve"> </w:t>
       </w:r>
       <w:proofErr w:type="spellStart"/>
       <w:r>
-        <w:t>folder</w:t>
-      </w:r>
-      <w:proofErr w:type="spellEnd"/>
-      <w:r>
-        <w:t xml:space="preserve"> </w:t>
-      </w:r>
-      <w:r>
-        <w:t>struktúrá</w:t>
-      </w:r>
-      <w:r>
-        <w:t>t kapott</w:t>
-      </w:r>
+        <w:t>kapott</w:t>
+      </w:r>
+      <w:proofErr w:type="spellEnd"/>
       <w:r>
         <w:t>:</w:t>
       </w:r>
@@ -2140,39 +1675,7 @@
       </w:r>
       <w:proofErr w:type="spellEnd"/>
       <w:r>
-        <w:t>/</w:t>
-      </w:r>
-      <w:proofErr w:type="spellStart"/>
-      <w:r>
-        <w:t>features</w:t>
-      </w:r>
-      <w:proofErr w:type="spellEnd"/>
-      <w:r>
-        <w:t>/</w:t>
-      </w:r>
-      <w:proofErr w:type="spellStart"/>
-      <w:r>
-        <w:t>auth</w:t>
-      </w:r>
-      <w:proofErr w:type="spellEnd"/>
-      <w:r>
-        <w:t xml:space="preserve">: </w:t>
-      </w:r>
-      <w:proofErr w:type="spellStart"/>
-      <w:r>
-        <w:t>auth</w:t>
-      </w:r>
-      <w:proofErr w:type="spellEnd"/>
-      <w:r>
-        <w:t xml:space="preserve"> context, </w:t>
-      </w:r>
-      <w:proofErr w:type="spellStart"/>
-      <w:r>
-        <w:t>hook</w:t>
-      </w:r>
-      <w:proofErr w:type="spellEnd"/>
-      <w:r>
-        <w:t xml:space="preserve">, </w:t>
+        <w:t xml:space="preserve">/features/auth: auth context, hook, </w:t>
       </w:r>
       <w:proofErr w:type="spellStart"/>
       <w:r>
@@ -2180,21 +1683,8 @@
       </w:r>
       <w:proofErr w:type="spellEnd"/>
       <w:r>
-        <w:t xml:space="preserve">, </w:t>
-      </w:r>
-      <w:proofErr w:type="spellStart"/>
-      <w:r>
-        <w:t>types</w:t>
-      </w:r>
-      <w:proofErr w:type="spellEnd"/>
-      <w:r>
-        <w:t xml:space="preserve">, </w:t>
-      </w:r>
-      <w:proofErr w:type="spellStart"/>
-      <w:r>
-        <w:t>storage</w:t>
-      </w:r>
-      <w:proofErr w:type="spellEnd"/>
+        <w:t>, types, storage</w:t>
+      </w:r>
     </w:p>
     <w:p>
       <w:pPr>
@@ -2210,31 +1700,7 @@
       </w:r>
       <w:proofErr w:type="spellEnd"/>
       <w:r>
-        <w:t>/</w:t>
-      </w:r>
-      <w:proofErr w:type="spellStart"/>
-      <w:r>
-        <w:t>features</w:t>
-      </w:r>
-      <w:proofErr w:type="spellEnd"/>
-      <w:r>
-        <w:t>/</w:t>
-      </w:r>
-      <w:proofErr w:type="spellStart"/>
-      <w:r>
-        <w:t>notes</w:t>
-      </w:r>
-      <w:proofErr w:type="spellEnd"/>
-      <w:r>
-        <w:t xml:space="preserve">: </w:t>
-      </w:r>
-      <w:proofErr w:type="spellStart"/>
-      <w:r>
-        <w:t>notes</w:t>
-      </w:r>
-      <w:proofErr w:type="spellEnd"/>
-      <w:r>
-        <w:t xml:space="preserve"> </w:t>
+        <w:t xml:space="preserve">/features/notes: notes </w:t>
       </w:r>
       <w:proofErr w:type="spellStart"/>
       <w:r>
@@ -2242,29 +1708,8 @@
       </w:r>
       <w:proofErr w:type="spellEnd"/>
       <w:r>
-        <w:t xml:space="preserve">, </w:t>
-      </w:r>
-      <w:proofErr w:type="spellStart"/>
-      <w:r>
-        <w:t>hook</w:t>
-      </w:r>
-      <w:proofErr w:type="spellEnd"/>
-      <w:r>
-        <w:t xml:space="preserve">, </w:t>
-      </w:r>
-      <w:proofErr w:type="spellStart"/>
-      <w:r>
-        <w:t>components</w:t>
-      </w:r>
-      <w:proofErr w:type="spellEnd"/>
-      <w:r>
-        <w:t xml:space="preserve">, </w:t>
-      </w:r>
-      <w:proofErr w:type="spellStart"/>
-      <w:r>
-        <w:t>types</w:t>
-      </w:r>
-      <w:proofErr w:type="spellEnd"/>
+        <w:t>, hook, components, types</w:t>
+      </w:r>
     </w:p>
     <w:p>
       <w:pPr>
@@ -2280,15 +1725,7 @@
       </w:r>
       <w:proofErr w:type="spellEnd"/>
       <w:r>
-        <w:t>/</w:t>
-      </w:r>
-      <w:proofErr w:type="spellStart"/>
-      <w:r>
-        <w:t>pages</w:t>
-      </w:r>
-      <w:proofErr w:type="spellEnd"/>
-      <w:r>
-        <w:t xml:space="preserve">: </w:t>
+        <w:t xml:space="preserve">/pages: </w:t>
       </w:r>
       <w:proofErr w:type="spellStart"/>
       <w:r>
@@ -2314,49 +1751,13 @@
       </w:pPr>
       <w:proofErr w:type="spellStart"/>
       <w:r>
+        <w:lastRenderedPageBreak/>
         <w:t>src</w:t>
       </w:r>
       <w:proofErr w:type="spellEnd"/>
       <w:r>
-        <w:t>/</w:t>
-      </w:r>
-      <w:proofErr w:type="spellStart"/>
-      <w:r>
-        <w:t>shared</w:t>
-      </w:r>
-      <w:proofErr w:type="spellEnd"/>
-      <w:r>
-        <w:t xml:space="preserve">: </w:t>
-      </w:r>
-      <w:proofErr w:type="spellStart"/>
-      <w:r>
-        <w:t>reusable</w:t>
-      </w:r>
-      <w:proofErr w:type="spellEnd"/>
-      <w:r>
-        <w:t xml:space="preserve"> http </w:t>
-      </w:r>
-      <w:proofErr w:type="spellStart"/>
-      <w:r>
-        <w:t>client</w:t>
-      </w:r>
-      <w:proofErr w:type="spellEnd"/>
-      <w:r>
-        <w:t xml:space="preserve"> + API </w:t>
-      </w:r>
-      <w:proofErr w:type="spellStart"/>
-      <w:r>
-        <w:t>error</w:t>
-      </w:r>
-      <w:proofErr w:type="spellEnd"/>
-      <w:r>
-        <w:t xml:space="preserve"> </w:t>
-      </w:r>
-      <w:proofErr w:type="spellStart"/>
-      <w:r>
-        <w:t>extraction</w:t>
-      </w:r>
-      <w:proofErr w:type="spellEnd"/>
+        <w:t>/shared: reusable http client + API error extraction</w:t>
+      </w:r>
     </w:p>
     <w:p>
       <w:pPr>
@@ -2372,39 +1773,12 @@
       </w:r>
       <w:proofErr w:type="spellEnd"/>
       <w:r>
-        <w:t>/</w:t>
-      </w:r>
-      <w:proofErr w:type="spellStart"/>
-      <w:r>
-        <w:t>styles</w:t>
-      </w:r>
-      <w:proofErr w:type="spellEnd"/>
-      <w:r>
-        <w:t xml:space="preserve">: </w:t>
-      </w:r>
-      <w:proofErr w:type="spellStart"/>
-      <w:r>
-        <w:t>global</w:t>
-      </w:r>
-      <w:proofErr w:type="spellEnd"/>
-      <w:r>
-        <w:t xml:space="preserve"> </w:t>
-      </w:r>
-      <w:proofErr w:type="spellStart"/>
-      <w:r>
-        <w:t>styling</w:t>
-      </w:r>
-      <w:proofErr w:type="spellEnd"/>
-    </w:p>
-    <w:p>
-      <w:proofErr w:type="spellStart"/>
-      <w:r>
-        <w:lastRenderedPageBreak/>
-        <w:t>Routing</w:t>
-      </w:r>
-      <w:proofErr w:type="spellEnd"/>
-      <w:r>
-        <w:t>:</w:t>
+        <w:t>/styles: global styling</w:t>
+      </w:r>
+    </w:p>
+    <w:p>
+      <w:r>
+        <w:t>Routing:</w:t>
       </w:r>
     </w:p>
     <w:p>
@@ -2416,15 +1790,15 @@
         </w:numPr>
       </w:pPr>
       <w:r>
-        <w:t>/login: login/</w:t>
-      </w:r>
-      <w:proofErr w:type="spellStart"/>
-      <w:r>
-        <w:t>register</w:t>
-      </w:r>
-      <w:proofErr w:type="spellEnd"/>
-      <w:r>
-        <w:t xml:space="preserve"> UI</w:t>
+        <w:t>/</w:t>
+      </w:r>
+      <w:proofErr w:type="gramStart"/>
+      <w:r>
+        <w:t>login</w:t>
+      </w:r>
+      <w:proofErr w:type="gramEnd"/>
+      <w:r>
+        <w:t>: login/register UI</w:t>
       </w:r>
     </w:p>
     <w:p>
@@ -2438,66 +1812,34 @@
       <w:r>
         <w:t>/</w:t>
       </w:r>
-      <w:proofErr w:type="spellStart"/>
+      <w:proofErr w:type="gramStart"/>
       <w:r>
         <w:t>notes</w:t>
       </w:r>
-      <w:proofErr w:type="spellEnd"/>
-      <w:r>
-        <w:t xml:space="preserve">: </w:t>
-      </w:r>
-      <w:proofErr w:type="spellStart"/>
-      <w:r>
-        <w:t>protected</w:t>
-      </w:r>
-      <w:proofErr w:type="spellEnd"/>
-      <w:r>
-        <w:t xml:space="preserve"> </w:t>
-      </w:r>
-      <w:proofErr w:type="spellStart"/>
-      <w:r>
-        <w:t>notes</w:t>
-      </w:r>
-      <w:proofErr w:type="spellEnd"/>
-      <w:r>
-        <w:t xml:space="preserve"> </w:t>
-      </w:r>
-      <w:proofErr w:type="spellStart"/>
-      <w:r>
-        <w:t>workspace</w:t>
-      </w:r>
-      <w:proofErr w:type="spellEnd"/>
-    </w:p>
-    <w:p>
-      <w:proofErr w:type="spellStart"/>
-      <w:r>
-        <w:t>User</w:t>
-      </w:r>
-      <w:proofErr w:type="spellEnd"/>
-      <w:r>
-        <w:t xml:space="preserve"> nincs </w:t>
-      </w:r>
-      <w:proofErr w:type="spellStart"/>
-      <w:r>
-        <w:t>auth</w:t>
-      </w:r>
-      <w:proofErr w:type="spellEnd"/>
-      <w:r>
-        <w:t xml:space="preserve"> </w:t>
-      </w:r>
+      <w:proofErr w:type="gramEnd"/>
+      <w:r>
+        <w:t>: protected notes workspace</w:t>
+      </w:r>
+    </w:p>
+    <w:p>
+      <w:r>
+        <w:t xml:space="preserve">User </w:t>
+      </w:r>
+      <w:proofErr w:type="spellStart"/>
+      <w:r>
+        <w:t>nincs</w:t>
+      </w:r>
+      <w:proofErr w:type="spellEnd"/>
+      <w:r>
+        <w:t xml:space="preserve"> auth </w:t>
+      </w:r>
+      <w:proofErr w:type="spellStart"/>
       <w:r>
         <w:t>állapotban</w:t>
       </w:r>
-      <w:r>
-        <w:t xml:space="preserve"> -&gt; </w:t>
-      </w:r>
-      <w:proofErr w:type="spellStart"/>
-      <w:r>
-        <w:t>redirect</w:t>
-      </w:r>
-      <w:proofErr w:type="spellEnd"/>
-      <w:r>
-        <w:t xml:space="preserve"> /login.</w:t>
+      <w:proofErr w:type="spellEnd"/>
+      <w:r>
+        <w:t xml:space="preserve"> -&gt; redirect /login.</w:t>
       </w:r>
     </w:p>
     <w:p>
@@ -2506,34 +1848,29 @@
       </w:pPr>
       <w:bookmarkStart w:id="16" w:name="_Toc228094608"/>
       <w:r>
-        <w:t xml:space="preserve">6) Docker </w:t>
-      </w:r>
-      <w:proofErr w:type="spellStart"/>
-      <w:r>
-        <w:t>setup</w:t>
+        <w:t>6) Docker setup</w:t>
       </w:r>
       <w:bookmarkEnd w:id="16"/>
-      <w:proofErr w:type="spellEnd"/>
-    </w:p>
-    <w:p>
-      <w:r>
-        <w:t xml:space="preserve">A teljes </w:t>
-      </w:r>
-      <w:proofErr w:type="spellStart"/>
-      <w:r>
-        <w:t>stack</w:t>
-      </w:r>
-      <w:proofErr w:type="spellEnd"/>
-      <w:r>
-        <w:t xml:space="preserve"> egy </w:t>
-      </w:r>
-      <w:proofErr w:type="spellStart"/>
-      <w:r>
-        <w:t>compose</w:t>
-      </w:r>
-      <w:proofErr w:type="spellEnd"/>
-      <w:r>
-        <w:t xml:space="preserve"> </w:t>
+    </w:p>
+    <w:p>
+      <w:r>
+        <w:t xml:space="preserve">A </w:t>
+      </w:r>
+      <w:proofErr w:type="spellStart"/>
+      <w:r>
+        <w:t>teljes</w:t>
+      </w:r>
+      <w:proofErr w:type="spellEnd"/>
+      <w:r>
+        <w:t xml:space="preserve"> stack </w:t>
+      </w:r>
+      <w:proofErr w:type="spellStart"/>
+      <w:r>
+        <w:t>egy</w:t>
+      </w:r>
+      <w:proofErr w:type="spellEnd"/>
+      <w:r>
+        <w:t xml:space="preserve"> compose </w:t>
       </w:r>
       <w:proofErr w:type="spellStart"/>
       <w:r>
@@ -2593,23 +1930,7 @@
         </w:numPr>
       </w:pPr>
       <w:r>
-        <w:t>frontend service (</w:t>
-      </w:r>
-      <w:proofErr w:type="spellStart"/>
-      <w:r>
-        <w:t>nginx</w:t>
-      </w:r>
-      <w:proofErr w:type="spellEnd"/>
-      <w:r>
-        <w:t xml:space="preserve"> + SPA </w:t>
-      </w:r>
-      <w:proofErr w:type="spellStart"/>
-      <w:r>
-        <w:t>fallback</w:t>
-      </w:r>
-      <w:proofErr w:type="spellEnd"/>
-      <w:r>
-        <w:t xml:space="preserve"> + /</w:t>
+        <w:t>frontend service (nginx + SPA fallback + /</w:t>
       </w:r>
       <w:proofErr w:type="spellStart"/>
       <w:r>
@@ -2617,31 +1938,33 @@
       </w:r>
       <w:proofErr w:type="spellEnd"/>
       <w:r>
+        <w:t xml:space="preserve"> reverse proxy)</w:t>
+      </w:r>
+    </w:p>
+    <w:p>
+      <w:proofErr w:type="spellStart"/>
+      <w:r>
+        <w:t>Fő</w:t>
+      </w:r>
+      <w:proofErr w:type="spellEnd"/>
+      <w:r>
         <w:t xml:space="preserve"> </w:t>
       </w:r>
       <w:proofErr w:type="spellStart"/>
       <w:r>
-        <w:t>reverse</w:t>
-      </w:r>
-      <w:proofErr w:type="spellEnd"/>
-      <w:r>
-        <w:t xml:space="preserve"> proxy)</w:t>
-      </w:r>
-    </w:p>
-    <w:p>
-      <w:r>
-        <w:t>Fő</w:t>
-      </w:r>
-      <w:r>
-        <w:t xml:space="preserve"> </w:t>
-      </w:r>
-      <w:proofErr w:type="spellStart"/>
-      <w:r>
         <w:t>endpointok</w:t>
       </w:r>
       <w:proofErr w:type="spellEnd"/>
       <w:r>
-        <w:t xml:space="preserve"> Docker alatt:</w:t>
+        <w:t xml:space="preserve"> Docker </w:t>
+      </w:r>
+      <w:proofErr w:type="spellStart"/>
+      <w:r>
+        <w:t>alatt</w:t>
+      </w:r>
+      <w:proofErr w:type="spellEnd"/>
+      <w:r>
+        <w:t>:</w:t>
       </w:r>
     </w:p>
     <w:p>
@@ -2677,23 +2000,7 @@
         </w:numPr>
       </w:pPr>
       <w:r>
-        <w:t xml:space="preserve">Health: http://localhost:5098/health (es frontend proxy-n </w:t>
-      </w:r>
-      <w:proofErr w:type="spellStart"/>
-      <w:r>
-        <w:t>at</w:t>
-      </w:r>
-      <w:proofErr w:type="spellEnd"/>
-      <w:r>
-        <w:t>: /</w:t>
-      </w:r>
-      <w:proofErr w:type="spellStart"/>
-      <w:r>
-        <w:t>health</w:t>
-      </w:r>
-      <w:proofErr w:type="spellEnd"/>
-      <w:r>
-        <w:t>)</w:t>
+        <w:t>Health: http://localhost:5098/health (es frontend proxy-n at: /health)</w:t>
       </w:r>
     </w:p>
     <w:p>
@@ -2717,19 +2024,21 @@
       <w:proofErr w:type="spellEnd"/>
     </w:p>
     <w:p>
+      <w:proofErr w:type="spellStart"/>
       <w:r>
         <w:t>Implementált</w:t>
       </w:r>
-      <w:r>
-        <w:t xml:space="preserve"> </w:t>
-      </w:r>
-      <w:proofErr w:type="spellStart"/>
-      <w:r>
-        <w:t>automated</w:t>
-      </w:r>
-      <w:proofErr w:type="spellEnd"/>
-      <w:r>
-        <w:t xml:space="preserve"> testek:</w:t>
+      <w:proofErr w:type="spellEnd"/>
+      <w:r>
+        <w:t xml:space="preserve"> automated </w:t>
+      </w:r>
+      <w:proofErr w:type="spellStart"/>
+      <w:r>
+        <w:t>testek</w:t>
+      </w:r>
+      <w:proofErr w:type="spellEnd"/>
+      <w:r>
+        <w:t>:</w:t>
       </w:r>
     </w:p>
     <w:p>
@@ -2787,11 +2096,11 @@
     </w:p>
     <w:p>
       <w:r>
-        <w:t xml:space="preserve">A projekt teljesiti a </w:t>
-      </w:r>
-      <w:proofErr w:type="spellStart"/>
-      <w:r>
-        <w:t>core</w:t>
+        <w:t xml:space="preserve">A </w:t>
+      </w:r>
+      <w:proofErr w:type="spellStart"/>
+      <w:r>
+        <w:t>projekt</w:t>
       </w:r>
       <w:proofErr w:type="spellEnd"/>
       <w:r>
@@ -2799,127 +2108,108 @@
       </w:r>
       <w:proofErr w:type="spellStart"/>
       <w:r>
-        <w:t>assignment</w:t>
+        <w:t>teljesiti</w:t>
+      </w:r>
+      <w:proofErr w:type="spellEnd"/>
+      <w:r>
+        <w:t xml:space="preserve"> a core assignment </w:t>
+      </w:r>
+      <w:proofErr w:type="spellStart"/>
+      <w:r>
+        <w:t>követelményeket</w:t>
+      </w:r>
+      <w:proofErr w:type="spellEnd"/>
+      <w:r>
+        <w:t>:</w:t>
+      </w:r>
+    </w:p>
+    <w:p>
+      <w:r>
+        <w:t xml:space="preserve">- </w:t>
+      </w:r>
+      <w:proofErr w:type="spellStart"/>
+      <w:r>
+        <w:t>működő</w:t>
+      </w:r>
+      <w:proofErr w:type="spellEnd"/>
+      <w:r>
+        <w:t xml:space="preserve"> backend + database integration</w:t>
+      </w:r>
+    </w:p>
+    <w:p>
+      <w:r>
+        <w:t xml:space="preserve">- </w:t>
+      </w:r>
+      <w:proofErr w:type="spellStart"/>
+      <w:r>
+        <w:t>működő</w:t>
+      </w:r>
+      <w:proofErr w:type="spellEnd"/>
+      <w:r>
+        <w:t xml:space="preserve"> frontend auth + notes flow</w:t>
+      </w:r>
+    </w:p>
+    <w:p>
+      <w:r>
+        <w:t xml:space="preserve">- minimum </w:t>
+      </w:r>
+      <w:proofErr w:type="gramStart"/>
+      <w:r>
+        <w:t>2</w:t>
+      </w:r>
+      <w:proofErr w:type="gramEnd"/>
+      <w:r>
+        <w:t xml:space="preserve"> automated </w:t>
+      </w:r>
+      <w:proofErr w:type="gramStart"/>
+      <w:r>
+        <w:t>test</w:t>
+      </w:r>
+      <w:proofErr w:type="gramEnd"/>
+    </w:p>
+    <w:p>
+      <w:r>
+        <w:t xml:space="preserve">- </w:t>
+      </w:r>
+      <w:r>
+        <w:t>dokumentáció</w:t>
+      </w:r>
+    </w:p>
+    <w:p>
+      <w:proofErr w:type="spellStart"/>
+      <w:r>
+        <w:t>Választott</w:t>
+      </w:r>
+      <w:proofErr w:type="spellEnd"/>
+      <w:r>
+        <w:t xml:space="preserve"> optional </w:t>
+      </w:r>
+      <w:proofErr w:type="spellStart"/>
+      <w:r>
+        <w:t>elemek</w:t>
       </w:r>
       <w:proofErr w:type="spellEnd"/>
       <w:r>
         <w:t xml:space="preserve"> </w:t>
       </w:r>
-      <w:r>
-        <w:t>követelményeket</w:t>
-      </w:r>
+      <w:proofErr w:type="spellStart"/>
+      <w:r>
+        <w:t>teljesítve</w:t>
+      </w:r>
+      <w:proofErr w:type="spellEnd"/>
       <w:r>
         <w:t>:</w:t>
       </w:r>
     </w:p>
     <w:p>
       <w:r>
-        <w:t xml:space="preserve">- </w:t>
-      </w:r>
-      <w:r>
-        <w:t>működő</w:t>
-      </w:r>
-      <w:r>
-        <w:t xml:space="preserve"> backend + </w:t>
-      </w:r>
-      <w:proofErr w:type="spellStart"/>
-      <w:r>
-        <w:t>database</w:t>
-      </w:r>
-      <w:proofErr w:type="spellEnd"/>
-      <w:r>
-        <w:t xml:space="preserve"> </w:t>
-      </w:r>
-      <w:proofErr w:type="spellStart"/>
-      <w:r>
-        <w:t>integration</w:t>
-      </w:r>
-      <w:proofErr w:type="spellEnd"/>
-    </w:p>
-    <w:p>
-      <w:r>
-        <w:t xml:space="preserve">- </w:t>
-      </w:r>
-      <w:r>
-        <w:t>működő</w:t>
-      </w:r>
-      <w:r>
-        <w:t xml:space="preserve"> frontend </w:t>
-      </w:r>
-      <w:proofErr w:type="spellStart"/>
-      <w:r>
-        <w:t>auth</w:t>
-      </w:r>
-      <w:proofErr w:type="spellEnd"/>
-      <w:r>
-        <w:t xml:space="preserve"> + </w:t>
-      </w:r>
-      <w:proofErr w:type="spellStart"/>
-      <w:r>
-        <w:t>notes</w:t>
-      </w:r>
-      <w:proofErr w:type="spellEnd"/>
-      <w:r>
-        <w:t xml:space="preserve"> flow</w:t>
-      </w:r>
-    </w:p>
-    <w:p>
-      <w:r>
-        <w:t xml:space="preserve">- minimum 2 </w:t>
-      </w:r>
-      <w:proofErr w:type="spellStart"/>
-      <w:r>
-        <w:t>automated</w:t>
-      </w:r>
-      <w:proofErr w:type="spellEnd"/>
-      <w:r>
-        <w:t xml:space="preserve"> test</w:t>
-      </w:r>
-    </w:p>
-    <w:p>
-      <w:r>
-        <w:t xml:space="preserve">- </w:t>
-      </w:r>
-      <w:r>
-        <w:t>dokumentáció</w:t>
-      </w:r>
-    </w:p>
-    <w:p>
-      <w:r>
-        <w:t>Választott</w:t>
-      </w:r>
-      <w:r>
-        <w:t xml:space="preserve"> </w:t>
-      </w:r>
-      <w:proofErr w:type="spellStart"/>
-      <w:r>
-        <w:t>optional</w:t>
-      </w:r>
-      <w:proofErr w:type="spellEnd"/>
-      <w:r>
-        <w:t xml:space="preserve"> elemek </w:t>
-      </w:r>
-      <w:r>
-        <w:t>teljesítve</w:t>
-      </w:r>
-      <w:r>
-        <w:t>:</w:t>
-      </w:r>
-    </w:p>
-    <w:p>
-      <w:r>
         <w:t>- Docker</w:t>
       </w:r>
     </w:p>
     <w:p>
       <w:r>
-        <w:t xml:space="preserve">- JWT </w:t>
-      </w:r>
-      <w:proofErr w:type="spellStart"/>
-      <w:r>
-        <w:t>auth</w:t>
-      </w:r>
-      <w:proofErr w:type="spellEnd"/>
+        <w:t>- JWT auth</w:t>
+      </w:r>
     </w:p>
     <w:p>
       <w:r>
@@ -2942,6 +2232,9 @@
         <w:keepNext/>
       </w:pPr>
       <w:r>
+        <w:rPr>
+          <w:noProof/>
+        </w:rPr>
         <w:drawing>
           <wp:inline distT="0" distB="0" distL="0" distR="0" wp14:anchorId="2212E4C7" wp14:editId="472AABA9">
             <wp:extent cx="5760720" cy="3351530"/>
@@ -2958,7 +2251,7 @@
                     <pic:cNvPicPr/>
                   </pic:nvPicPr>
                   <pic:blipFill>
-                    <a:blip r:embed="rId9"/>
+                    <a:blip r:embed="rId10"/>
                     <a:stretch>
                       <a:fillRect/>
                     </a:stretch>
@@ -3007,6 +2300,9 @@
         <w:keepNext/>
       </w:pPr>
       <w:r>
+        <w:rPr>
+          <w:noProof/>
+        </w:rPr>
         <w:drawing>
           <wp:inline distT="0" distB="0" distL="0" distR="0" wp14:anchorId="6F822347" wp14:editId="0EC8AA80">
             <wp:extent cx="5760720" cy="3577590"/>
@@ -3023,7 +2319,7 @@
                     <pic:cNvPicPr/>
                   </pic:nvPicPr>
                   <pic:blipFill>
-                    <a:blip r:embed="rId10"/>
+                    <a:blip r:embed="rId11"/>
                     <a:stretch>
                       <a:fillRect/>
                     </a:stretch>
@@ -3074,6 +2370,9 @@
         <w:jc w:val="center"/>
       </w:pPr>
       <w:r>
+        <w:rPr>
+          <w:noProof/>
+        </w:rPr>
         <w:lastRenderedPageBreak/>
         <w:drawing>
           <wp:inline distT="0" distB="0" distL="0" distR="0" wp14:anchorId="6C50CAF5" wp14:editId="11AF3028">
@@ -3091,7 +2390,7 @@
                     <pic:cNvPicPr/>
                   </pic:nvPicPr>
                   <pic:blipFill>
-                    <a:blip r:embed="rId11"/>
+                    <a:blip r:embed="rId12"/>
                     <a:stretch>
                       <a:fillRect/>
                     </a:stretch>
@@ -3152,6 +2451,10 @@
     <w:sdt>
       <w:sdtPr>
         <w:rPr>
+          <w:rFonts w:asciiTheme="minorHAnsi" w:eastAsiaTheme="minorEastAsia" w:hAnsiTheme="minorHAnsi" w:cstheme="minorBidi"/>
+          <w:color w:val="auto"/>
+          <w:sz w:val="20"/>
+          <w:szCs w:val="20"/>
           <w:lang w:val="hu-HU"/>
         </w:rPr>
         <w:id w:val="-421101758"/>
@@ -3162,12 +2465,8 @@
       </w:sdtPr>
       <w:sdtEndPr>
         <w:rPr>
-          <w:rFonts w:asciiTheme="minorHAnsi" w:eastAsiaTheme="minorEastAsia" w:hAnsiTheme="minorHAnsi" w:cstheme="minorBidi"/>
           <w:b/>
           <w:bCs/>
-          <w:color w:val="auto"/>
-          <w:sz w:val="20"/>
-          <w:szCs w:val="20"/>
           <w:lang w:val="en-GB"/>
         </w:rPr>
       </w:sdtEndPr>
@@ -4565,7 +3864,7 @@
       </w:sdtContent>
     </w:sdt>
     <w:sectPr>
-      <w:footerReference w:type="default" r:id="rId12"/>
+      <w:footerReference w:type="default" r:id="rId13"/>
       <w:pgSz w:w="11906" w:h="16838"/>
       <w:pgMar w:top="1417" w:right="1417" w:bottom="1417" w:left="1417" w:header="708" w:footer="708" w:gutter="0"/>
       <w:cols w:space="708"/>

</xml_diff>

<commit_message>
add OneDrive link for pitch video in project documentation
</commit_message>
<xml_diff>
--- a/docs/NotesApp Beadandó dokumentáció.docx
+++ b/docs/NotesApp Beadandó dokumentáció.docx
@@ -155,11 +155,29 @@
       </w:r>
       <w:proofErr w:type="spellEnd"/>
       <w:r>
-        <w:t xml:space="preserve"> jegyzeteket lehet </w:t>
-      </w:r>
+        <w:t xml:space="preserve"> </w:t>
+      </w:r>
+      <w:proofErr w:type="spellStart"/>
+      <w:r>
+        <w:t>jegyzeteket</w:t>
+      </w:r>
+      <w:proofErr w:type="spellEnd"/>
+      <w:r>
+        <w:t xml:space="preserve"> </w:t>
+      </w:r>
+      <w:proofErr w:type="spellStart"/>
+      <w:r>
+        <w:t>lehet</w:t>
+      </w:r>
+      <w:proofErr w:type="spellEnd"/>
+      <w:r>
+        <w:t xml:space="preserve"> </w:t>
+      </w:r>
+      <w:proofErr w:type="spellStart"/>
       <w:r>
         <w:t>létrehozni</w:t>
       </w:r>
+      <w:proofErr w:type="spellEnd"/>
       <w:r>
         <w:t xml:space="preserve">, </w:t>
       </w:r>
@@ -273,12 +291,6 @@
       </w:r>
     </w:p>
     <w:p>
-      <w:pPr>
-        <w:rPr>
-          <w:b/>
-          <w:bCs/>
-        </w:rPr>
-      </w:pPr>
       <w:hyperlink r:id="rId9" w:history="1">
         <w:r>
           <w:rPr>
@@ -289,6 +301,82 @@
       </w:hyperlink>
     </w:p>
     <w:p>
+      <w:proofErr w:type="spellStart"/>
+      <w:r>
+        <w:t>Valamint</w:t>
+      </w:r>
+      <w:proofErr w:type="spellEnd"/>
+      <w:r>
+        <w:t xml:space="preserve"> </w:t>
+      </w:r>
+      <w:proofErr w:type="spellStart"/>
+      <w:r>
+        <w:t>onedrive</w:t>
+      </w:r>
+      <w:proofErr w:type="spellEnd"/>
+      <w:r>
+        <w:t xml:space="preserve">-on is </w:t>
+      </w:r>
+      <w:proofErr w:type="spellStart"/>
+      <w:r>
+        <w:t>elérhető</w:t>
+      </w:r>
+      <w:proofErr w:type="spellEnd"/>
+      <w:r>
+        <w:t xml:space="preserve"> a </w:t>
+      </w:r>
+      <w:proofErr w:type="spellStart"/>
+      <w:r>
+        <w:t>következő</w:t>
+      </w:r>
+      <w:proofErr w:type="spellEnd"/>
+      <w:r>
+        <w:t xml:space="preserve"> </w:t>
+      </w:r>
+      <w:proofErr w:type="spellStart"/>
+      <w:r>
+        <w:t>linken</w:t>
+      </w:r>
+      <w:proofErr w:type="spellEnd"/>
+      <w:r>
+        <w:t>:</w:t>
+      </w:r>
+    </w:p>
+    <w:p>
+      <w:pPr>
+        <w:rPr>
+          <w:b/>
+          <w:bCs/>
+        </w:rPr>
+      </w:pPr>
+      <w:hyperlink r:id="rId10" w:history="1">
+        <w:r>
+          <w:rPr>
+            <w:rStyle w:val="Hiperhivatkozs"/>
+            <w:b/>
+            <w:bCs/>
+          </w:rPr>
+          <w:t>2026-04-2</w:t>
+        </w:r>
+        <w:r>
+          <w:rPr>
+            <w:rStyle w:val="Hiperhivatkozs"/>
+            <w:b/>
+            <w:bCs/>
+          </w:rPr>
+          <w:t>6</w:t>
+        </w:r>
+        <w:r>
+          <w:rPr>
+            <w:rStyle w:val="Hiperhivatkozs"/>
+            <w:b/>
+            <w:bCs/>
+          </w:rPr>
+          <w:t xml:space="preserve"> 12-01-53.mkv</w:t>
+        </w:r>
+      </w:hyperlink>
+    </w:p>
+    <w:p>
       <w:pPr>
         <w:pStyle w:val="Cmsor2"/>
       </w:pPr>
@@ -446,12 +534,10 @@
         <w:t xml:space="preserve"> Notes page route-</w:t>
       </w:r>
       <w:proofErr w:type="spellStart"/>
-      <w:proofErr w:type="gramStart"/>
       <w:r>
         <w:t>tal</w:t>
       </w:r>
       <w:proofErr w:type="spellEnd"/>
-      <w:proofErr w:type="gramEnd"/>
     </w:p>
     <w:p>
       <w:pPr>
@@ -479,15 +565,7 @@
         </w:numPr>
       </w:pPr>
       <w:r>
-        <w:t xml:space="preserve">backend test coverage (minimum </w:t>
-      </w:r>
-      <w:proofErr w:type="gramStart"/>
-      <w:r>
-        <w:t>2</w:t>
-      </w:r>
-      <w:proofErr w:type="gramEnd"/>
-      <w:r>
-        <w:t xml:space="preserve"> test)</w:t>
+        <w:t>backend test coverage (minimum 2 test)</w:t>
       </w:r>
     </w:p>
     <w:p>
@@ -713,13 +791,8 @@
         </w:numPr>
       </w:pPr>
       <w:r>
-        <w:t xml:space="preserve">React + TypeScript + </w:t>
-      </w:r>
-      <w:proofErr w:type="gramStart"/>
-      <w:r>
-        <w:t>Vite</w:t>
-      </w:r>
-      <w:proofErr w:type="gramEnd"/>
+        <w:t>React + TypeScript + Vite</w:t>
+      </w:r>
     </w:p>
     <w:p>
       <w:pPr>
@@ -755,13 +828,8 @@
       </w:r>
       <w:proofErr w:type="spellEnd"/>
       <w:r>
-        <w:t xml:space="preserve"> route </w:t>
-      </w:r>
-      <w:proofErr w:type="gramStart"/>
-      <w:r>
-        <w:t>handling</w:t>
-      </w:r>
-      <w:proofErr w:type="gramEnd"/>
+        <w:t xml:space="preserve"> route handling</w:t>
+      </w:r>
     </w:p>
     <w:p>
       <w:pPr>
@@ -826,13 +894,8 @@
         </w:numPr>
       </w:pPr>
       <w:r>
-        <w:t xml:space="preserve">Docker + docker </w:t>
-      </w:r>
-      <w:proofErr w:type="gramStart"/>
-      <w:r>
-        <w:t>compose</w:t>
-      </w:r>
-      <w:proofErr w:type="gramEnd"/>
+        <w:t>Docker + docker compose</w:t>
+      </w:r>
     </w:p>
     <w:p>
       <w:pPr>
@@ -852,6 +915,7 @@
       </w:pPr>
       <w:bookmarkStart w:id="9" w:name="_Toc228094601"/>
       <w:r>
+        <w:lastRenderedPageBreak/>
         <w:t>3) High-level architecture</w:t>
       </w:r>
       <w:bookmarkEnd w:id="9"/>
@@ -888,7 +952,6 @@
         </w:numPr>
       </w:pPr>
       <w:r>
-        <w:lastRenderedPageBreak/>
         <w:t>Backend API: auth + notes business logic + data access</w:t>
       </w:r>
     </w:p>
@@ -906,11 +969,21 @@
     </w:p>
     <w:p>
       <w:r>
-        <w:t xml:space="preserve">A frontend csak API-n </w:t>
-      </w:r>
+        <w:t xml:space="preserve">A frontend </w:t>
+      </w:r>
+      <w:proofErr w:type="spellStart"/>
+      <w:r>
+        <w:t>csak</w:t>
+      </w:r>
+      <w:proofErr w:type="spellEnd"/>
+      <w:r>
+        <w:t xml:space="preserve"> API-n </w:t>
+      </w:r>
+      <w:proofErr w:type="spellStart"/>
       <w:r>
         <w:t>keresztül</w:t>
       </w:r>
+      <w:proofErr w:type="spellEnd"/>
       <w:r>
         <w:t xml:space="preserve"> </w:t>
       </w:r>
@@ -1046,13 +1119,8 @@
       </w:r>
       <w:proofErr w:type="spellEnd"/>
       <w:r>
-        <w:t>/auth/</w:t>
-      </w:r>
-      <w:proofErr w:type="gramStart"/>
-      <w:r>
-        <w:t>register</w:t>
-      </w:r>
-      <w:proofErr w:type="gramEnd"/>
+        <w:t>/auth/register</w:t>
+      </w:r>
     </w:p>
     <w:p>
       <w:pPr>
@@ -1071,13 +1139,8 @@
       </w:r>
       <w:proofErr w:type="spellEnd"/>
       <w:r>
-        <w:t>/auth/</w:t>
-      </w:r>
-      <w:proofErr w:type="gramStart"/>
-      <w:r>
-        <w:t>login</w:t>
-      </w:r>
-      <w:proofErr w:type="gramEnd"/>
+        <w:t>/auth/login</w:t>
+      </w:r>
     </w:p>
     <w:p>
       <w:r>
@@ -1164,13 +1227,8 @@
       </w:r>
       <w:proofErr w:type="spellEnd"/>
       <w:r>
-        <w:t>/</w:t>
-      </w:r>
-      <w:proofErr w:type="gramStart"/>
-      <w:r>
-        <w:t>notes</w:t>
-      </w:r>
-      <w:proofErr w:type="gramEnd"/>
+        <w:t>/notes</w:t>
+      </w:r>
     </w:p>
     <w:p>
       <w:pPr>
@@ -1209,13 +1267,8 @@
       </w:r>
       <w:proofErr w:type="spellEnd"/>
       <w:r>
-        <w:t>/</w:t>
-      </w:r>
-      <w:proofErr w:type="gramStart"/>
-      <w:r>
-        <w:t>notes</w:t>
-      </w:r>
-      <w:proofErr w:type="gramEnd"/>
+        <w:t>/notes</w:t>
+      </w:r>
     </w:p>
     <w:p>
       <w:pPr>
@@ -1391,7 +1444,15 @@
       </w:r>
       <w:proofErr w:type="spellEnd"/>
       <w:r>
-        <w:t xml:space="preserve">, az API startup </w:t>
+        <w:t xml:space="preserve">, </w:t>
+      </w:r>
+      <w:proofErr w:type="spellStart"/>
+      <w:r>
+        <w:t>az</w:t>
+      </w:r>
+      <w:proofErr w:type="spellEnd"/>
+      <w:r>
+        <w:t xml:space="preserve"> API startup </w:t>
       </w:r>
       <w:proofErr w:type="spellStart"/>
       <w:r>
@@ -1696,6 +1757,7 @@
       </w:pPr>
       <w:proofErr w:type="spellStart"/>
       <w:r>
+        <w:lastRenderedPageBreak/>
         <w:t>src</w:t>
       </w:r>
       <w:proofErr w:type="spellEnd"/>
@@ -1751,7 +1813,6 @@
       </w:pPr>
       <w:proofErr w:type="spellStart"/>
       <w:r>
-        <w:lastRenderedPageBreak/>
         <w:t>src</w:t>
       </w:r>
       <w:proofErr w:type="spellEnd"/>
@@ -1880,9 +1941,11 @@
       <w:r>
         <w:t xml:space="preserve"> </w:t>
       </w:r>
+      <w:proofErr w:type="spellStart"/>
       <w:r>
         <w:t>indítható</w:t>
       </w:r>
+      <w:proofErr w:type="spellEnd"/>
       <w:r>
         <w:t>:</w:t>
       </w:r>
@@ -2151,15 +2214,7 @@
     </w:p>
     <w:p>
       <w:r>
-        <w:t xml:space="preserve">- minimum </w:t>
-      </w:r>
-      <w:proofErr w:type="gramStart"/>
-      <w:r>
-        <w:t>2</w:t>
-      </w:r>
-      <w:proofErr w:type="gramEnd"/>
-      <w:r>
-        <w:t xml:space="preserve"> automated </w:t>
+        <w:t xml:space="preserve">- minimum 2 automated </w:t>
       </w:r>
       <w:proofErr w:type="gramStart"/>
       <w:r>
@@ -2251,7 +2306,7 @@
                     <pic:cNvPicPr/>
                   </pic:nvPicPr>
                   <pic:blipFill>
-                    <a:blip r:embed="rId10"/>
+                    <a:blip r:embed="rId11"/>
                     <a:stretch>
                       <a:fillRect/>
                     </a:stretch>
@@ -2319,7 +2374,7 @@
                     <pic:cNvPicPr/>
                   </pic:nvPicPr>
                   <pic:blipFill>
-                    <a:blip r:embed="rId11"/>
+                    <a:blip r:embed="rId12"/>
                     <a:stretch>
                       <a:fillRect/>
                     </a:stretch>
@@ -2390,7 +2445,7 @@
                     <pic:cNvPicPr/>
                   </pic:nvPicPr>
                   <pic:blipFill>
-                    <a:blip r:embed="rId12"/>
+                    <a:blip r:embed="rId13"/>
                     <a:stretch>
                       <a:fillRect/>
                     </a:stretch>
@@ -3864,7 +3919,7 @@
       </w:sdtContent>
     </w:sdt>
     <w:sectPr>
-      <w:footerReference w:type="default" r:id="rId13"/>
+      <w:footerReference w:type="default" r:id="rId14"/>
       <w:pgSz w:w="11906" w:h="16838"/>
       <w:pgMar w:top="1417" w:right="1417" w:bottom="1417" w:left="1417" w:header="708" w:footer="708" w:gutter="0"/>
       <w:cols w:space="708"/>
@@ -8699,7 +8754,6 @@
   <w:style w:type="character" w:default="1" w:styleId="Bekezdsalapbettpusa">
     <w:name w:val="Default Paragraph Font"/>
     <w:uiPriority w:val="1"/>
-    <w:semiHidden/>
     <w:unhideWhenUsed/>
   </w:style>
   <w:style w:type="table" w:default="1" w:styleId="Normltblzat">

</xml_diff>